<commit_message>
fix: highlight missing values
</commit_message>
<xml_diff>
--- a/output/intermediate/PopPK_Report_merge_TFL_filled_draft-magic.docx
+++ b/output/intermediate/PopPK_Report_merge_TFL_filled_draft-magic.docx
@@ -44,7 +44,16 @@
               <w:pStyle w:val="Z-DocumentName"/>
             </w:pPr>
             <w:r>
-              <w:t>Model Analysis Report</w:t>
+              <w:t>Model</w:t>
+            </w:r>
+            <w:r>
+              <w:t xml:space="preserve"> </w:t>
+            </w:r>
+            <w:r>
+              <w:t xml:space="preserve">Analysis </w:t>
+            </w:r>
+            <w:r>
+              <w:t>Report</w:t>
             </w:r>
           </w:p>
         </w:tc>
@@ -116,7 +125,13 @@
               <w:pStyle w:val="Z-LineL2"/>
             </w:pPr>
             <w:r>
-              <w:t>Study Code</w:t>
+              <w:t xml:space="preserve">Study </w:t>
+            </w:r>
+            <w:r>
+              <w:t>C</w:t>
+            </w:r>
+            <w:r>
+              <w:t>ode</w:t>
             </w:r>
           </w:p>
         </w:tc>
@@ -435,7 +450,16 @@
               <w:pStyle w:val="Title"/>
             </w:pPr>
             <w:r>
-              <w:t xml:space="preserve">Population PK Model Analysis Report of </w:t>
+              <w:t>Population PK Model</w:t>
+            </w:r>
+            <w:r>
+              <w:t xml:space="preserve"> </w:t>
+            </w:r>
+            <w:r>
+              <w:t xml:space="preserve">Analysis </w:t>
+            </w:r>
+            <w:r>
+              <w:t xml:space="preserve">Report of </w:t>
             </w:r>
             <w:r>
               <w:t>{{specify relevant scope including patient population, age etc}}</w:t>
@@ -701,7 +725,23 @@
                 <w:sz w:val="22"/>
                 <w:szCs w:val="22"/>
               </w:rPr>
-              <w:t>The Study code(s) in the upper corner should contain the study analysed (e.g., D1234C00001). If analysis of a single study or focused on a single study, put that study code here. If analysis is of a pool, then put “Various” here and list the codes in the full title under “Clinical Studies:”.</w:t>
+              <w:t xml:space="preserve">The Study code(s) in the upper corner should contain the study </w:t>
+            </w:r>
+            <w:r>
+              <w:rPr>
+                <w:rFonts w:ascii="Times New Roman" w:hAnsi="Times New Roman"/>
+                <w:sz w:val="22"/>
+                <w:szCs w:val="22"/>
+              </w:rPr>
+              <w:t>analysed</w:t>
+            </w:r>
+            <w:r>
+              <w:rPr>
+                <w:rFonts w:ascii="Times New Roman" w:hAnsi="Times New Roman"/>
+                <w:sz w:val="22"/>
+                <w:szCs w:val="22"/>
+              </w:rPr>
+              <w:t xml:space="preserve"> (e.g., D1234C00001). If analysis of a single study or focused on a single study, put that study code here. If analysis is of a pool, then put “Various” here and list the codes in the full title under “Clinical Studies:”.</w:t>
             </w:r>
           </w:p>
           <w:p>
@@ -5128,6 +5168,12 @@
         <w:rPr>
           <w:vanish/>
         </w:rPr>
+        <w:t/>
+      </w:r>
+      <w:r>
+        <w:rPr>
+          <w:vanish/>
+        </w:rPr>
         <w:t>[[INLINE_ID:inl_study]]</w:t>
       </w:r>
     </w:p>
@@ -5224,6 +5270,12 @@
             <w:noProof/>
           </w:rPr>
           <w:tab/>
+        </w:r>
+        <w:r>
+          <w:rPr>
+            <w:rStyle w:val="Hyperlink"/>
+            <w:noProof/>
+          </w:rPr>
           <w:t>Base Model Parameter Estimates</w:t>
         </w:r>
         <w:r>
@@ -5878,6 +5930,12 @@
         <w:rPr>
           <w:vanish/>
         </w:rPr>
+        <w:t/>
+      </w:r>
+      <w:r>
+        <w:rPr>
+          <w:vanish/>
+        </w:rPr>
         <w:t>[[INLINE_ID:inl_study_and_dose]]</w:t>
       </w:r>
     </w:p>
@@ -5964,6 +6022,12 @@
           <w:fldChar w:fldCharType="end"/>
         </w:r>
       </w:hyperlink>
+      <w:r>
+        <w:rPr>
+          <w:vanish/>
+        </w:rPr>
+        <w:t/>
+      </w:r>
       <w:r>
         <w:rPr>
           <w:vanish/>
@@ -6064,6 +6128,12 @@
             <w:noProof/>
           </w:rPr>
           <w:tab/>
+        </w:r>
+        <w:r>
+          <w:rPr>
+            <w:rStyle w:val="Hyperlink"/>
+            <w:noProof/>
+          </w:rPr>
           <w:t>Correlation Between Empirical Bayes Estimates and Categorical Covariates</w:t>
         </w:r>
         <w:r>
@@ -6685,6 +6755,12 @@
         <w:rPr>
           <w:vanish/>
         </w:rPr>
+        <w:t/>
+      </w:r>
+      <w:r>
+        <w:rPr>
+          <w:vanish/>
+        </w:rPr>
         <w:t>[[INLINE_ID:inl_study_and_dose]]</w:t>
       </w:r>
     </w:p>
@@ -6775,6 +6851,12 @@
         <w:rPr>
           <w:vanish/>
         </w:rPr>
+        <w:t/>
+      </w:r>
+      <w:r>
+        <w:rPr>
+          <w:vanish/>
+        </w:rPr>
         <w:t>[[INLINE_ID:inl_study_and_dose]]</w:t>
       </w:r>
     </w:p>
@@ -6860,6 +6942,12 @@
           <w:fldChar w:fldCharType="end"/>
         </w:r>
       </w:hyperlink>
+      <w:r>
+        <w:rPr>
+          <w:vanish/>
+        </w:rPr>
+        <w:t/>
+      </w:r>
       <w:r>
         <w:rPr>
           <w:vanish/>
@@ -7036,14 +7124,14 @@
             <w:noProof/>
             <w:highlight w:val="cyan"/>
           </w:rPr>
-          <w:t>{{dose</w:t>
+          <w:t>{{pc}}</w:t>
         </w:r>
         <w:r>
           <w:rPr>
             <w:rStyle w:val="Hyperlink"/>
             <w:noProof/>
           </w:rPr>
-          <w:t>-normal</w:t>
+          <w:t xml:space="preserve">VPC of </w:t>
         </w:r>
         <w:r>
           <w:rPr>
@@ -7051,14 +7139,14 @@
             <w:noProof/>
             <w:highlight w:val="cyan"/>
           </w:rPr>
-          <w:t>ized}}VPC of {{dose</w:t>
+          <w:t>{{dose-normalized}}</w:t>
         </w:r>
         <w:r>
           <w:rPr>
             <w:rStyle w:val="Hyperlink"/>
             <w:noProof/>
           </w:rPr>
-          <w:t>-normalized}} Concentration versus Time a</w:t>
+          <w:t xml:space="preserve"> Concentration versus Time after dose by </w:t>
         </w:r>
         <w:r>
           <w:rPr>
@@ -7066,14 +7154,14 @@
             <w:noProof/>
             <w:highlight w:val="cyan"/>
           </w:rPr>
-          <w:t>fter dose</w:t>
+          <w:t>{{Study}}</w:t>
         </w:r>
         <w:r>
           <w:rPr>
             <w:rStyle w:val="Hyperlink"/>
             <w:noProof/>
           </w:rPr>
-          <w:t xml:space="preserve"> by {{Study}} f</w:t>
+          <w:t xml:space="preserve"> for Base Model</w:t>
         </w:r>
         <w:r>
           <w:rPr>
@@ -7108,7 +7196,7 @@
           <w:rPr>
             <w:noProof/>
           </w:rPr>
-          <w:t>or Base Model46</w:t>
+          <w:t>46</w:t>
         </w:r>
         <w:r>
           <w:rPr>
@@ -7121,7 +7209,25 @@
         <w:rPr>
           <w:vanish/>
         </w:rPr>
-        <w:t>[[INLINE_ID:inl_dose_normalized]][[INLINE_ID:inl_study]]</w:t>
+        <w:t/>
+      </w:r>
+      <w:r>
+        <w:rPr>
+          <w:vanish/>
+        </w:rPr>
+        <w:t>[[INLINE_ID:inl_pc]]</w:t>
+      </w:r>
+      <w:r>
+        <w:rPr>
+          <w:vanish/>
+        </w:rPr>
+        <w:t>[[INLINE_ID:inl_dose_normalized]]</w:t>
+      </w:r>
+      <w:r>
+        <w:rPr>
+          <w:vanish/>
+        </w:rPr>
+        <w:t>[[INLINE_ID:inl_study]]</w:t>
       </w:r>
     </w:p>
     <w:p>
@@ -7155,14 +7261,14 @@
             <w:noProof/>
             <w:highlight w:val="cyan"/>
           </w:rPr>
-          <w:t>{{dose</w:t>
+          <w:t>{{pc}}</w:t>
         </w:r>
         <w:r>
           <w:rPr>
             <w:rStyle w:val="Hyperlink"/>
             <w:noProof/>
           </w:rPr>
-          <w:t>-normal</w:t>
+          <w:t xml:space="preserve">VPC of </w:t>
         </w:r>
         <w:r>
           <w:rPr>
@@ -7170,14 +7276,14 @@
             <w:noProof/>
             <w:highlight w:val="cyan"/>
           </w:rPr>
-          <w:t>ized}}VPC of {{dose</w:t>
+          <w:t>{{dose-normalized}}</w:t>
         </w:r>
         <w:r>
           <w:rPr>
             <w:rStyle w:val="Hyperlink"/>
             <w:noProof/>
           </w:rPr>
-          <w:t>-normalized}} Concentration versus Time a</w:t>
+          <w:t xml:space="preserve"> Concentration versus Time after dose by </w:t>
         </w:r>
         <w:r>
           <w:rPr>
@@ -7185,14 +7291,14 @@
             <w:noProof/>
             <w:highlight w:val="cyan"/>
           </w:rPr>
-          <w:t>fter dose by {{ren</w:t>
+          <w:t>{{renal function}}</w:t>
         </w:r>
         <w:r>
           <w:rPr>
             <w:rStyle w:val="Hyperlink"/>
             <w:noProof/>
           </w:rPr>
-          <w:t>al function}} f</w:t>
+          <w:t xml:space="preserve"> for Base Model</w:t>
         </w:r>
         <w:r>
           <w:rPr>
@@ -7227,7 +7333,7 @@
           <w:rPr>
             <w:noProof/>
           </w:rPr>
-          <w:t>or Base Model47</w:t>
+          <w:t>47</w:t>
         </w:r>
         <w:r>
           <w:rPr>
@@ -7240,7 +7346,25 @@
         <w:rPr>
           <w:vanish/>
         </w:rPr>
-        <w:t>[[INLINE_ID:inl_dose_normalized]][[INLINE_ID:inl_renal_function]]</w:t>
+        <w:t/>
+      </w:r>
+      <w:r>
+        <w:rPr>
+          <w:vanish/>
+        </w:rPr>
+        <w:t>[[INLINE_ID:inl_pc]]</w:t>
+      </w:r>
+      <w:r>
+        <w:rPr>
+          <w:vanish/>
+        </w:rPr>
+        <w:t>[[INLINE_ID:inl_dose_normalized]]</w:t>
+      </w:r>
+      <w:r>
+        <w:rPr>
+          <w:vanish/>
+        </w:rPr>
+        <w:t>[[INLINE_ID:inl_renal_function]]</w:t>
       </w:r>
     </w:p>
     <w:p>
@@ -7405,6 +7529,12 @@
             <w:noProof/>
           </w:rPr>
           <w:tab/>
+        </w:r>
+        <w:r>
+          <w:rPr>
+            <w:rStyle w:val="Hyperlink"/>
+            <w:noProof/>
+          </w:rPr>
           <w:t>Scatter Plot of Individual Random Effects for Vc/F versus Continuous Covariates for Base Model</w:t>
         </w:r>
         <w:r>
@@ -7888,6 +8018,12 @@
             <w:noProof/>
           </w:rPr>
           <w:tab/>
+        </w:r>
+        <w:r>
+          <w:rPr>
+            <w:rStyle w:val="Hyperlink"/>
+            <w:noProof/>
+          </w:rPr>
           <w:t>Scatter Plot of Individual Random Effects for Vc/F versus Continuous Covariates for Final Model</w:t>
         </w:r>
         <w:r>
@@ -9030,7 +9166,13 @@
         <w:rPr>
           <w:lang w:val="en-US"/>
         </w:rPr>
-        <w:t xml:space="preserve">has been </w:t>
+        <w:t>has</w:t>
+      </w:r>
+      <w:r>
+        <w:rPr>
+          <w:lang w:val="en-US"/>
+        </w:rPr>
+        <w:t xml:space="preserve"> been </w:t>
       </w:r>
       <w:r>
         <w:rPr>
@@ -9054,7 +9196,13 @@
         <w:rPr>
           <w:lang w:val="en-US"/>
         </w:rPr>
-        <w:t>in the modeling analysis plan [add reference]</w:t>
+        <w:t xml:space="preserve">in the modeling analysis plan </w:t>
+      </w:r>
+      <w:r>
+        <w:rPr>
+          <w:lang w:val="en-US"/>
+        </w:rPr>
+        <w:t>[add reference]</w:t>
       </w:r>
       <w:r>
         <w:rPr>
@@ -11682,71 +11830,65 @@
                 <w:sz w:val="22"/>
                 <w:szCs w:val="22"/>
               </w:rPr>
-              <w:t>The primary audience for this section are non-technical readers, stakeholders, and excerpts from this section may be used in regulatory related summary documents.</w:t>
-            </w:r>
-          </w:p>
-          <w:p>
-            <w:pPr>
-              <w:pStyle w:val="Paragraph"/>
+              <w:t>The primary audience for this section</w:t>
+            </w:r>
+            <w:r>
               <w:rPr>
                 <w:sz w:val="22"/>
                 <w:szCs w:val="22"/>
               </w:rPr>
-            </w:pPr>
+              <w:t xml:space="preserve"> are</w:t>
+            </w:r>
             <w:r>
               <w:rPr>
                 <w:sz w:val="22"/>
                 <w:szCs w:val="22"/>
               </w:rPr>
-              <w:t>Expected Content:</w:t>
-            </w:r>
-          </w:p>
-          <w:p>
-            <w:pPr>
-              <w:pStyle w:val="ListBullet"/>
+              <w:t xml:space="preserve"> non-technical reader</w:t>
+            </w:r>
+            <w:r>
               <w:rPr>
                 <w:sz w:val="22"/>
                 <w:szCs w:val="22"/>
               </w:rPr>
-            </w:pPr>
+              <w:t>s</w:t>
+            </w:r>
             <w:r>
               <w:rPr>
                 <w:sz w:val="22"/>
                 <w:szCs w:val="22"/>
               </w:rPr>
-              <w:t>Objectives of the analysis</w:t>
-            </w:r>
-          </w:p>
-          <w:p>
-            <w:pPr>
-              <w:pStyle w:val="ListBullet"/>
+              <w:t>, stakeholders</w:t>
+            </w:r>
+            <w:r>
               <w:rPr>
                 <w:sz w:val="22"/>
                 <w:szCs w:val="22"/>
               </w:rPr>
-            </w:pPr>
-            <w:r>
+              <w:t>, and excerpts from this section may be used in regulatory related summary documents.</w:t>
+            </w:r>
+          </w:p>
+          <w:p>
+            <w:pPr>
+              <w:pStyle w:val="Paragraph"/>
               <w:rPr>
                 <w:sz w:val="22"/>
                 <w:szCs w:val="22"/>
               </w:rPr>
-              <w:t>The key findings that affect drug use, labelling, or decision making</w:t>
-            </w:r>
-          </w:p>
-          <w:p>
-            <w:pPr>
-              <w:pStyle w:val="ListBullet"/>
+            </w:pPr>
+            <w:r>
               <w:rPr>
                 <w:sz w:val="22"/>
                 <w:szCs w:val="22"/>
               </w:rPr>
-            </w:pPr>
+              <w:t>Expected Content</w:t>
+            </w:r>
             <w:r>
               <w:rPr>
                 <w:sz w:val="22"/>
                 <w:szCs w:val="22"/>
               </w:rPr>
-              <w:t>A plain language summary of objectives, data, methodology, and conclusions</w:t>
+              <w:t>:</w:t>
             </w:r>
           </w:p>
           <w:p>
@@ -11762,7 +11904,69 @@
                 <w:sz w:val="22"/>
                 <w:szCs w:val="22"/>
               </w:rPr>
-              <w:t xml:space="preserve">Results presented as their effect on clinically relevant drug exposures or endpoints, </w:t>
+              <w:t>Objectives of the analysis</w:t>
+            </w:r>
+          </w:p>
+          <w:p>
+            <w:pPr>
+              <w:pStyle w:val="ListBullet"/>
+              <w:rPr>
+                <w:sz w:val="22"/>
+                <w:szCs w:val="22"/>
+              </w:rPr>
+            </w:pPr>
+            <w:r>
+              <w:rPr>
+                <w:sz w:val="22"/>
+                <w:szCs w:val="22"/>
+              </w:rPr>
+              <w:t>The key findings that affect drug use, labelling, or decision making</w:t>
+            </w:r>
+          </w:p>
+          <w:p>
+            <w:pPr>
+              <w:pStyle w:val="ListBullet"/>
+              <w:rPr>
+                <w:sz w:val="22"/>
+                <w:szCs w:val="22"/>
+              </w:rPr>
+            </w:pPr>
+            <w:r>
+              <w:rPr>
+                <w:sz w:val="22"/>
+                <w:szCs w:val="22"/>
+              </w:rPr>
+              <w:t>A plain language summary of objectives, data, methodology, and conclusions</w:t>
+            </w:r>
+          </w:p>
+          <w:p>
+            <w:pPr>
+              <w:pStyle w:val="ListBullet"/>
+              <w:rPr>
+                <w:sz w:val="22"/>
+                <w:szCs w:val="22"/>
+              </w:rPr>
+            </w:pPr>
+            <w:r>
+              <w:rPr>
+                <w:sz w:val="22"/>
+                <w:szCs w:val="22"/>
+              </w:rPr>
+              <w:t>Results presented as their effect on clinically relevant drug exposures</w:t>
+            </w:r>
+            <w:r>
+              <w:rPr>
+                <w:sz w:val="22"/>
+                <w:szCs w:val="22"/>
+              </w:rPr>
+              <w:t xml:space="preserve"> or endpoints</w:t>
+            </w:r>
+            <w:r>
+              <w:rPr>
+                <w:sz w:val="22"/>
+                <w:szCs w:val="22"/>
+              </w:rPr>
+              <w:t xml:space="preserve">, </w:t>
             </w:r>
             <w:r>
               <w:rPr>
@@ -11794,19 +11998,103 @@
                 <w:sz w:val="22"/>
                 <w:szCs w:val="22"/>
               </w:rPr>
-              <w:t>Model details such as structure or covariates should be avoided, or kept to a minimum if important for communicating conclusions</w:t>
-            </w:r>
-          </w:p>
-          <w:p>
-            <w:pPr>
-              <w:pStyle w:val="ListBullet"/>
-            </w:pPr>
+              <w:t>Model details such as s</w:t>
+            </w:r>
             <w:r>
               <w:rPr>
                 <w:sz w:val="22"/>
                 <w:szCs w:val="22"/>
               </w:rPr>
-              <w:t>Visual presentations of relevant results are acceptable, if key to decision making</w:t>
+              <w:t>tructu</w:t>
+            </w:r>
+            <w:r>
+              <w:rPr>
+                <w:sz w:val="22"/>
+                <w:szCs w:val="22"/>
+              </w:rPr>
+              <w:t>re or covariates should be avoided</w:t>
+            </w:r>
+            <w:r>
+              <w:rPr>
+                <w:sz w:val="22"/>
+                <w:szCs w:val="22"/>
+              </w:rPr>
+              <w:t>,</w:t>
+            </w:r>
+            <w:r>
+              <w:rPr>
+                <w:sz w:val="22"/>
+                <w:szCs w:val="22"/>
+              </w:rPr>
+              <w:t xml:space="preserve"> </w:t>
+            </w:r>
+            <w:r>
+              <w:rPr>
+                <w:sz w:val="22"/>
+                <w:szCs w:val="22"/>
+              </w:rPr>
+              <w:t>or kept to a minimum if</w:t>
+            </w:r>
+            <w:r>
+              <w:rPr>
+                <w:sz w:val="22"/>
+                <w:szCs w:val="22"/>
+              </w:rPr>
+              <w:t xml:space="preserve"> important f</w:t>
+            </w:r>
+            <w:r>
+              <w:rPr>
+                <w:sz w:val="22"/>
+                <w:szCs w:val="22"/>
+              </w:rPr>
+              <w:t>or communicating conclusions</w:t>
+            </w:r>
+          </w:p>
+          <w:p>
+            <w:pPr>
+              <w:pStyle w:val="ListBullet"/>
+            </w:pPr>
+            <w:r>
+              <w:rPr>
+                <w:sz w:val="22"/>
+                <w:szCs w:val="22"/>
+              </w:rPr>
+              <w:t>Visual presentations of relevant</w:t>
+            </w:r>
+            <w:r>
+              <w:rPr>
+                <w:sz w:val="22"/>
+                <w:szCs w:val="22"/>
+              </w:rPr>
+              <w:t xml:space="preserve"> results</w:t>
+            </w:r>
+            <w:r>
+              <w:rPr>
+                <w:sz w:val="22"/>
+                <w:szCs w:val="22"/>
+              </w:rPr>
+              <w:t xml:space="preserve"> are acceptable</w:t>
+            </w:r>
+            <w:r>
+              <w:rPr>
+                <w:sz w:val="22"/>
+                <w:szCs w:val="22"/>
+              </w:rPr>
+              <w:t xml:space="preserve">, if </w:t>
+            </w:r>
+            <w:r>
+              <w:rPr>
+                <w:sz w:val="22"/>
+                <w:szCs w:val="22"/>
+              </w:rPr>
+              <w:t>key to</w:t>
+            </w:r>
+            <w:r>
+              <w:rPr>
+                <w:sz w:val="22"/>
+                <w:szCs w:val="22"/>
+              </w:rPr>
+              <w:t xml:space="preserve"> decision making</w:t>
             </w:r>
           </w:p>
         </w:tc>
@@ -11943,7 +12231,15 @@
                 <w:szCs w:val="22"/>
                 <w:lang w:val="en-US"/>
               </w:rPr>
-              <w:t>use the same text as in the MAP</w:t>
+              <w:t xml:space="preserve">use the same text as in the </w:t>
+            </w:r>
+            <w:r>
+              <w:rPr>
+                <w:sz w:val="22"/>
+                <w:szCs w:val="22"/>
+                <w:lang w:val="en-US"/>
+              </w:rPr>
+              <w:t>MAP</w:t>
             </w:r>
             <w:r>
               <w:rPr>
@@ -12120,7 +12416,10 @@
         <w:t xml:space="preserve">the Analysis </w:t>
       </w:r>
       <w:r>
-        <w:t>Data</w:t>
+        <w:t>D</w:t>
+      </w:r>
+      <w:r>
+        <w:t>ata</w:t>
       </w:r>
       <w:bookmarkEnd w:id="34"/>
       <w:bookmarkEnd w:id="35"/>
@@ -12984,6 +13283,7 @@
       <w:tr>
         <w:trPr>
           <w:cantSplit/>
+          <w:hidden/>
         </w:trPr>
         <w:tc>
           <w:tcPr>
@@ -13249,7 +13549,19 @@
         <w:t xml:space="preserve">and </w:t>
       </w:r>
       <w:r>
-        <w:t>Source Data File</w:t>
+        <w:t xml:space="preserve">Source </w:t>
+      </w:r>
+      <w:r>
+        <w:t>D</w:t>
+      </w:r>
+      <w:r>
+        <w:t xml:space="preserve">ata </w:t>
+      </w:r>
+      <w:r>
+        <w:t>F</w:t>
+      </w:r>
+      <w:r>
+        <w:t>ile</w:t>
       </w:r>
       <w:bookmarkEnd w:id="42"/>
       <w:bookmarkEnd w:id="43"/>
@@ -13269,7 +13581,13 @@
         <w:t>{{ name of source data file }}</w:t>
       </w:r>
       <w:r>
-        <w:t xml:space="preserve"> was prepared according to AZ Clinical Data Standards. </w:t>
+        <w:t xml:space="preserve"> was prepared according to </w:t>
+      </w:r>
+      <w:r>
+        <w:t>AZ Clinical Data Standards</w:t>
+      </w:r>
+      <w:r>
+        <w:t xml:space="preserve">. </w:t>
       </w:r>
       <w:r>
         <w:rPr>
@@ -13329,7 +13647,22 @@
         <w:t xml:space="preserve"> </w:t>
       </w:r>
       <w:r>
-        <w:t>The dataset is described in the Pharmacometrics Data Specification</w:t>
+        <w:t xml:space="preserve">The dataset </w:t>
+      </w:r>
+      <w:r>
+        <w:t>is</w:t>
+      </w:r>
+      <w:r>
+        <w:t xml:space="preserve"> described in </w:t>
+      </w:r>
+      <w:r>
+        <w:t>the</w:t>
+      </w:r>
+      <w:r>
+        <w:t xml:space="preserve"> </w:t>
+      </w:r>
+      <w:r>
+        <w:t>Pharmacometrics Data Specification</w:t>
       </w:r>
       <w:r>
         <w:t xml:space="preserve"> (</w:t>
@@ -13364,7 +13697,19 @@
       <w:bookmarkStart w:id="47" w:name="_Toc57021180"/>
       <w:bookmarkStart w:id="48" w:name="_Toc224140064"/>
       <w:r>
-        <w:t>Derived Analysis Dataset</w:t>
+        <w:t xml:space="preserve">Derived </w:t>
+      </w:r>
+      <w:r>
+        <w:t>A</w:t>
+      </w:r>
+      <w:r>
+        <w:t xml:space="preserve">nalysis </w:t>
+      </w:r>
+      <w:r>
+        <w:t>D</w:t>
+      </w:r>
+      <w:r>
+        <w:t>ataset</w:t>
       </w:r>
       <w:bookmarkEnd w:id="46"/>
       <w:bookmarkEnd w:id="47"/>
@@ -13436,7 +13781,56 @@
                 <w:sz w:val="22"/>
                 <w:szCs w:val="22"/>
               </w:rPr>
-              <w:t xml:space="preserve"> description of any transformations performed on the source data file, if any, to arrive at the modelling dataset (e.g., binning of a continuous covariate into categories, logarithmic (or other) transformation, new variables, imputation, etc.)</w:t>
+              <w:t xml:space="preserve"> description of any </w:t>
+            </w:r>
+            <w:r>
+              <w:rPr>
+                <w:sz w:val="22"/>
+                <w:szCs w:val="22"/>
+              </w:rPr>
+              <w:t>transformations</w:t>
+            </w:r>
+            <w:r>
+              <w:rPr>
+                <w:sz w:val="22"/>
+                <w:szCs w:val="22"/>
+              </w:rPr>
+              <w:t xml:space="preserve"> performed on the source data file</w:t>
+            </w:r>
+            <w:r>
+              <w:rPr>
+                <w:sz w:val="22"/>
+                <w:szCs w:val="22"/>
+              </w:rPr>
+              <w:t>, if any,</w:t>
+            </w:r>
+            <w:r>
+              <w:rPr>
+                <w:sz w:val="22"/>
+                <w:szCs w:val="22"/>
+              </w:rPr>
+              <w:t xml:space="preserve"> to arrive at the modelling dataset (e.g., binning of a continuous covariate into categories, log</w:t>
+            </w:r>
+            <w:r>
+              <w:rPr>
+                <w:sz w:val="22"/>
+                <w:szCs w:val="22"/>
+              </w:rPr>
+              <w:t>arithmic</w:t>
+            </w:r>
+            <w:r>
+              <w:rPr>
+                <w:sz w:val="22"/>
+                <w:szCs w:val="22"/>
+              </w:rPr>
+              <w:t xml:space="preserve"> (or other) transformation, </w:t>
+            </w:r>
+            <w:r>
+              <w:rPr>
+                <w:sz w:val="22"/>
+                <w:szCs w:val="22"/>
+              </w:rPr>
+              <w:t>new variables, imputation, etc.)</w:t>
             </w:r>
           </w:p>
         </w:tc>
@@ -13557,7 +13951,21 @@
                 <w:sz w:val="22"/>
                 <w:szCs w:val="22"/>
               </w:rPr>
-              <w:t xml:space="preserve">Provide listings of specific data points removed from the dataset (pre-modelling), and the reason for omission in </w:t>
+              <w:t xml:space="preserve">Provide listings of specific data points removed from the dataset (pre-modelling), </w:t>
+            </w:r>
+            <w:r>
+              <w:rPr>
+                <w:sz w:val="22"/>
+                <w:szCs w:val="22"/>
+              </w:rPr>
+              <w:t>and</w:t>
+            </w:r>
+            <w:r>
+              <w:rPr>
+                <w:sz w:val="22"/>
+                <w:szCs w:val="22"/>
+              </w:rPr>
+              <w:t xml:space="preserve"> the reason for omission in </w:t>
             </w:r>
             <w:r>
               <w:rPr>
@@ -13591,7 +13999,13 @@
         <w:t xml:space="preserve"> </w:t>
       </w:r>
       <w:r>
-        <w:t xml:space="preserve">missing or erroneous data was performed as outlined in the MAP. </w:t>
+        <w:t xml:space="preserve">missing or erroneous data was </w:t>
+      </w:r>
+      <w:r>
+        <w:t>performed as outlined in the MAP</w:t>
+      </w:r>
+      <w:r>
+        <w:t xml:space="preserve">. </w:t>
       </w:r>
     </w:p>
     <w:p>
@@ -13751,14 +14165,27 @@
                 <w:sz w:val="22"/>
                 <w:szCs w:val="22"/>
               </w:rPr>
-              <w:t xml:space="preserve">Add description and justification of used LLOQ handling. </w:t>
+              <w:t>Add description and justification of used LLOQ handling.</w:t>
             </w:r>
             <w:r>
               <w:rPr>
                 <w:sz w:val="22"/>
                 <w:szCs w:val="22"/>
               </w:rPr>
+              <w:t xml:space="preserve"> </w:t>
+            </w:r>
+            <w:r>
+              <w:rPr>
+                <w:sz w:val="22"/>
+                <w:szCs w:val="22"/>
+              </w:rPr>
               <w:br/>
+            </w:r>
+            <w:r>
+              <w:rPr>
+                <w:sz w:val="22"/>
+                <w:szCs w:val="22"/>
+              </w:rPr>
               <w:t xml:space="preserve">(MAP states: </w:t>
             </w:r>
             <w:r>
@@ -13936,7 +14363,10 @@
         <w:pStyle w:val="Paragraph"/>
       </w:pPr>
       <w:r>
-        <w:t xml:space="preserve">Handling of outliers </w:t>
+        <w:t xml:space="preserve">Handling of </w:t>
+      </w:r>
+      <w:r>
+        <w:t xml:space="preserve">outliers </w:t>
       </w:r>
       <w:r>
         <w:t>w</w:t>
@@ -14137,7 +14567,13 @@
         <w:pStyle w:val="Paragraph"/>
       </w:pPr>
       <w:r>
-        <w:t xml:space="preserve">Handling of covariates </w:t>
+        <w:t xml:space="preserve">Handling of </w:t>
+      </w:r>
+      <w:r>
+        <w:t>covariates</w:t>
+      </w:r>
+      <w:r>
+        <w:t xml:space="preserve"> </w:t>
       </w:r>
       <w:r>
         <w:t>w</w:t>
@@ -14371,6 +14807,12 @@
           <w:highlight w:val="cyan"/>
         </w:rPr>
         <w:t>).</w:t>
+      </w:r>
+      <w:r>
+        <w:rPr>
+          <w:vanish/>
+        </w:rPr>
+        <w:t/>
       </w:r>
       <w:r>
         <w:rPr>
@@ -14459,7 +14901,127 @@
                 <w:szCs w:val="22"/>
                 <w:lang w:val="en-US"/>
               </w:rPr>
-              <w:t xml:space="preserve">For all subsections across methods, please copy paste relevant text from the MAP. Make changes as necessary and detail which option that was used if several are provided in the MAP (e.g. specify transformations made and provide relevant functional forms). </w:t>
+              <w:t xml:space="preserve">For </w:t>
+            </w:r>
+            <w:r>
+              <w:rPr>
+                <w:sz w:val="22"/>
+                <w:szCs w:val="22"/>
+                <w:lang w:val="en-US"/>
+              </w:rPr>
+              <w:t xml:space="preserve">all subsections across </w:t>
+            </w:r>
+            <w:r>
+              <w:rPr>
+                <w:sz w:val="22"/>
+                <w:szCs w:val="22"/>
+                <w:lang w:val="en-US"/>
+              </w:rPr>
+              <w:t xml:space="preserve">methods, </w:t>
+            </w:r>
+            <w:r>
+              <w:rPr>
+                <w:sz w:val="22"/>
+                <w:szCs w:val="22"/>
+                <w:lang w:val="en-US"/>
+              </w:rPr>
+              <w:t xml:space="preserve">please copy paste relevant </w:t>
+            </w:r>
+            <w:r>
+              <w:rPr>
+                <w:sz w:val="22"/>
+                <w:szCs w:val="22"/>
+                <w:lang w:val="en-US"/>
+              </w:rPr>
+              <w:t>text from the MAP.</w:t>
+            </w:r>
+            <w:r>
+              <w:rPr>
+                <w:sz w:val="22"/>
+                <w:szCs w:val="22"/>
+                <w:lang w:val="en-US"/>
+              </w:rPr>
+              <w:t xml:space="preserve"> Make changes as necessary</w:t>
+            </w:r>
+            <w:r>
+              <w:rPr>
+                <w:sz w:val="22"/>
+                <w:szCs w:val="22"/>
+                <w:lang w:val="en-US"/>
+              </w:rPr>
+              <w:t xml:space="preserve"> and detail which option that was used if several are provided in </w:t>
+            </w:r>
+            <w:r>
+              <w:rPr>
+                <w:sz w:val="22"/>
+                <w:szCs w:val="22"/>
+                <w:lang w:val="en-US"/>
+              </w:rPr>
+              <w:t>the MAP</w:t>
+            </w:r>
+            <w:r>
+              <w:rPr>
+                <w:sz w:val="22"/>
+                <w:szCs w:val="22"/>
+                <w:lang w:val="en-US"/>
+              </w:rPr>
+              <w:t xml:space="preserve"> (e.g. </w:t>
+            </w:r>
+            <w:r>
+              <w:rPr>
+                <w:sz w:val="22"/>
+                <w:szCs w:val="22"/>
+                <w:lang w:val="en-US"/>
+              </w:rPr>
+              <w:t xml:space="preserve">specify </w:t>
+            </w:r>
+            <w:r>
+              <w:rPr>
+                <w:sz w:val="22"/>
+                <w:szCs w:val="22"/>
+                <w:lang w:val="en-US"/>
+              </w:rPr>
+              <w:t xml:space="preserve">transformations </w:t>
+            </w:r>
+            <w:r>
+              <w:rPr>
+                <w:sz w:val="22"/>
+                <w:szCs w:val="22"/>
+                <w:lang w:val="en-US"/>
+              </w:rPr>
+              <w:t>made and provide relevant</w:t>
+            </w:r>
+            <w:r>
+              <w:rPr>
+                <w:sz w:val="22"/>
+                <w:szCs w:val="22"/>
+                <w:lang w:val="en-US"/>
+              </w:rPr>
+              <w:t xml:space="preserve"> </w:t>
+            </w:r>
+            <w:r>
+              <w:rPr>
+                <w:sz w:val="22"/>
+                <w:szCs w:val="22"/>
+                <w:lang w:val="en-US"/>
+              </w:rPr>
+              <w:t>functional forms</w:t>
+            </w:r>
+            <w:r>
+              <w:rPr>
+                <w:sz w:val="22"/>
+                <w:szCs w:val="22"/>
+                <w:lang w:val="en-US"/>
+              </w:rPr>
+              <w:t>)</w:t>
+            </w:r>
+            <w:r>
+              <w:rPr>
+                <w:sz w:val="22"/>
+                <w:szCs w:val="22"/>
+                <w:lang w:val="en-US"/>
+              </w:rPr>
+              <w:t xml:space="preserve">. </w:t>
             </w:r>
             <w:r>
               <w:rPr>
@@ -14477,7 +15039,17 @@
                 <w:szCs w:val="22"/>
                 <w:lang w:val="en-US"/>
               </w:rPr>
-              <w:t>Please remember to change to past tense where relevant.</w:t>
+              <w:t>Please remember</w:t>
+            </w:r>
+            <w:r>
+              <w:rPr>
+                <w:i/>
+                <w:iCs/>
+                <w:sz w:val="22"/>
+                <w:szCs w:val="22"/>
+                <w:lang w:val="en-US"/>
+              </w:rPr>
+              <w:t xml:space="preserve"> to change to past tense where relevant.</w:t>
             </w:r>
           </w:p>
         </w:tc>
@@ -14850,9 +15422,21 @@
       </w:pPr>
       <w:r>
         <w:rPr>
+          <w:vanish/>
+        </w:rPr>
+        <w:t/>
+      </w:r>
+      <w:r>
+        <w:rPr>
           <w:b/>
         </w:rPr>
         <w:t>&lt;&lt;Name:model run summary|Title:Model run summary table|Footnote:Summary of key model run outputs.|Files:106-pk-params.docx|Type:table&gt;&gt;</w:t>
+      </w:r>
+      <w:r>
+        <w:rPr>
+          <w:vanish/>
+        </w:rPr>
+        <w:t/>
       </w:r>
       <w:r>
         <w:rPr>
@@ -14865,16 +15449,24 @@
       <w:pPr>
         <w:pStyle w:val="Paragraph"/>
       </w:pPr>
-    </w:p>
-    <w:p>
-      <w:pPr>
-        <w:pStyle w:val="Paragraph"/>
-      </w:pPr>
-    </w:p>
-    <w:p>
-      <w:pPr>
-        <w:pStyle w:val="Paragraph"/>
-      </w:pPr>
+      <w:r>
+        <w:rPr>
+          <w:vanish/>
+        </w:rPr>
+        <w:t/>
+      </w:r>
+      <w:r>
+        <w:rPr>
+          <w:sz w:val="20"/>
+        </w:rPr>
+        <w:t/>
+      </w:r>
+      <w:r>
+        <w:rPr>
+          <w:vanish/>
+        </w:rPr>
+        <w:t/>
+      </w:r>
     </w:p>
     <w:p>
       <w:pPr>
@@ -14903,10 +15495,28 @@
       </w:r>
       <w:r>
         <w:rPr>
+          <w:vanish/>
+        </w:rPr>
+        <w:lastRenderedPageBreak/>
+        <w:t/>
+      </w:r>
+      <w:r>
+        <w:rPr>
+          <w:vanish/>
+        </w:rPr>
+        <w:t/>
+      </w:r>
+      <w:r>
+        <w:rPr>
           <w:b/>
         </w:rPr>
-        <w:lastRenderedPageBreak/>
         <w:t>&lt;&lt;Name:model bootstrap plot|Title:Bootstrap diagnostic plot|Footnote:Bootstrap plot for final model assessment.|Files:106-bootstrap.png|Type:image&gt;&gt;</w:t>
+      </w:r>
+      <w:r>
+        <w:rPr>
+          <w:vanish/>
+        </w:rPr>
+        <w:t/>
       </w:r>
       <w:r>
         <w:rPr>
@@ -14919,31 +15529,40 @@
       <w:pPr>
         <w:jc w:val="center"/>
       </w:pPr>
+      <w:r>
+        <w:rPr>
+          <w:noProof/>
+        </w:rPr>
+      </w:r>
+      <w:r>
+        <w:rPr>
+          <w:vanish/>
+        </w:rPr>
+        <w:t/>
+      </w:r>
     </w:p>
     <w:p>
       <w:pPr>
         <w:pStyle w:val="Paragraph"/>
       </w:pPr>
-    </w:p>
-    <w:p>
-      <w:pPr>
-        <w:jc w:val="center"/>
-      </w:pPr>
-    </w:p>
-    <w:p>
-      <w:pPr>
-        <w:pStyle w:val="Paragraph"/>
-      </w:pPr>
-    </w:p>
-    <w:p>
-      <w:pPr>
-        <w:jc w:val="center"/>
-      </w:pPr>
-    </w:p>
-    <w:p>
-      <w:pPr>
-        <w:pStyle w:val="Paragraph"/>
-      </w:pPr>
+      <w:r>
+        <w:rPr>
+          <w:vanish/>
+        </w:rPr>
+        <w:t/>
+      </w:r>
+      <w:r>
+        <w:rPr>
+          <w:sz w:val="20"/>
+        </w:rPr>
+        <w:t/>
+      </w:r>
+      <w:r>
+        <w:rPr>
+          <w:vanish/>
+        </w:rPr>
+        <w:t/>
+      </w:r>
     </w:p>
     <w:p>
       <w:pPr>
@@ -15020,7 +15639,39 @@
                 <w:szCs w:val="22"/>
                 <w:lang w:val="en-US"/>
               </w:rPr>
-              <w:t>For this subsection, please refer to the MAP. Add any relevant additional information, e.g. number of simulations/samples used in the VPCs and bootstraps.</w:t>
+              <w:t xml:space="preserve">For this subsection, </w:t>
+            </w:r>
+            <w:r>
+              <w:rPr>
+                <w:sz w:val="22"/>
+                <w:szCs w:val="22"/>
+                <w:lang w:val="en-US"/>
+              </w:rPr>
+              <w:t>please refer to the MAP.</w:t>
+            </w:r>
+            <w:r>
+              <w:rPr>
+                <w:sz w:val="22"/>
+                <w:szCs w:val="22"/>
+                <w:lang w:val="en-US"/>
+              </w:rPr>
+              <w:t xml:space="preserve"> Add any relevant </w:t>
+            </w:r>
+            <w:r>
+              <w:rPr>
+                <w:sz w:val="22"/>
+                <w:szCs w:val="22"/>
+                <w:lang w:val="en-US"/>
+              </w:rPr>
+              <w:t>additional information, e.g. number of simulations/samples used in the VPCs and bootstraps</w:t>
+            </w:r>
+            <w:r>
+              <w:rPr>
+                <w:sz w:val="22"/>
+                <w:szCs w:val="22"/>
+                <w:lang w:val="en-US"/>
+              </w:rPr>
+              <w:t>.</w:t>
             </w:r>
             <w:r>
               <w:rPr>
@@ -15049,7 +15700,16 @@
         <w:pStyle w:val="Paragraph"/>
       </w:pPr>
       <w:r>
-        <w:t>Model evaluation was performed as outlined in the MAP.</w:t>
+        <w:t xml:space="preserve">Model evaluation was </w:t>
+      </w:r>
+      <w:r>
+        <w:t>performed</w:t>
+      </w:r>
+      <w:r>
+        <w:t xml:space="preserve"> a</w:t>
+      </w:r>
+      <w:r>
+        <w:t>s outlined in the MAP.</w:t>
       </w:r>
       <w:bookmarkStart w:id="74" w:name="_Toc422332972"/>
       <w:bookmarkStart w:id="75" w:name="_Toc57021203"/>
@@ -15060,6 +15720,7 @@
       </w:pPr>
       <w:bookmarkStart w:id="76" w:name="_Toc224140080"/>
       <w:r>
+        <w:lastRenderedPageBreak/>
         <w:t>Simulations</w:t>
       </w:r>
       <w:bookmarkEnd w:id="74"/>
@@ -15097,7 +15758,16 @@
         <w:t xml:space="preserve">Hardware and </w:t>
       </w:r>
       <w:r>
-        <w:t>Software Details</w:t>
+        <w:t>S</w:t>
+      </w:r>
+      <w:r>
+        <w:t xml:space="preserve">oftware </w:t>
+      </w:r>
+      <w:r>
+        <w:t>D</w:t>
+      </w:r>
+      <w:r>
+        <w:t>etails</w:t>
       </w:r>
       <w:bookmarkEnd w:id="79"/>
       <w:bookmarkEnd w:id="80"/>
@@ -15116,9 +15786,21 @@
       <w:bookmarkStart w:id="84" w:name="_Toc224140084"/>
       <w:r>
         <w:rPr>
+          <w:vanish/>
+        </w:rPr>
+        <w:t/>
+      </w:r>
+      <w:r>
+        <w:rPr>
           <w:b/>
         </w:rPr>
         <w:t>&lt;&lt;Name:categorical covariate summary |Title:Categorical covariate summary|Footnote:Categorical covariate distribution by study.|Files:cat-cov-sum-study.docx|Type:table&gt;&gt;</w:t>
+      </w:r>
+      <w:r>
+        <w:rPr>
+          <w:vanish/>
+        </w:rPr>
+        <w:t/>
       </w:r>
       <w:r>
         <w:rPr>
@@ -15131,23 +15813,46 @@
       <w:pPr>
         <w:pStyle w:val="Paragraph"/>
       </w:pPr>
-    </w:p>
-    <w:p>
-      <w:pPr>
-        <w:pStyle w:val="Paragraph"/>
-      </w:pPr>
-    </w:p>
-    <w:p>
-      <w:pPr>
-        <w:pStyle w:val="Paragraph"/>
-      </w:pPr>
+      <w:r>
+        <w:rPr>
+          <w:vanish/>
+        </w:rPr>
+        <w:t/>
+      </w:r>
+      <w:r>
+        <w:rPr>
+          <w:sz w:val="20"/>
+        </w:rPr>
+        <w:t/>
+      </w:r>
+      <w:r>
+        <w:rPr>
+          <w:vanish/>
+        </w:rPr>
+        <w:t/>
+      </w:r>
     </w:p>
     <w:p>
       <w:pPr>
         <w:pStyle w:val="Heading2"/>
       </w:pPr>
       <w:r>
-        <w:t>Deviations from Analysis Plan</w:t>
+        <w:t>Deviations from</w:t>
+      </w:r>
+      <w:r>
+        <w:t xml:space="preserve"> </w:t>
+      </w:r>
+      <w:r>
+        <w:t>A</w:t>
+      </w:r>
+      <w:r>
+        <w:t xml:space="preserve">nalysis </w:t>
+      </w:r>
+      <w:r>
+        <w:t>P</w:t>
+      </w:r>
+      <w:r>
+        <w:t>lan</w:t>
       </w:r>
       <w:bookmarkEnd w:id="82"/>
       <w:bookmarkEnd w:id="83"/>
@@ -15203,8 +15908,49 @@
                 <w:sz w:val="22"/>
                 <w:szCs w:val="22"/>
               </w:rPr>
-              <w:lastRenderedPageBreak/>
-              <w:t>This section describes and explains rationale for any deviations in the conduct of the analysis from the Model Analysis Plan, e.g., changes in response to data review, or challenges in the specified approach.</w:t>
+              <w:t>This section describes</w:t>
+            </w:r>
+            <w:r>
+              <w:rPr>
+                <w:sz w:val="22"/>
+                <w:szCs w:val="22"/>
+              </w:rPr>
+              <w:t xml:space="preserve"> and explains rationale for</w:t>
+            </w:r>
+            <w:r>
+              <w:rPr>
+                <w:sz w:val="22"/>
+                <w:szCs w:val="22"/>
+              </w:rPr>
+              <w:t xml:space="preserve"> any deviations in the conduct of the analysis from the </w:t>
+            </w:r>
+            <w:r>
+              <w:rPr>
+                <w:sz w:val="22"/>
+                <w:szCs w:val="22"/>
+              </w:rPr>
+              <w:t xml:space="preserve">Model </w:t>
+            </w:r>
+            <w:r>
+              <w:rPr>
+                <w:sz w:val="22"/>
+                <w:szCs w:val="22"/>
+              </w:rPr>
+              <w:t>Analysis Plan</w:t>
+            </w:r>
+            <w:r>
+              <w:rPr>
+                <w:sz w:val="22"/>
+                <w:szCs w:val="22"/>
+              </w:rPr>
+              <w:t>, e.g., changes in response to data review, or challenges in the specified approach</w:t>
+            </w:r>
+            <w:r>
+              <w:rPr>
+                <w:sz w:val="22"/>
+                <w:szCs w:val="22"/>
+              </w:rPr>
+              <w:t>.</w:t>
             </w:r>
             <w:r>
               <w:t xml:space="preserve"> </w:t>
@@ -15218,7 +15964,6 @@
         <w:pStyle w:val="Paragraph"/>
       </w:pPr>
       <w:r>
-        <w:lastRenderedPageBreak/>
         <w:t>{{pa}}</w:t>
       </w:r>
       <w:r>
@@ -15239,6 +15984,7 @@
         <w:rPr>
           <w:caps w:val="0"/>
         </w:rPr>
+        <w:lastRenderedPageBreak/>
         <w:t>RESULTS</w:t>
       </w:r>
       <w:bookmarkEnd w:id="85"/>
@@ -15299,7 +16045,14 @@
                 <w:sz w:val="22"/>
                 <w:szCs w:val="22"/>
               </w:rPr>
-              <w:t xml:space="preserve">This section focuses on results from exploration of the data, development of models, and subsequent simulations/inferences. The primary audience for this section: technical reader, reviewers. </w:t>
+              <w:t xml:space="preserve">This section focuses on results from exploration of the data, development of models, and subsequent simulations/inferences. </w:t>
+            </w:r>
+            <w:r>
+              <w:rPr>
+                <w:sz w:val="22"/>
+                <w:szCs w:val="22"/>
+              </w:rPr>
+              <w:t xml:space="preserve">The primary audience for this section: technical reader, reviewers. </w:t>
             </w:r>
           </w:p>
           <w:p>
@@ -15351,19 +16104,110 @@
                 <w:sz w:val="22"/>
                 <w:szCs w:val="22"/>
               </w:rPr>
-              <w:t>Description, diagnostics and qualification of key models including, but not limited to, the base and final models. The final model, model building steps, qualification, final parameter estimates, and deviations from planned analyses should be clear.</w:t>
-            </w:r>
-          </w:p>
-          <w:p>
-            <w:pPr>
-              <w:pStyle w:val="ListBullet"/>
-            </w:pPr>
+              <w:t>D</w:t>
+            </w:r>
             <w:r>
               <w:rPr>
                 <w:sz w:val="22"/>
                 <w:szCs w:val="22"/>
               </w:rPr>
-              <w:t>Tables and/or figures should be included as appropriate to explain the course of model development.</w:t>
+              <w:t>escription, diagnostics and qualification</w:t>
+            </w:r>
+            <w:r>
+              <w:rPr>
+                <w:sz w:val="22"/>
+                <w:szCs w:val="22"/>
+              </w:rPr>
+              <w:t xml:space="preserve"> of key models including</w:t>
+            </w:r>
+            <w:r>
+              <w:rPr>
+                <w:sz w:val="22"/>
+                <w:szCs w:val="22"/>
+              </w:rPr>
+              <w:t xml:space="preserve">, </w:t>
+            </w:r>
+            <w:r>
+              <w:rPr>
+                <w:sz w:val="22"/>
+                <w:szCs w:val="22"/>
+              </w:rPr>
+              <w:t>but not limited to</w:t>
+            </w:r>
+            <w:r>
+              <w:rPr>
+                <w:sz w:val="22"/>
+                <w:szCs w:val="22"/>
+              </w:rPr>
+              <w:t xml:space="preserve">, </w:t>
+            </w:r>
+            <w:r>
+              <w:rPr>
+                <w:sz w:val="22"/>
+                <w:szCs w:val="22"/>
+              </w:rPr>
+              <w:t xml:space="preserve">the </w:t>
+            </w:r>
+            <w:r>
+              <w:rPr>
+                <w:sz w:val="22"/>
+                <w:szCs w:val="22"/>
+              </w:rPr>
+              <w:t xml:space="preserve">base and </w:t>
+            </w:r>
+            <w:r>
+              <w:rPr>
+                <w:sz w:val="22"/>
+                <w:szCs w:val="22"/>
+              </w:rPr>
+              <w:t>final model</w:t>
+            </w:r>
+            <w:r>
+              <w:rPr>
+                <w:sz w:val="22"/>
+                <w:szCs w:val="22"/>
+              </w:rPr>
+              <w:t>s</w:t>
+            </w:r>
+            <w:r>
+              <w:rPr>
+                <w:sz w:val="22"/>
+                <w:szCs w:val="22"/>
+              </w:rPr>
+              <w:t>.</w:t>
+            </w:r>
+            <w:r>
+              <w:rPr>
+                <w:sz w:val="22"/>
+                <w:szCs w:val="22"/>
+              </w:rPr>
+              <w:t xml:space="preserve"> The final model, model building steps, qualification, final parameter estimates, and deviations from planned analyses should be clear.</w:t>
+            </w:r>
+          </w:p>
+          <w:p>
+            <w:pPr>
+              <w:pStyle w:val="ListBullet"/>
+            </w:pPr>
+            <w:r>
+              <w:rPr>
+                <w:sz w:val="22"/>
+                <w:szCs w:val="22"/>
+              </w:rPr>
+              <w:t xml:space="preserve">Tables and/or figures should be included </w:t>
+            </w:r>
+            <w:r>
+              <w:rPr>
+                <w:sz w:val="22"/>
+                <w:szCs w:val="22"/>
+              </w:rPr>
+              <w:t>as appropriate to explain the course of model development</w:t>
+            </w:r>
+            <w:r>
+              <w:rPr>
+                <w:sz w:val="22"/>
+                <w:szCs w:val="22"/>
+              </w:rPr>
+              <w:t>.</w:t>
             </w:r>
           </w:p>
         </w:tc>
@@ -15380,7 +16224,10 @@
       <w:bookmarkStart w:id="92" w:name="_Ref415477062"/>
       <w:bookmarkStart w:id="93" w:name="_Ref415477068"/>
       <w:r>
-        <w:t>Summary of Analysis Dataset</w:t>
+        <w:t xml:space="preserve">Summary of Analysis </w:t>
+      </w:r>
+      <w:r>
+        <w:t>Dataset</w:t>
       </w:r>
       <w:bookmarkEnd w:id="88"/>
       <w:r>
@@ -15551,25 +16398,32 @@
           <w:szCs w:val="22"/>
           <w:highlight w:val="cyan"/>
         </w:rPr>
-        <w:t>{{Study and Dose}}</w:t>
+        <w:t>{{dose}}</w:t>
+      </w:r>
+      <w:r>
+        <w:rPr>
+          <w:sz w:val="22"/>
+          <w:szCs w:val="22"/>
+        </w:rPr>
+        <w:t xml:space="preserve">. </w:t>
       </w:r>
       <w:r>
         <w:rPr>
           <w:highlight w:val="cyan"/>
         </w:rPr>
-        <w:t>. Sum</w:t>
+        <w:t xml:space="preserve">Summaries by </w:t>
       </w:r>
       <w:r>
         <w:rPr>
           <w:highlight w:val="cyan"/>
         </w:rPr>
-        <w:t>maries by {{Study and Dose}}</w:t>
+        <w:t>{{Study and Dose}}</w:t>
       </w:r>
       <w:r>
         <w:rPr>
           <w:highlight w:val="cyan"/>
         </w:rPr>
-        <w:t xml:space="preserve"> are pr</w:t>
+        <w:t xml:space="preserve"> are provided in </w:t>
       </w:r>
       <w:r>
         <w:rPr>
@@ -15598,7 +16452,7 @@
         <w:rPr>
           <w:highlight w:val="cyan"/>
         </w:rPr>
-        <w:t>ovided in</w:t>
+        <w:t>Appendix D</w:t>
       </w:r>
       <w:r>
         <w:rPr>
@@ -15610,7 +16464,7 @@
         <w:rPr>
           <w:highlight w:val="cyan"/>
         </w:rPr>
-        <w:t>Ap</w:t>
+        <w:t xml:space="preserve">, </w:t>
       </w:r>
       <w:r>
         <w:rPr>
@@ -15636,13 +16490,13 @@
         <w:fldChar w:fldCharType="separate"/>
       </w:r>
       <w:r>
-        <w:t>pendix</w:t>
+        <w:t>Table </w:t>
       </w:r>
       <w:r>
         <w:rPr>
           <w:noProof/>
         </w:rPr>
-        <w:t> D</w:t>
+        <w:t>D1</w:t>
       </w:r>
       <w:r>
         <w:rPr>
@@ -15654,7 +16508,19 @@
         <w:rPr>
           <w:highlight w:val="cyan"/>
         </w:rPr>
-        <w:t>, Table D1.</w:t>
+        <w:t>.</w:t>
+      </w:r>
+      <w:r>
+        <w:rPr>
+          <w:vanish/>
+        </w:rPr>
+        <w:t/>
+      </w:r>
+      <w:r>
+        <w:rPr>
+          <w:vanish/>
+        </w:rPr>
+        <w:t>[[INLINE_ID:inl_dose]]</w:t>
       </w:r>
       <w:r>
         <w:rPr>
@@ -15678,14 +16544,27 @@
       <w:r>
         <w:t>Table </w:t>
       </w:r>
-      <w:fldSimple w:instr=" SEQ Table \* ARABIC ">
-        <w:r>
-          <w:rPr>
-            <w:noProof/>
-          </w:rPr>
-          <w:t>2</w:t>
-        </w:r>
-      </w:fldSimple>
+      <w:r>
+        <w:fldChar w:fldCharType="begin"/>
+      </w:r>
+      <w:r>
+        <w:instrText xml:space="preserve"> SEQ Table \* ARABIC </w:instrText>
+      </w:r>
+      <w:r>
+        <w:fldChar w:fldCharType="separate"/>
+      </w:r>
+      <w:r>
+        <w:rPr>
+          <w:noProof/>
+        </w:rPr>
+        <w:t>2</w:t>
+      </w:r>
+      <w:r>
+        <w:rPr>
+          <w:noProof/>
+        </w:rPr>
+        <w:fldChar w:fldCharType="end"/>
+      </w:r>
       <w:bookmarkEnd w:id="94"/>
       <w:r>
         <w:tab/>
@@ -16749,7 +17628,6 @@
               <w:pStyle w:val="TableCenter"/>
             </w:pPr>
             <w:r>
-              <w:lastRenderedPageBreak/>
               <w:t>150 mg</w:t>
             </w:r>
           </w:p>
@@ -17162,7 +18040,22 @@
         <w:t xml:space="preserve"> </w:t>
       </w:r>
       <w:r>
-        <w:t>LLOQ: lower limit of quantification, MISS: missing observations (non-BLQ), SUBJ: subjects, OBS: observations above the LLOQ</w:t>
+        <w:t>LLOQ: lower limit of quantification,</w:t>
+      </w:r>
+      <w:r>
+        <w:t xml:space="preserve"> </w:t>
+      </w:r>
+      <w:r>
+        <w:t xml:space="preserve">MISS: missing observations (non-BLQ), </w:t>
+      </w:r>
+      <w:r>
+        <w:t>SUBJ: subjects</w:t>
+      </w:r>
+      <w:r>
+        <w:t xml:space="preserve">, </w:t>
+      </w:r>
+      <w:r>
+        <w:t>OBS: observations above the LLOQ</w:t>
       </w:r>
     </w:p>
     <w:p>
@@ -17170,7 +18063,10 @@
         <w:pStyle w:val="TableFootnoteInfo"/>
       </w:pPr>
       <w:r>
-        <w:t xml:space="preserve">Source activity: </w:t>
+        <w:t>Source activity:</w:t>
+      </w:r>
+      <w:r>
+        <w:t xml:space="preserve"> </w:t>
       </w:r>
     </w:p>
     <w:p>
@@ -17186,6 +18082,7 @@
         <w:pStyle w:val="TableFootnoteInfo"/>
       </w:pPr>
       <w:r>
+        <w:lastRenderedPageBreak/>
         <w:t>Source code: eda-tables.R</w:t>
       </w:r>
     </w:p>
@@ -17220,58 +18117,121 @@
         <w:rPr>
           <w:highlight w:val="cyan"/>
         </w:rPr>
-        <w:t>{{XX mg}}</w:t>
+        <w:t>{{n}}</w:t>
       </w:r>
       <w:r>
         <w:rPr>
           <w:highlight w:val="cyan"/>
         </w:rPr>
-        <w:t xml:space="preserve"> plasma/b</w:t>
-      </w:r>
-      <w:r>
-        <w:t>lood PK samples f</w:t>
+        <w:t xml:space="preserve"> plasma</w:t>
       </w:r>
       <w:r>
         <w:rPr>
           <w:highlight w:val="cyan"/>
         </w:rPr>
-        <w:t>rom {{n}}</w:t>
+        <w:t>/blood</w:t>
+      </w:r>
+      <w:r>
+        <w:t xml:space="preserve"> PK samples from </w:t>
       </w:r>
       <w:r>
         <w:rPr>
           <w:highlight w:val="cyan"/>
         </w:rPr>
-        <w:t xml:space="preserve"> pati</w:t>
-      </w:r>
-      <w:r>
-        <w:t>ents treated w</w:t>
+        <w:t>{{n}}</w:t>
       </w:r>
       <w:r>
         <w:rPr>
           <w:highlight w:val="cyan"/>
         </w:rPr>
-        <w:t>ith AZDXXX across dose levels</w:t>
+        <w:t xml:space="preserve"> </w:t>
       </w:r>
       <w:r>
         <w:rPr>
           <w:highlight w:val="cyan"/>
         </w:rPr>
-        <w:t xml:space="preserve"> of  {{XX mg}} to {{XX mg}}</w:t>
-      </w:r>
-      <w:r>
-        <w:t xml:space="preserve"> were available for inclusion in this analys</w:t>
+        <w:t>patients</w:t>
+      </w:r>
+      <w:r>
+        <w:t xml:space="preserve"> treated with </w:t>
       </w:r>
       <w:r>
         <w:rPr>
           <w:highlight w:val="cyan"/>
         </w:rPr>
-        <w:t>is. {{Add any relevant observation across selected strata for table}}</w:t>
+        <w:t xml:space="preserve">AZDXXX </w:t>
+      </w:r>
+      <w:r>
+        <w:rPr>
+          <w:highlight w:val="cyan"/>
+        </w:rPr>
+        <w:t xml:space="preserve">across dose levels of </w:t>
+      </w:r>
+      <w:r>
+        <w:rPr>
+          <w:highlight w:val="cyan"/>
+        </w:rPr>
+        <w:t xml:space="preserve"> </w:t>
+      </w:r>
+      <w:r>
+        <w:rPr>
+          <w:highlight w:val="cyan"/>
+        </w:rPr>
+        <w:t>{{XX mg}}</w:t>
+      </w:r>
+      <w:r>
+        <w:rPr>
+          <w:highlight w:val="cyan"/>
+        </w:rPr>
+        <w:t xml:space="preserve"> to </w:t>
+      </w:r>
+      <w:r>
+        <w:rPr>
+          <w:highlight w:val="cyan"/>
+        </w:rPr>
+        <w:t>{{XX mg}}</w:t>
+      </w:r>
+      <w:r>
+        <w:t xml:space="preserve"> </w:t>
+      </w:r>
+      <w:r>
+        <w:t xml:space="preserve">were available for inclusion in this analysis. </w:t>
+      </w:r>
+      <w:r>
+        <w:rPr>
+          <w:highlight w:val="cyan"/>
+        </w:rPr>
+        <w:t>{{Add any relevant observation across selected strata for table}}</w:t>
+      </w:r>
+      <w:r>
+        <w:rPr>
+          <w:highlight w:val="cyan"/>
+        </w:rPr>
+        <w:t xml:space="preserve"/>
       </w:r>
       <w:r>
         <w:rPr>
           <w:vanish/>
         </w:rPr>
-        <w:t>[[INLINE_ID:inl_xx_mg]][[INLINE_ID:inl_n]][[INLINE_ID:inl_add_any_relevant_observation_across_selected_strata_for_table]]</w:t>
+        <w:t/>
+      </w:r>
+      <w:r>
+        <w:rPr>
+          <w:vanish/>
+        </w:rPr>
+        <w:t>[[INLINE_ID:inl_n]]</w:t>
+      </w:r>
+      <w:r>
+        <w:rPr>
+          <w:vanish/>
+        </w:rPr>
+        <w:t>[[INLINE_ID:inl_xx_mg]]</w:t>
+      </w:r>
+      <w:r>
+        <w:rPr>
+          <w:vanish/>
+        </w:rPr>
+        <w:t>[[INLINE_ID:inl_add_any_relevant_observation_across_selected_strata_for_table]]</w:t>
       </w:r>
     </w:p>
     <w:p>
@@ -17365,71 +18325,148 @@
                 <w:sz w:val="22"/>
                 <w:szCs w:val="22"/>
               </w:rPr>
-              <w:t>Focus on relevant features of the data, PK(PD), dosing and covariates to enable the reader a good understanding of the general behaviour (stratified by dose, time, time after dose, and key covariates).</w:t>
-            </w:r>
-          </w:p>
-          <w:p>
-            <w:pPr>
-              <w:pStyle w:val="ListBullet"/>
+              <w:t xml:space="preserve">Focus on relevant features of the data, </w:t>
+            </w:r>
+            <w:r>
               <w:rPr>
                 <w:sz w:val="22"/>
                 <w:szCs w:val="22"/>
               </w:rPr>
-            </w:pPr>
+              <w:t>PK(PD)</w:t>
+            </w:r>
             <w:r>
               <w:rPr>
                 <w:sz w:val="22"/>
                 <w:szCs w:val="22"/>
               </w:rPr>
-              <w:t>Correlation of covariates (correlation plots, between important covariates), if needed</w:t>
-            </w:r>
-          </w:p>
-          <w:p>
-            <w:pPr>
-              <w:pStyle w:val="ListBullet"/>
+              <w:t>, dosing and covariates</w:t>
+            </w:r>
+            <w:r>
               <w:rPr>
                 <w:sz w:val="22"/>
                 <w:szCs w:val="22"/>
               </w:rPr>
-            </w:pPr>
-            <w:r>
+              <w:t xml:space="preserve"> to enable the reader a good understanding of the general behaviour (stratified by dose, time, time after dose, and key covariates).</w:t>
+            </w:r>
+          </w:p>
+          <w:p>
+            <w:pPr>
+              <w:pStyle w:val="ListBullet"/>
               <w:rPr>
                 <w:sz w:val="22"/>
                 <w:szCs w:val="22"/>
               </w:rPr>
-              <w:t>Typical outputs could be graphics, tabular summaries and simple statistical models.</w:t>
-            </w:r>
-          </w:p>
-          <w:p>
-            <w:pPr>
-              <w:pStyle w:val="ListBullet"/>
+            </w:pPr>
+            <w:r>
               <w:rPr>
                 <w:sz w:val="22"/>
                 <w:szCs w:val="22"/>
               </w:rPr>
-            </w:pPr>
-            <w:r>
+              <w:t>Correlation of covariates (correlation plots, between important covariates), if needed</w:t>
+            </w:r>
+          </w:p>
+          <w:p>
+            <w:pPr>
+              <w:pStyle w:val="ListBullet"/>
               <w:rPr>
                 <w:sz w:val="22"/>
                 <w:szCs w:val="22"/>
               </w:rPr>
-              <w:t xml:space="preserve">Retain high impact results in the main text, with supporting tables/figures in an appendix. </w:t>
-            </w:r>
-          </w:p>
-          <w:p>
-            <w:pPr>
-              <w:pStyle w:val="ListBullet"/>
+            </w:pPr>
+            <w:r>
               <w:rPr>
                 <w:sz w:val="22"/>
                 <w:szCs w:val="22"/>
               </w:rPr>
-            </w:pPr>
-            <w:r>
+              <w:t>Typical outputs could be graphics, tabular summaries and simple statistical models.</w:t>
+            </w:r>
+          </w:p>
+          <w:p>
+            <w:pPr>
+              <w:pStyle w:val="ListBullet"/>
               <w:rPr>
                 <w:sz w:val="22"/>
                 <w:szCs w:val="22"/>
               </w:rPr>
-              <w:t>Refer to GUID-0024307</w:t>
+            </w:pPr>
+            <w:r>
+              <w:rPr>
+                <w:sz w:val="22"/>
+                <w:szCs w:val="22"/>
+              </w:rPr>
+              <w:t>Retain</w:t>
+            </w:r>
+            <w:r>
+              <w:rPr>
+                <w:sz w:val="22"/>
+                <w:szCs w:val="22"/>
+              </w:rPr>
+              <w:t xml:space="preserve"> high impact results in the main text</w:t>
+            </w:r>
+            <w:r>
+              <w:rPr>
+                <w:sz w:val="22"/>
+                <w:szCs w:val="22"/>
+              </w:rPr>
+              <w:t>, with supporting</w:t>
+            </w:r>
+            <w:r>
+              <w:rPr>
+                <w:sz w:val="22"/>
+                <w:szCs w:val="22"/>
+              </w:rPr>
+              <w:t xml:space="preserve"> </w:t>
+            </w:r>
+            <w:r>
+              <w:rPr>
+                <w:sz w:val="22"/>
+                <w:szCs w:val="22"/>
+              </w:rPr>
+              <w:t>tables/figures</w:t>
+            </w:r>
+            <w:r>
+              <w:rPr>
+                <w:sz w:val="22"/>
+                <w:szCs w:val="22"/>
+              </w:rPr>
+              <w:t xml:space="preserve"> in </w:t>
+            </w:r>
+            <w:r>
+              <w:rPr>
+                <w:sz w:val="22"/>
+                <w:szCs w:val="22"/>
+              </w:rPr>
+              <w:t>an appendix.</w:t>
+            </w:r>
+            <w:r>
+              <w:rPr>
+                <w:sz w:val="22"/>
+                <w:szCs w:val="22"/>
+              </w:rPr>
+              <w:t xml:space="preserve"> </w:t>
+            </w:r>
+          </w:p>
+          <w:p>
+            <w:pPr>
+              <w:pStyle w:val="ListBullet"/>
+              <w:rPr>
+                <w:sz w:val="22"/>
+                <w:szCs w:val="22"/>
+              </w:rPr>
+            </w:pPr>
+            <w:r>
+              <w:rPr>
+                <w:sz w:val="22"/>
+                <w:szCs w:val="22"/>
+              </w:rPr>
+              <w:t xml:space="preserve">Refer to </w:t>
+            </w:r>
+            <w:r>
+              <w:rPr>
+                <w:sz w:val="22"/>
+                <w:szCs w:val="22"/>
+              </w:rPr>
+              <w:t>GUID-0024307</w:t>
             </w:r>
             <w:r>
               <w:rPr>
@@ -17439,7 +18476,7 @@
               </w:rPr>
               <w:t xml:space="preserve"> </w:t>
             </w:r>
-            <w:hyperlink r:id="rId15" w:anchor="doc_info/2119166?state_type=steady_state__v" w:history="1">
+            <w:hyperlink r:id="rId16" w:anchor="doc_info/2119166?state_type=steady_state__v" w:history="1">
               <w:r>
                 <w:rPr>
                   <w:rStyle w:val="cf01"/>
@@ -17504,7 +18541,10 @@
         <w:fldChar w:fldCharType="end"/>
       </w:r>
       <w:r>
-        <w:t xml:space="preserve">. The correlations between continuous covariates are shown in </w:t>
+        <w:t>. The correlations between continuous covariates are shown in</w:t>
+      </w:r>
+      <w:r>
+        <w:t xml:space="preserve"> </w:t>
       </w:r>
       <w:r>
         <w:fldChar w:fldCharType="begin"/>
@@ -17528,7 +18568,13 @@
         <w:fldChar w:fldCharType="end"/>
       </w:r>
       <w:r>
-        <w:t xml:space="preserve">. The correlation between continuous and most relevant categorical covariates are shown in </w:t>
+        <w:t xml:space="preserve">. The correlation between continuous and most </w:t>
+      </w:r>
+      <w:r>
+        <w:t xml:space="preserve">relevant </w:t>
+      </w:r>
+      <w:r>
+        <w:t xml:space="preserve">categorical covariates are shown in </w:t>
       </w:r>
       <w:r>
         <w:fldChar w:fldCharType="begin"/>
@@ -17552,7 +18598,10 @@
         <w:fldChar w:fldCharType="end"/>
       </w:r>
       <w:r>
-        <w:t xml:space="preserve"> and </w:t>
+        <w:t xml:space="preserve"> </w:t>
+      </w:r>
+      <w:r>
+        <w:t xml:space="preserve">and </w:t>
       </w:r>
       <w:r>
         <w:fldChar w:fldCharType="begin"/>
@@ -17609,9 +18658,21 @@
       </w:pPr>
       <w:r>
         <w:rPr>
+          <w:vanish/>
+        </w:rPr>
+        <w:t/>
+      </w:r>
+      <w:r>
+        <w:rPr>
           <w:b/>
         </w:rPr>
         <w:t>&lt;&lt;Name:eta pairs|Title:ETA pairwise relationship plot|Footnote:Pairwise ETA relationship overview.|Files:cont-vs-cont.png|Type:image&gt;&gt;</w:t>
+      </w:r>
+      <w:r>
+        <w:rPr>
+          <w:vanish/>
+        </w:rPr>
+        <w:t/>
       </w:r>
       <w:r>
         <w:rPr>
@@ -17624,31 +18685,41 @@
       <w:pPr>
         <w:jc w:val="center"/>
       </w:pPr>
+      <w:r>
+        <w:rPr>
+          <w:noProof/>
+        </w:rPr>
+        <w:lastRenderedPageBreak/>
+      </w:r>
+      <w:r>
+        <w:rPr>
+          <w:vanish/>
+        </w:rPr>
+        <w:t/>
+      </w:r>
     </w:p>
     <w:p>
       <w:pPr>
         <w:pStyle w:val="Paragraph"/>
       </w:pPr>
-    </w:p>
-    <w:p>
-      <w:pPr>
-        <w:jc w:val="center"/>
-      </w:pPr>
-    </w:p>
-    <w:p>
-      <w:pPr>
-        <w:pStyle w:val="Paragraph"/>
-      </w:pPr>
-    </w:p>
-    <w:p>
-      <w:pPr>
-        <w:jc w:val="center"/>
-      </w:pPr>
-    </w:p>
-    <w:p>
-      <w:pPr>
-        <w:pStyle w:val="Paragraph"/>
-      </w:pPr>
+      <w:r>
+        <w:rPr>
+          <w:vanish/>
+        </w:rPr>
+        <w:t/>
+      </w:r>
+      <w:r>
+        <w:rPr>
+          <w:sz w:val="20"/>
+        </w:rPr>
+        <w:t/>
+      </w:r>
+      <w:r>
+        <w:rPr>
+          <w:vanish/>
+        </w:rPr>
+        <w:t/>
+      </w:r>
     </w:p>
     <w:p>
       <w:pPr>
@@ -17676,14 +18747,27 @@
         <w:lastRenderedPageBreak/>
         <w:t>Table </w:t>
       </w:r>
-      <w:fldSimple w:instr=" SEQ Table \* ARABIC ">
-        <w:r>
-          <w:rPr>
-            <w:noProof/>
-          </w:rPr>
-          <w:t>3</w:t>
-        </w:r>
-      </w:fldSimple>
+      <w:r>
+        <w:fldChar w:fldCharType="begin"/>
+      </w:r>
+      <w:r>
+        <w:instrText xml:space="preserve"> SEQ Table \* ARABIC </w:instrText>
+      </w:r>
+      <w:r>
+        <w:fldChar w:fldCharType="separate"/>
+      </w:r>
+      <w:r>
+        <w:rPr>
+          <w:noProof/>
+        </w:rPr>
+        <w:t>3</w:t>
+      </w:r>
+      <w:r>
+        <w:rPr>
+          <w:noProof/>
+        </w:rPr>
+        <w:fldChar w:fldCharType="end"/>
+      </w:r>
       <w:bookmarkEnd w:id="102"/>
       <w:r>
         <w:tab/>
@@ -17698,7 +18782,10 @@
         <w:t xml:space="preserve">ovariates </w:t>
       </w:r>
       <w:r>
-        <w:t xml:space="preserve">Overall and </w:t>
+        <w:t>O</w:t>
+      </w:r>
+      <w:r>
+        <w:t xml:space="preserve">verall and </w:t>
       </w:r>
       <w:r>
         <w:t xml:space="preserve">by </w:t>
@@ -17710,6 +18797,12 @@
         <w:t>{{Study}}</w:t>
       </w:r>
       <w:bookmarkEnd w:id="103"/>
+      <w:r>
+        <w:rPr>
+          <w:vanish/>
+        </w:rPr>
+        <w:t/>
+      </w:r>
       <w:r>
         <w:rPr>
           <w:vanish/>
@@ -19253,14 +20346,27 @@
         <w:lastRenderedPageBreak/>
         <w:t>Figure </w:t>
       </w:r>
-      <w:fldSimple w:instr=" SEQ Figure \* ARABIC ">
-        <w:r>
-          <w:rPr>
-            <w:noProof/>
-          </w:rPr>
-          <w:t>1</w:t>
-        </w:r>
-      </w:fldSimple>
+      <w:r>
+        <w:fldChar w:fldCharType="begin"/>
+      </w:r>
+      <w:r>
+        <w:instrText xml:space="preserve"> SEQ Figure \* ARABIC </w:instrText>
+      </w:r>
+      <w:r>
+        <w:fldChar w:fldCharType="separate"/>
+      </w:r>
+      <w:r>
+        <w:rPr>
+          <w:noProof/>
+        </w:rPr>
+        <w:t>1</w:t>
+      </w:r>
+      <w:r>
+        <w:rPr>
+          <w:noProof/>
+        </w:rPr>
+        <w:fldChar w:fldCharType="end"/>
+      </w:r>
       <w:bookmarkEnd w:id="104"/>
       <w:r>
         <w:tab/>
@@ -19314,7 +20420,7 @@
                     </pic:cNvPicPr>
                   </pic:nvPicPr>
                   <pic:blipFill>
-                    <a:blip r:embed="rId16">
+                    <a:blip r:embed="rId18">
                       <a:extLst>
                         <a:ext uri="{28A0092B-C50C-407E-A947-70E740481C1C}">
                           <a14:useLocalDpi xmlns:a14="http://schemas.microsoft.com/office/drawing/2010/main" val="0"/>
@@ -19351,25 +20457,26 @@
         <w:pStyle w:val="TableFootnoteInfo"/>
       </w:pPr>
       <w:r>
+        <w:t>&lt;&lt;Name:studies|Title:Clinical studies listing|Footnote:List of studies included in analysis.|Files:pk-data-sum-dose-study.docx|Type:table&gt;&gt;</w:t>
+      </w:r>
+      <w:r>
+        <w:rPr>
+          <w:vanish/>
+        </w:rPr>
+        <w:t/>
+      </w:r>
+      <w:r>
         <w:rPr>
           <w:b/>
           <w:sz w:val="24"/>
         </w:rPr>
-        <w:t>&lt;&lt;Name:studies|Title:</w:t>
+        <w:t/>
       </w:r>
       <w:r>
         <w:rPr>
-          <w:b/>
-          <w:sz w:val="24"/>
+          <w:vanish/>
         </w:rPr>
-        <w:t>Na Please whyyy</w:t>
-      </w:r>
-      <w:r>
-        <w:rPr>
-          <w:b/>
-          <w:sz w:val="24"/>
-        </w:rPr>
-        <w:t>|Footnote:List of studies included in analysis.|Files:pk-data-sum-dose-study.docx|Type:table&gt;&gt;</w:t>
+        <w:t/>
       </w:r>
       <w:r>
         <w:rPr>
@@ -19382,16 +20489,21 @@
       <w:pPr>
         <w:pStyle w:val="TableFootnoteInfo"/>
       </w:pPr>
-    </w:p>
-    <w:p>
-      <w:pPr>
-        <w:pStyle w:val="TableFootnoteInfo"/>
-      </w:pPr>
-    </w:p>
-    <w:p>
-      <w:pPr>
-        <w:pStyle w:val="TableFootnoteInfo"/>
-      </w:pPr>
+      <w:r>
+        <w:rPr>
+          <w:vanish/>
+        </w:rPr>
+        <w:t/>
+      </w:r>
+      <w:r>
+        <w:t/>
+      </w:r>
+      <w:r>
+        <w:rPr>
+          <w:vanish/>
+        </w:rPr>
+        <w:t/>
+      </w:r>
     </w:p>
     <w:p>
       <w:pPr>
@@ -19408,14 +20520,27 @@
         <w:lastRenderedPageBreak/>
         <w:t>Figure </w:t>
       </w:r>
-      <w:fldSimple w:instr=" SEQ Figure \* ARABIC ">
-        <w:r>
-          <w:rPr>
-            <w:noProof/>
-          </w:rPr>
-          <w:t>3</w:t>
-        </w:r>
-      </w:fldSimple>
+      <w:r>
+        <w:fldChar w:fldCharType="begin"/>
+      </w:r>
+      <w:r>
+        <w:instrText xml:space="preserve"> SEQ Figure \* ARABIC </w:instrText>
+      </w:r>
+      <w:r>
+        <w:fldChar w:fldCharType="separate"/>
+      </w:r>
+      <w:r>
+        <w:rPr>
+          <w:noProof/>
+        </w:rPr>
+        <w:t>3</w:t>
+      </w:r>
+      <w:r>
+        <w:rPr>
+          <w:noProof/>
+        </w:rPr>
+        <w:fldChar w:fldCharType="end"/>
+      </w:r>
       <w:bookmarkEnd w:id="106"/>
       <w:r>
         <w:tab/>
@@ -19466,7 +20591,7 @@
                     </pic:cNvPicPr>
                   </pic:nvPicPr>
                   <pic:blipFill>
-                    <a:blip r:embed="rId17">
+                    <a:blip r:embed="rId19">
                       <a:extLst>
                         <a:ext uri="{28A0092B-C50C-407E-A947-70E740481C1C}">
                           <a14:useLocalDpi xmlns:a14="http://schemas.microsoft.com/office/drawing/2010/main" val="0"/>
@@ -19530,14 +20655,27 @@
         <w:lastRenderedPageBreak/>
         <w:t>Figure </w:t>
       </w:r>
-      <w:fldSimple w:instr=" SEQ Figure \* ARABIC ">
-        <w:r>
-          <w:rPr>
-            <w:noProof/>
-          </w:rPr>
-          <w:t>4</w:t>
-        </w:r>
-      </w:fldSimple>
+      <w:r>
+        <w:fldChar w:fldCharType="begin"/>
+      </w:r>
+      <w:r>
+        <w:instrText xml:space="preserve"> SEQ Figure \* ARABIC </w:instrText>
+      </w:r>
+      <w:r>
+        <w:fldChar w:fldCharType="separate"/>
+      </w:r>
+      <w:r>
+        <w:rPr>
+          <w:noProof/>
+        </w:rPr>
+        <w:t>4</w:t>
+      </w:r>
+      <w:r>
+        <w:rPr>
+          <w:noProof/>
+        </w:rPr>
+        <w:fldChar w:fldCharType="end"/>
+      </w:r>
       <w:bookmarkEnd w:id="108"/>
       <w:r>
         <w:tab/>
@@ -19585,7 +20723,7 @@
                     </pic:cNvPicPr>
                   </pic:nvPicPr>
                   <pic:blipFill>
-                    <a:blip r:embed="rId18" cstate="print">
+                    <a:blip r:embed="rId20" cstate="print">
                       <a:extLst>
                         <a:ext uri="{28A0092B-C50C-407E-A947-70E740481C1C}">
                           <a14:useLocalDpi xmlns:a14="http://schemas.microsoft.com/office/drawing/2010/main" val="0"/>
@@ -19753,6 +20891,12 @@
         <w:rPr>
           <w:vanish/>
         </w:rPr>
+        <w:t/>
+      </w:r>
+      <w:r>
+        <w:rPr>
+          <w:vanish/>
+        </w:rPr>
         <w:t>[[INLINE_ID:inl_fast_slow]]</w:t>
       </w:r>
     </w:p>
@@ -19930,14 +21074,27 @@
         <w:lastRenderedPageBreak/>
         <w:t>Figure </w:t>
       </w:r>
-      <w:fldSimple w:instr=" SEQ Figure \* ARABIC ">
-        <w:r>
-          <w:rPr>
-            <w:noProof/>
-          </w:rPr>
-          <w:t>6</w:t>
-        </w:r>
-      </w:fldSimple>
+      <w:r>
+        <w:fldChar w:fldCharType="begin"/>
+      </w:r>
+      <w:r>
+        <w:instrText xml:space="preserve"> SEQ Figure \* ARABIC </w:instrText>
+      </w:r>
+      <w:r>
+        <w:fldChar w:fldCharType="separate"/>
+      </w:r>
+      <w:r>
+        <w:rPr>
+          <w:noProof/>
+        </w:rPr>
+        <w:t>6</w:t>
+      </w:r>
+      <w:r>
+        <w:rPr>
+          <w:noProof/>
+        </w:rPr>
+        <w:fldChar w:fldCharType="end"/>
+      </w:r>
       <w:bookmarkEnd w:id="111"/>
       <w:r>
         <w:tab/>
@@ -19973,6 +21130,12 @@
         <w:t xml:space="preserve"> (log scale)</w:t>
       </w:r>
       <w:bookmarkEnd w:id="112"/>
+      <w:r>
+        <w:rPr>
+          <w:vanish/>
+        </w:rPr>
+        <w:t/>
+      </w:r>
       <w:r>
         <w:rPr>
           <w:vanish/>
@@ -20006,7 +21169,7 @@
                     </pic:cNvPicPr>
                   </pic:nvPicPr>
                   <pic:blipFill>
-                    <a:blip r:embed="rId19">
+                    <a:blip r:embed="rId21">
                       <a:extLst>
                         <a:ext uri="{28A0092B-C50C-407E-A947-70E740481C1C}">
                           <a14:useLocalDpi xmlns:a14="http://schemas.microsoft.com/office/drawing/2010/main" val="0"/>
@@ -20068,14 +21231,6 @@
     </w:p>
     <w:p>
       <w:pPr>
-        <w:pStyle w:val="Paragraph"/>
-      </w:pPr>
-      <w:r>
-        <w:t>This is same perdon I can talkg about sht master minf that we can do that</w:t>
-      </w:r>
-    </w:p>
-    <w:p>
-      <w:pPr>
         <w:pStyle w:val="Heading2"/>
       </w:pPr>
       <w:bookmarkStart w:id="113" w:name="_Toc422332978"/>
@@ -20148,44 +21303,40 @@
                 <w:sz w:val="22"/>
                 <w:szCs w:val="22"/>
               </w:rPr>
-              <w:t>Yes it was very nice progress I want to no worry aboyt this so very proud</w:t>
-            </w:r>
-          </w:p>
-          <w:p>
-            <w:pPr>
-              <w:pStyle w:val="Paragraph"/>
+              <w:t xml:space="preserve">This section describes the </w:t>
+            </w:r>
+            <w:r>
               <w:rPr>
                 <w:sz w:val="22"/>
                 <w:szCs w:val="22"/>
               </w:rPr>
-            </w:pPr>
+              <w:t xml:space="preserve">results of the </w:t>
+            </w:r>
             <w:r>
               <w:rPr>
                 <w:sz w:val="22"/>
                 <w:szCs w:val="22"/>
               </w:rPr>
-              <w:t>Suggestions</w:t>
-            </w:r>
-          </w:p>
-          <w:p>
-            <w:pPr>
-              <w:pStyle w:val="ListBullet"/>
+              <w:t>PK</w:t>
+            </w:r>
+            <w:r>
               <w:rPr>
                 <w:sz w:val="22"/>
                 <w:szCs w:val="22"/>
               </w:rPr>
-            </w:pPr>
+              <w:t xml:space="preserve"> model development from </w:t>
+            </w:r>
             <w:r>
               <w:rPr>
                 <w:sz w:val="22"/>
                 <w:szCs w:val="22"/>
               </w:rPr>
-              <w:t xml:space="preserve">Reasoning for model selection at each stage of the model development process. </w:t>
-            </w:r>
-          </w:p>
-          <w:p>
-            <w:pPr>
-              <w:pStyle w:val="ListBullet"/>
+              <w:t>base model to final model.</w:t>
+            </w:r>
+          </w:p>
+          <w:p>
+            <w:pPr>
+              <w:pStyle w:val="Paragraph"/>
               <w:rPr>
                 <w:sz w:val="22"/>
                 <w:szCs w:val="22"/>
@@ -20196,7 +21347,7 @@
                 <w:sz w:val="22"/>
                 <w:szCs w:val="22"/>
               </w:rPr>
-              <w:t xml:space="preserve">Table for specific details of the model and change in likelihood. </w:t>
+              <w:t>Suggestions</w:t>
             </w:r>
           </w:p>
           <w:p>
@@ -20212,7 +21363,7 @@
                 <w:sz w:val="22"/>
                 <w:szCs w:val="22"/>
               </w:rPr>
-              <w:t xml:space="preserve">Description of the base and final models with emphasis on key attributes. Additional considerations provided in an appendix and referred to in these sections. </w:t>
+              <w:t xml:space="preserve">Reasoning for model selection at each stage of the model development process. </w:t>
             </w:r>
           </w:p>
           <w:p>
@@ -20228,7 +21379,7 @@
                 <w:sz w:val="22"/>
                 <w:szCs w:val="22"/>
               </w:rPr>
-              <w:t>Table with parameter estimates of base and final models.</w:t>
+              <w:t xml:space="preserve">Table for specific details of the model and change in likelihood. </w:t>
             </w:r>
           </w:p>
           <w:p>
@@ -20244,23 +21395,174 @@
                 <w:sz w:val="22"/>
                 <w:szCs w:val="22"/>
               </w:rPr>
-              <w:t xml:space="preserve">Consider placing model diagnostic plots in an appendix. </w:t>
-            </w:r>
-          </w:p>
-          <w:p>
-            <w:pPr>
-              <w:pStyle w:val="ListBullet"/>
+              <w:t xml:space="preserve">Description of the base </w:t>
+            </w:r>
+            <w:r>
               <w:rPr>
                 <w:sz w:val="22"/>
                 <w:szCs w:val="22"/>
               </w:rPr>
-            </w:pPr>
+              <w:t xml:space="preserve">and final </w:t>
+            </w:r>
             <w:r>
               <w:rPr>
                 <w:sz w:val="22"/>
                 <w:szCs w:val="22"/>
               </w:rPr>
-              <w:t xml:space="preserve">Include individual graphs in appendix and include only for the final model. </w:t>
+              <w:t>model</w:t>
+            </w:r>
+            <w:r>
+              <w:rPr>
+                <w:sz w:val="22"/>
+                <w:szCs w:val="22"/>
+              </w:rPr>
+              <w:t>s</w:t>
+            </w:r>
+            <w:r>
+              <w:rPr>
+                <w:sz w:val="22"/>
+                <w:szCs w:val="22"/>
+              </w:rPr>
+              <w:t xml:space="preserve"> with emphasis on key attributes</w:t>
+            </w:r>
+            <w:r>
+              <w:rPr>
+                <w:sz w:val="22"/>
+                <w:szCs w:val="22"/>
+              </w:rPr>
+              <w:t>. Additional considerations provided in an appendix and referred to</w:t>
+            </w:r>
+            <w:r>
+              <w:rPr>
+                <w:sz w:val="22"/>
+                <w:szCs w:val="22"/>
+              </w:rPr>
+              <w:t xml:space="preserve"> in these sections</w:t>
+            </w:r>
+            <w:r>
+              <w:rPr>
+                <w:sz w:val="22"/>
+                <w:szCs w:val="22"/>
+              </w:rPr>
+              <w:t xml:space="preserve">. </w:t>
+            </w:r>
+          </w:p>
+          <w:p>
+            <w:pPr>
+              <w:pStyle w:val="ListBullet"/>
+              <w:rPr>
+                <w:sz w:val="22"/>
+                <w:szCs w:val="22"/>
+              </w:rPr>
+            </w:pPr>
+            <w:r>
+              <w:rPr>
+                <w:sz w:val="22"/>
+                <w:szCs w:val="22"/>
+              </w:rPr>
+              <w:t>T</w:t>
+            </w:r>
+            <w:r>
+              <w:rPr>
+                <w:sz w:val="22"/>
+                <w:szCs w:val="22"/>
+              </w:rPr>
+              <w:t xml:space="preserve">able with parameter estimates of </w:t>
+            </w:r>
+            <w:r>
+              <w:rPr>
+                <w:sz w:val="22"/>
+                <w:szCs w:val="22"/>
+              </w:rPr>
+              <w:t>base and final</w:t>
+            </w:r>
+            <w:r>
+              <w:rPr>
+                <w:sz w:val="22"/>
+                <w:szCs w:val="22"/>
+              </w:rPr>
+              <w:t xml:space="preserve"> </w:t>
+            </w:r>
+            <w:r>
+              <w:rPr>
+                <w:sz w:val="22"/>
+                <w:szCs w:val="22"/>
+              </w:rPr>
+              <w:t>models</w:t>
+            </w:r>
+            <w:r>
+              <w:rPr>
+                <w:sz w:val="22"/>
+                <w:szCs w:val="22"/>
+              </w:rPr>
+              <w:t>.</w:t>
+            </w:r>
+          </w:p>
+          <w:p>
+            <w:pPr>
+              <w:pStyle w:val="ListBullet"/>
+              <w:rPr>
+                <w:sz w:val="22"/>
+                <w:szCs w:val="22"/>
+              </w:rPr>
+            </w:pPr>
+            <w:r>
+              <w:rPr>
+                <w:sz w:val="22"/>
+                <w:szCs w:val="22"/>
+              </w:rPr>
+              <w:t>Consider placing model diagnostic plots in an appendix</w:t>
+            </w:r>
+            <w:r>
+              <w:rPr>
+                <w:sz w:val="22"/>
+                <w:szCs w:val="22"/>
+              </w:rPr>
+              <w:t xml:space="preserve">. </w:t>
+            </w:r>
+          </w:p>
+          <w:p>
+            <w:pPr>
+              <w:pStyle w:val="ListBullet"/>
+              <w:rPr>
+                <w:sz w:val="22"/>
+                <w:szCs w:val="22"/>
+              </w:rPr>
+            </w:pPr>
+            <w:r>
+              <w:rPr>
+                <w:sz w:val="22"/>
+                <w:szCs w:val="22"/>
+              </w:rPr>
+              <w:t xml:space="preserve">Include </w:t>
+            </w:r>
+            <w:r>
+              <w:rPr>
+                <w:sz w:val="22"/>
+                <w:szCs w:val="22"/>
+              </w:rPr>
+              <w:t xml:space="preserve">individual graphs in appendix </w:t>
+            </w:r>
+            <w:r>
+              <w:rPr>
+                <w:sz w:val="22"/>
+                <w:szCs w:val="22"/>
+              </w:rPr>
+              <w:t xml:space="preserve">and </w:t>
+            </w:r>
+            <w:r>
+              <w:rPr>
+                <w:sz w:val="22"/>
+                <w:szCs w:val="22"/>
+              </w:rPr>
+              <w:t xml:space="preserve">include </w:t>
+            </w:r>
+            <w:r>
+              <w:rPr>
+                <w:sz w:val="22"/>
+                <w:szCs w:val="22"/>
+              </w:rPr>
+              <w:t xml:space="preserve">only for the final model. </w:t>
             </w:r>
             <w:r>
               <w:rPr>
@@ -20336,7 +21638,7 @@
               </w:rPr>
               <w:t xml:space="preserve"> </w:t>
             </w:r>
-            <w:hyperlink r:id="rId20" w:anchor="doc_info/2119166?state_type=steady_state__v" w:history="1">
+            <w:hyperlink r:id="rId22" w:anchor="doc_info/2119166?state_type=steady_state__v" w:history="1">
               <w:r>
                 <w:rPr>
                   <w:rStyle w:val="cf01"/>
@@ -20393,14 +21695,27 @@
       <w:r>
         <w:t>Table </w:t>
       </w:r>
-      <w:fldSimple w:instr=" SEQ Table \* ARABIC ">
-        <w:r>
-          <w:rPr>
-            <w:noProof/>
-          </w:rPr>
-          <w:t>4</w:t>
-        </w:r>
-      </w:fldSimple>
+      <w:r>
+        <w:fldChar w:fldCharType="begin"/>
+      </w:r>
+      <w:r>
+        <w:instrText xml:space="preserve"> SEQ Table \* ARABIC </w:instrText>
+      </w:r>
+      <w:r>
+        <w:fldChar w:fldCharType="separate"/>
+      </w:r>
+      <w:r>
+        <w:rPr>
+          <w:noProof/>
+        </w:rPr>
+        <w:t>4</w:t>
+      </w:r>
+      <w:r>
+        <w:rPr>
+          <w:noProof/>
+        </w:rPr>
+        <w:fldChar w:fldCharType="end"/>
+      </w:r>
       <w:bookmarkEnd w:id="118"/>
       <w:r>
         <w:tab/>
@@ -20849,7 +22164,16 @@
         <w:pStyle w:val="TableFootnoteInfo"/>
       </w:pPr>
       <w:r>
-        <w:t>BSV: between subject variability; OFV: objective function value; Cond. no.: condition number</w:t>
+        <w:t>BS</w:t>
+      </w:r>
+      <w:r>
+        <w:t xml:space="preserve">V: </w:t>
+      </w:r>
+      <w:r>
+        <w:t xml:space="preserve">between subject </w:t>
+      </w:r>
+      <w:r>
+        <w:t>variability; OFV: objective function value; Cond. no.: condition number</w:t>
       </w:r>
     </w:p>
     <w:p>
@@ -20922,7 +22246,10 @@
         <w:pStyle w:val="AppendixAlphaSub2"/>
       </w:pPr>
       <w:r>
-        <w:t>Available Data</w:t>
+        <w:t>Available Dat</w:t>
+      </w:r>
+      <w:r>
+        <w:t>a</w:t>
       </w:r>
     </w:p>
     <w:p>
@@ -20934,25 +22261,53 @@
       <w:r>
         <w:t>Table </w:t>
       </w:r>
-      <w:fldSimple w:instr=" STYLEREF  &quot;Appendix Alpha&quot; \n \t  ">
-        <w:r>
-          <w:rPr>
-            <w:noProof/>
-          </w:rPr>
-          <w:t>D</w:t>
-        </w:r>
-      </w:fldSimple>
-      <w:fldSimple w:instr=" SEQ Table \* ARABIC ">
-        <w:r>
-          <w:rPr>
-            <w:noProof/>
-          </w:rPr>
-          <w:t>1</w:t>
-        </w:r>
-      </w:fldSimple>
+      <w:r>
+        <w:fldChar w:fldCharType="begin"/>
+      </w:r>
+      <w:r>
+        <w:instrText xml:space="preserve"> STYLEREF  "Appendix Alpha" \n \t  </w:instrText>
+      </w:r>
+      <w:r>
+        <w:fldChar w:fldCharType="separate"/>
+      </w:r>
+      <w:r>
+        <w:rPr>
+          <w:noProof/>
+        </w:rPr>
+        <w:t>D</w:t>
+      </w:r>
+      <w:r>
+        <w:rPr>
+          <w:noProof/>
+        </w:rPr>
+        <w:fldChar w:fldCharType="end"/>
+      </w:r>
+      <w:r>
+        <w:fldChar w:fldCharType="begin"/>
+      </w:r>
+      <w:r>
+        <w:instrText xml:space="preserve"> SEQ Table \* ARABIC </w:instrText>
+      </w:r>
+      <w:r>
+        <w:fldChar w:fldCharType="separate"/>
+      </w:r>
+      <w:r>
+        <w:rPr>
+          <w:noProof/>
+        </w:rPr>
+        <w:t>1</w:t>
+      </w:r>
+      <w:r>
+        <w:rPr>
+          <w:noProof/>
+        </w:rPr>
+        <w:fldChar w:fldCharType="end"/>
+      </w:r>
       <w:bookmarkEnd w:id="122"/>
       <w:r>
         <w:tab/>
+      </w:r>
+      <w:r>
         <w:t>Summary of available data by study and dose</w:t>
       </w:r>
       <w:bookmarkEnd w:id="123"/>
@@ -23693,42 +25048,74 @@
       </w:pPr>
       <w:r>
         <w:lastRenderedPageBreak/>
-        <w:t>R environment and Package Details</w:t>
+        <w:t xml:space="preserve">R environment and </w:t>
+      </w:r>
+      <w:r>
+        <w:t>P</w:t>
+      </w:r>
+      <w:r>
+        <w:t xml:space="preserve">ackage </w:t>
+      </w:r>
+      <w:r>
+        <w:t>D</w:t>
+      </w:r>
+      <w:r>
+        <w:t>etails</w:t>
       </w:r>
     </w:p>
-    <w:p>
-      <w:pPr>
-        <w:spacing w:after="160" w:line="259" w:lineRule="auto"/>
-        <w:rPr>
-          <w:rFonts w:asciiTheme="majorHAnsi" w:hAnsiTheme="majorHAnsi" w:cs="Arial"/>
-          <w:b/>
-          <w:iCs/>
-          <w:snapToGrid w:val="0"/>
-          <w:sz w:val="28"/>
-          <w:szCs w:val="26"/>
-        </w:rPr>
-      </w:pPr>
-      <w:r>
-        <w:rPr>
-          <w:b/>
-        </w:rPr>
-        <w:t>&lt;&lt;Name:gof cwres |Title:GOF CWRES plot|Footnote:Conditional HAHSHAHHSHAHSHAHHSHSHSAHSHSHSH|Files:|Type:table&gt;&gt;</w:t>
-      </w:r>
-      <w:r>
-        <w:rPr>
-          <w:vanish/>
-        </w:rPr>
-        <w:t>[[BLOCK_ID:blk_gof_cwres]]</w:t>
-      </w:r>
-    </w:p>
-    <w:p/>
-    <w:p/>
     <w:p>
       <w:pPr>
         <w:jc w:val="center"/>
       </w:pPr>
+      <w:r>
+        <w:rPr>
+          <w:noProof/>
+        </w:rPr>
+        <w:drawing>
+          <wp:inline distT="0" distB="0" distL="0" distR="0" wp14:anchorId="420BC538" wp14:editId="5899DAF2">
+            <wp:extent cx="4572000" cy="5334000"/>
+            <wp:effectExtent l="0" t="0" r="0" b="0"/>
+            <wp:docPr id="1958889516" name="Picture 1958889516"/>
+            <wp:cNvGraphicFramePr>
+              <a:graphicFrameLocks xmlns:a="http://schemas.openxmlformats.org/drawingml/2006/main" noChangeAspect="1"/>
+            </wp:cNvGraphicFramePr>
+            <a:graphic xmlns:a="http://schemas.openxmlformats.org/drawingml/2006/main">
+              <a:graphicData uri="http://schemas.openxmlformats.org/drawingml/2006/picture">
+                <pic:pic xmlns:pic="http://schemas.openxmlformats.org/drawingml/2006/picture">
+                  <pic:nvPicPr>
+                    <pic:cNvPr id="0" name="dn-conc-time-linear.png"/>
+                    <pic:cNvPicPr/>
+                  </pic:nvPicPr>
+                  <pic:blipFill>
+                    <a:blip r:embed="rId23"/>
+                    <a:stretch>
+                      <a:fillRect/>
+                    </a:stretch>
+                  </pic:blipFill>
+                  <pic:spPr>
+                    <a:xfrm>
+                      <a:off x="0" y="0"/>
+                      <a:ext cx="4572000" cy="5334000"/>
+                    </a:xfrm>
+                    <a:prstGeom prst="rect">
+                      <a:avLst/>
+                    </a:prstGeom>
+                  </pic:spPr>
+                </pic:pic>
+              </a:graphicData>
+            </a:graphic>
+          </wp:inline>
+        </w:drawing>
+      </w:r>
     </w:p>
-    <w:p/>
+    <w:p>
+      <w:r>
+        <w:rPr>
+          <w:sz w:val="20"/>
+        </w:rPr>
+        <w:t>Conditional weighted residuals versus time.</w:t>
+      </w:r>
+    </w:p>
     <w:sectPr>
       <w:pgSz w:w="12242" w:h="15842" w:code="1"/>
       <w:pgMar w:top="1440" w:right="1440" w:bottom="1440" w:left="1701" w:header="709" w:footer="709" w:gutter="0"/>
@@ -23737,6 +25124,11 @@
     </w:sectPr>
   </w:body>
 </w:document>
+</file>
+
+<file path=word/comments.xml><?xml version="1.0" encoding="utf-8"?>
+<w:comments xmlns:wpc="http://schemas.microsoft.com/office/word/2010/wordprocessingCanvas" xmlns:mo="http://schemas.microsoft.com/office/mac/office/2008/main" xmlns:mc="http://schemas.openxmlformats.org/markup-compatibility/2006" xmlns:mv="urn:schemas-microsoft-com:mac:vml" xmlns:o="urn:schemas-microsoft-com:office:office" xmlns:r="http://schemas.openxmlformats.org/officeDocument/2006/relationships" xmlns:m="http://schemas.openxmlformats.org/officeDocument/2006/math" xmlns:v="urn:schemas-microsoft-com:vml" xmlns:wp14="http://schemas.microsoft.com/office/word/2010/wordprocessingDrawing" xmlns:wp="http://schemas.openxmlformats.org/drawingml/2006/wordprocessingDrawing" xmlns:w10="urn:schemas-microsoft-com:office:word" xmlns:w="http://schemas.openxmlformats.org/wordprocessingml/2006/main" xmlns:w14="http://schemas.microsoft.com/office/word/2010/wordml" xmlns:wpg="http://schemas.microsoft.com/office/word/2010/wordprocessingGroup" xmlns:wpi="http://schemas.microsoft.com/office/word/2010/wordprocessingInk" xmlns:wne="http://schemas.microsoft.com/office/word/2006/wordml" xmlns:wps="http://schemas.microsoft.com/office/word/2010/wordprocessingShape" mc:Ignorable="w14 wp14">
+</w:comments>
 </file>
 
 <file path=word/customizations.xml><?xml version="1.0" encoding="utf-8"?>
@@ -23958,7 +25350,31 @@
         <w:vanish/>
         <w:color w:val="008080"/>
       </w:rPr>
-      <w:t>Template Version Number:3.0</w:t>
+      <w:t>Template Version Number</w:t>
+    </w:r>
+    <w:r>
+      <w:rPr>
+        <w:i/>
+        <w:vanish/>
+        <w:color w:val="008080"/>
+      </w:rPr>
+      <w:t>:</w:t>
+    </w:r>
+    <w:r>
+      <w:rPr>
+        <w:i/>
+        <w:vanish/>
+        <w:color w:val="008080"/>
+      </w:rPr>
+      <w:t>3</w:t>
+    </w:r>
+    <w:r>
+      <w:rPr>
+        <w:i/>
+        <w:vanish/>
+        <w:color w:val="008080"/>
+      </w:rPr>
+      <w:t>.0</w:t>
     </w:r>
   </w:p>
 </w:ftr>
@@ -23995,14 +25411,27 @@
     <w:pPr>
       <w:pStyle w:val="Header"/>
     </w:pPr>
-    <w:fldSimple w:instr="STYLEREF  &quot;Z-Document Name&quot;  \* MERGEFORMAT">
-      <w:r>
-        <w:rPr>
-          <w:noProof/>
-        </w:rPr>
-        <w:t>Model Analysis Report</w:t>
-      </w:r>
-    </w:fldSimple>
+    <w:r>
+      <w:fldChar w:fldCharType="begin"/>
+    </w:r>
+    <w:r>
+      <w:instrText>STYLEREF  "Z-Document Name"  \* MERGEFORMAT</w:instrText>
+    </w:r>
+    <w:r>
+      <w:fldChar w:fldCharType="separate"/>
+    </w:r>
+    <w:r>
+      <w:rPr>
+        <w:noProof/>
+      </w:rPr>
+      <w:t>Model Analysis Report</w:t>
+    </w:r>
+    <w:r>
+      <w:rPr>
+        <w:noProof/>
+      </w:rPr>
+      <w:fldChar w:fldCharType="end"/>
+    </w:r>
     <w:r>
       <w:ptab w:relativeTo="margin" w:alignment="right" w:leader="none"/>
     </w:r>
@@ -24017,25 +25446,51 @@
     <w:pPr>
       <w:pStyle w:val="Header"/>
     </w:pPr>
-    <w:fldSimple w:instr="STYLEREF  &quot;Z-Line R 2&quot;  \* MERGEFORMAT">
-      <w:r>
-        <w:rPr>
-          <w:noProof/>
-        </w:rPr>
-        <w:t>jjj</w:t>
-      </w:r>
-    </w:fldSimple>
+    <w:r>
+      <w:fldChar w:fldCharType="begin"/>
+    </w:r>
+    <w:r>
+      <w:instrText>STYLEREF  "Z-Line R 2"  \* MERGEFORMAT</w:instrText>
+    </w:r>
+    <w:r>
+      <w:fldChar w:fldCharType="separate"/>
+    </w:r>
+    <w:r>
+      <w:rPr>
+        <w:noProof/>
+      </w:rPr>
+      <w:t>jjj</w:t>
+    </w:r>
+    <w:r>
+      <w:rPr>
+        <w:noProof/>
+      </w:rPr>
+      <w:fldChar w:fldCharType="end"/>
+    </w:r>
     <w:r>
       <w:ptab w:relativeTo="margin" w:alignment="right" w:leader="none"/>
     </w:r>
-    <w:fldSimple w:instr="STYLEREF  &quot;Z-Line R 4&quot;  \* MERGEFORMAT">
-      <w:r>
-        <w:rPr>
-          <w:noProof/>
-        </w:rPr>
-        <w:t>jkjkhjk</w:t>
-      </w:r>
-    </w:fldSimple>
+    <w:r>
+      <w:fldChar w:fldCharType="begin"/>
+    </w:r>
+    <w:r>
+      <w:instrText>STYLEREF  "Z-Line R 4"  \* MERGEFORMAT</w:instrText>
+    </w:r>
+    <w:r>
+      <w:fldChar w:fldCharType="separate"/>
+    </w:r>
+    <w:r>
+      <w:rPr>
+        <w:noProof/>
+      </w:rPr>
+      <w:t>jkjkhjk</w:t>
+    </w:r>
+    <w:r>
+      <w:rPr>
+        <w:noProof/>
+      </w:rPr>
+      <w:fldChar w:fldCharType="end"/>
+    </w:r>
   </w:p>
 </w:hdr>
 </file>
@@ -53260,6 +54715,32 @@
 </file>
 
 <file path=customXml/item2.xml><?xml version="1.0" encoding="utf-8"?>
+<p:properties xmlns:p="http://schemas.microsoft.com/office/2006/metadata/properties" xmlns:xsi="http://www.w3.org/2001/XMLSchema-instance" xmlns:pc="http://schemas.microsoft.com/office/infopath/2007/PartnerControls">
+  <documentManagement>
+    <Keyword xmlns="44a56295-c29e-4898-8136-a54736c65b82" xsi:nil="true"/>
+    <Descriptions xmlns="44a56295-c29e-4898-8136-a54736c65b82" xsi:nil="true"/>
+    <lcf76f155ced4ddcb4097134ff3c332f xmlns="8aa277c1-d1ea-4c39-998d-13590e101e7f">
+      <Terms xmlns="http://schemas.microsoft.com/office/infopath/2007/PartnerControls"/>
+    </lcf76f155ced4ddcb4097134ff3c332f>
+    <TaxCatchAll xmlns="a3bda4ac-f0aa-484b-b750-bde5783238e8" xsi:nil="true"/>
+  </documentManagement>
+</p:properties>
+</file>
+
+<file path=customXml/item3.xml><?xml version="1.0" encoding="utf-8"?>
+<b:Sources xmlns:b="http://schemas.openxmlformats.org/officeDocument/2006/bibliography" xmlns="http://schemas.openxmlformats.org/officeDocument/2006/bibliography" SelectedStyle="\APASixthEditionOfficeOnline.xsl" StyleName="APA" Version="6"/>
+</file>
+
+<file path=customXml/item4.xml><?xml version="1.0" encoding="utf-8"?>
+<?mso-contentType ?>
+<FormTemplates xmlns="http://schemas.microsoft.com/sharepoint/v3/contenttype/forms">
+  <Display>DocumentLibraryForm</Display>
+  <Edit>DocumentLibraryForm</Edit>
+  <New>DocumentLibraryForm</New>
+</FormTemplates>
+</file>
+
+<file path=customXml/item5.xml><?xml version="1.0" encoding="utf-8"?>
 <ct:contentTypeSchema xmlns:ct="http://schemas.microsoft.com/office/2006/metadata/contentType" xmlns:ma="http://schemas.microsoft.com/office/2006/metadata/properties/metaAttributes" ct:_="" ma:_="" ma:contentTypeName="Document" ma:contentTypeID="0x010100A7762C85E483334AB8222100ECB11BCE" ma:contentTypeVersion="13" ma:contentTypeDescription="Create a new document." ma:contentTypeScope="" ma:versionID="75b332414a0816cfcde876ee00c40d9c">
   <xsd:schema xmlns:xsd="http://www.w3.org/2001/XMLSchema" xmlns:xs="http://www.w3.org/2001/XMLSchema" xmlns:p="http://schemas.microsoft.com/office/2006/metadata/properties" xmlns:ns2="44a56295-c29e-4898-8136-a54736c65b82" xmlns:ns3="8aa277c1-d1ea-4c39-998d-13590e101e7f" xmlns:ns4="a3bda4ac-f0aa-484b-b750-bde5783238e8" targetNamespace="http://schemas.microsoft.com/office/2006/metadata/properties" ma:root="true" ma:fieldsID="94fde33dd5881b75a2eab763bf6462c7" ns2:_="" ns3:_="" ns4:_="">
     <xsd:import namespace="44a56295-c29e-4898-8136-a54736c65b82"/>
@@ -53475,32 +54956,6 @@
 </ct:contentTypeSchema>
 </file>
 
-<file path=customXml/item3.xml><?xml version="1.0" encoding="utf-8"?>
-<?mso-contentType ?>
-<FormTemplates xmlns="http://schemas.microsoft.com/sharepoint/v3/contenttype/forms">
-  <Display>DocumentLibraryForm</Display>
-  <Edit>DocumentLibraryForm</Edit>
-  <New>DocumentLibraryForm</New>
-</FormTemplates>
-</file>
-
-<file path=customXml/item4.xml><?xml version="1.0" encoding="utf-8"?>
-<b:Sources xmlns:b="http://schemas.openxmlformats.org/officeDocument/2006/bibliography" xmlns="http://schemas.openxmlformats.org/officeDocument/2006/bibliography" SelectedStyle="\APASixthEditionOfficeOnline.xsl" StyleName="APA" Version="6"/>
-</file>
-
-<file path=customXml/item5.xml><?xml version="1.0" encoding="utf-8"?>
-<p:properties xmlns:p="http://schemas.microsoft.com/office/2006/metadata/properties" xmlns:xsi="http://www.w3.org/2001/XMLSchema-instance" xmlns:pc="http://schemas.microsoft.com/office/infopath/2007/PartnerControls">
-  <documentManagement>
-    <Keyword xmlns="44a56295-c29e-4898-8136-a54736c65b82" xsi:nil="true"/>
-    <Descriptions xmlns="44a56295-c29e-4898-8136-a54736c65b82" xsi:nil="true"/>
-    <lcf76f155ced4ddcb4097134ff3c332f xmlns="8aa277c1-d1ea-4c39-998d-13590e101e7f">
-      <Terms xmlns="http://schemas.microsoft.com/office/infopath/2007/PartnerControls"/>
-    </lcf76f155ced4ddcb4097134ff3c332f>
-    <TaxCatchAll xmlns="a3bda4ac-f0aa-484b-b750-bde5783238e8" xsi:nil="true"/>
-  </documentManagement>
-</p:properties>
-</file>
-
 <file path=customXml/itemProps1.xml><?xml version="1.0" encoding="utf-8"?>
 <ds:datastoreItem xmlns:ds="http://schemas.openxmlformats.org/officeDocument/2006/customXml" ds:itemID="{8EF5C56D-9B05-4CE4-B93C-919EF597165D}">
   <ds:schemaRefs>
@@ -53510,6 +54965,34 @@
 </file>
 
 <file path=customXml/itemProps2.xml><?xml version="1.0" encoding="utf-8"?>
+<ds:datastoreItem xmlns:ds="http://schemas.openxmlformats.org/officeDocument/2006/customXml" ds:itemID="{A468AB16-E26C-4EEC-963F-FFAE87E41854}">
+  <ds:schemaRefs>
+    <ds:schemaRef ds:uri="http://schemas.microsoft.com/office/2006/metadata/properties"/>
+    <ds:schemaRef ds:uri="http://schemas.microsoft.com/office/infopath/2007/PartnerControls"/>
+    <ds:schemaRef ds:uri="44a56295-c29e-4898-8136-a54736c65b82"/>
+    <ds:schemaRef ds:uri="8aa277c1-d1ea-4c39-998d-13590e101e7f"/>
+    <ds:schemaRef ds:uri="a3bda4ac-f0aa-484b-b750-bde5783238e8"/>
+  </ds:schemaRefs>
+</ds:datastoreItem>
+</file>
+
+<file path=customXml/itemProps3.xml><?xml version="1.0" encoding="utf-8"?>
+<ds:datastoreItem xmlns:ds="http://schemas.openxmlformats.org/officeDocument/2006/customXml" ds:itemID="{0CB43EF1-53E0-4B1B-AB67-503CDEF86374}">
+  <ds:schemaRefs>
+    <ds:schemaRef ds:uri="http://schemas.openxmlformats.org/officeDocument/2006/bibliography"/>
+  </ds:schemaRefs>
+</ds:datastoreItem>
+</file>
+
+<file path=customXml/itemProps4.xml><?xml version="1.0" encoding="utf-8"?>
+<ds:datastoreItem xmlns:ds="http://schemas.openxmlformats.org/officeDocument/2006/customXml" ds:itemID="{6ADEFE45-D4E9-47EC-8556-818C9058A4BE}">
+  <ds:schemaRefs>
+    <ds:schemaRef ds:uri="http://schemas.microsoft.com/sharepoint/v3/contenttype/forms"/>
+  </ds:schemaRefs>
+</ds:datastoreItem>
+</file>
+
+<file path=customXml/itemProps5.xml><?xml version="1.0" encoding="utf-8"?>
 <ds:datastoreItem xmlns:ds="http://schemas.openxmlformats.org/officeDocument/2006/customXml" ds:itemID="{6859E1BC-91BD-4D67-B1E7-6630A4CB2439}">
   <ds:schemaRefs>
     <ds:schemaRef ds:uri="http://schemas.microsoft.com/office/2006/metadata/contentType"/>
@@ -53527,32 +55010,4 @@
     <ds:schemaRef ds:uri="http://schemas.microsoft.com/internal/obd"/>
   </ds:schemaRefs>
 </ds:datastoreItem>
-</file>
-
-<file path=customXml/itemProps3.xml><?xml version="1.0" encoding="utf-8"?>
-<ds:datastoreItem xmlns:ds="http://schemas.openxmlformats.org/officeDocument/2006/customXml" ds:itemID="{6ADEFE45-D4E9-47EC-8556-818C9058A4BE}">
-  <ds:schemaRefs>
-    <ds:schemaRef ds:uri="http://schemas.microsoft.com/sharepoint/v3/contenttype/forms"/>
-  </ds:schemaRefs>
-</ds:datastoreItem>
-</file>
-
-<file path=customXml/itemProps4.xml><?xml version="1.0" encoding="utf-8"?>
-<ds:datastoreItem xmlns:ds="http://schemas.openxmlformats.org/officeDocument/2006/customXml" ds:itemID="{0CB43EF1-53E0-4B1B-AB67-503CDEF86374}">
-  <ds:schemaRefs>
-    <ds:schemaRef ds:uri="http://schemas.openxmlformats.org/officeDocument/2006/bibliography"/>
-  </ds:schemaRefs>
-</ds:datastoreItem>
-</file>
-
-<file path=customXml/itemProps5.xml><?xml version="1.0" encoding="utf-8"?>
-<ds:datastoreItem xmlns:ds="http://schemas.openxmlformats.org/officeDocument/2006/customXml" ds:itemID="{A468AB16-E26C-4EEC-963F-FFAE87E41854}">
-  <ds:schemaRefs>
-    <ds:schemaRef ds:uri="http://schemas.microsoft.com/office/2006/metadata/properties"/>
-    <ds:schemaRef ds:uri="http://schemas.microsoft.com/office/infopath/2007/PartnerControls"/>
-    <ds:schemaRef ds:uri="44a56295-c29e-4898-8136-a54736c65b82"/>
-    <ds:schemaRef ds:uri="8aa277c1-d1ea-4c39-998d-13590e101e7f"/>
-    <ds:schemaRef ds:uri="a3bda4ac-f0aa-484b-b750-bde5783238e8"/>
-  </ds:schemaRefs>
-</ds:datastoreItem>
 </file>
</xml_diff>

<commit_message>
fix: missing title and other part highlight
</commit_message>
<xml_diff>
--- a/output/intermediate/PopPK_Report_merge_TFL_filled_draft-magic.docx
+++ b/output/intermediate/PopPK_Report_merge_TFL_filled_draft-magic.docx
@@ -44,16 +44,7 @@
               <w:pStyle w:val="Z-DocumentName"/>
             </w:pPr>
             <w:r>
-              <w:t>Model</w:t>
-            </w:r>
-            <w:r>
-              <w:t xml:space="preserve"> </w:t>
-            </w:r>
-            <w:r>
-              <w:t xml:space="preserve">Analysis </w:t>
-            </w:r>
-            <w:r>
-              <w:t>Report</w:t>
+              <w:t>Model Analysis Report</w:t>
             </w:r>
           </w:p>
         </w:tc>
@@ -95,9 +86,11 @@
             <w:pPr>
               <w:pStyle w:val="Z-LineR1"/>
             </w:pPr>
+            <w:proofErr w:type="spellStart"/>
             <w:r>
               <w:t>hhh</w:t>
             </w:r>
+            <w:proofErr w:type="spellEnd"/>
           </w:p>
         </w:tc>
       </w:tr>
@@ -125,13 +118,7 @@
               <w:pStyle w:val="Z-LineL2"/>
             </w:pPr>
             <w:r>
-              <w:t xml:space="preserve">Study </w:t>
-            </w:r>
-            <w:r>
-              <w:t>C</w:t>
-            </w:r>
-            <w:r>
-              <w:t>ode</w:t>
+              <w:t>Study Code</w:t>
             </w:r>
           </w:p>
         </w:tc>
@@ -144,9 +131,11 @@
             <w:pPr>
               <w:pStyle w:val="Z-LineR2"/>
             </w:pPr>
+            <w:proofErr w:type="spellStart"/>
             <w:r>
               <w:t>jjj</w:t>
             </w:r>
+            <w:proofErr w:type="spellEnd"/>
           </w:p>
         </w:tc>
       </w:tr>
@@ -187,9 +176,11 @@
             <w:pPr>
               <w:pStyle w:val="Z-LineR3"/>
             </w:pPr>
+            <w:proofErr w:type="spellStart"/>
             <w:r>
               <w:t>jjj</w:t>
             </w:r>
+            <w:proofErr w:type="spellEnd"/>
           </w:p>
         </w:tc>
       </w:tr>
@@ -230,9 +221,11 @@
             <w:pPr>
               <w:pStyle w:val="Z-LineR4"/>
             </w:pPr>
+            <w:proofErr w:type="spellStart"/>
             <w:r>
               <w:t>jkjkhjk</w:t>
             </w:r>
+            <w:proofErr w:type="spellEnd"/>
           </w:p>
         </w:tc>
       </w:tr>
@@ -450,19 +443,28 @@
               <w:pStyle w:val="Title"/>
             </w:pPr>
             <w:r>
-              <w:t>Population PK Model</w:t>
-            </w:r>
-            <w:r>
-              <w:t xml:space="preserve"> </w:t>
-            </w:r>
-            <w:r>
-              <w:t xml:space="preserve">Analysis </w:t>
-            </w:r>
-            <w:r>
-              <w:t xml:space="preserve">Report of </w:t>
+              <w:t xml:space="preserve">Population PK Model Analysis Report of </w:t>
             </w:r>
             <w:r>
               <w:t>{{specify relevant scope including patient population, age etc}}</w:t>
+            </w:r>
+            <w:r>
+              <w:rPr>
+                <w:vanish/>
+              </w:rPr>
+              <w:t/>
+            </w:r>
+            <w:r>
+              <w:rPr>
+                <w:vanish/>
+              </w:rPr>
+              <w:t/>
+            </w:r>
+            <w:r>
+              <w:rPr>
+                <w:vanish/>
+              </w:rPr>
+              <w:t/>
             </w:r>
             <w:r>
               <w:rPr>
@@ -480,6 +482,24 @@
             </w:r>
             <w:r>
               <w:t>{{list all clinical studies used}}</w:t>
+            </w:r>
+            <w:r>
+              <w:rPr>
+                <w:vanish/>
+              </w:rPr>
+              <w:t/>
+            </w:r>
+            <w:r>
+              <w:rPr>
+                <w:vanish/>
+              </w:rPr>
+              <w:t/>
+            </w:r>
+            <w:r>
+              <w:rPr>
+                <w:vanish/>
+              </w:rPr>
+              <w:t/>
             </w:r>
             <w:r>
               <w:rPr>
@@ -692,7 +712,16 @@
                 <w:sz w:val="22"/>
                 <w:szCs w:val="22"/>
               </w:rPr>
-              <w:t xml:space="preserve"> a previously developed model with new data (such as a Phase 3 update), use the template PopPK_</w:t>
+              <w:t xml:space="preserve"> a previously developed model with new data (such as a Phase 3 update), use the template </w:t>
+            </w:r>
+            <w:proofErr w:type="spellStart"/>
+            <w:r>
+              <w:rPr>
+                <w:rFonts w:ascii="Times New Roman" w:hAnsi="Times New Roman"/>
+                <w:sz w:val="22"/>
+                <w:szCs w:val="22"/>
+              </w:rPr>
+              <w:t>PopPK_</w:t>
             </w:r>
             <w:r>
               <w:rPr>
@@ -710,6 +739,7 @@
               </w:rPr>
               <w:t>_ModelUpdate</w:t>
             </w:r>
+            <w:proofErr w:type="spellEnd"/>
           </w:p>
           <w:p>
             <w:pPr>
@@ -725,23 +755,7 @@
                 <w:sz w:val="22"/>
                 <w:szCs w:val="22"/>
               </w:rPr>
-              <w:t xml:space="preserve">The Study code(s) in the upper corner should contain the study </w:t>
-            </w:r>
-            <w:r>
-              <w:rPr>
-                <w:rFonts w:ascii="Times New Roman" w:hAnsi="Times New Roman"/>
-                <w:sz w:val="22"/>
-                <w:szCs w:val="22"/>
-              </w:rPr>
-              <w:t>analysed</w:t>
-            </w:r>
-            <w:r>
-              <w:rPr>
-                <w:rFonts w:ascii="Times New Roman" w:hAnsi="Times New Roman"/>
-                <w:sz w:val="22"/>
-                <w:szCs w:val="22"/>
-              </w:rPr>
-              <w:t xml:space="preserve"> (e.g., D1234C00001). If analysis of a single study or focused on a single study, put that study code here. If analysis is of a pool, then put “Various” here and list the codes in the full title under “Clinical Studies:”.</w:t>
+              <w:t>The Study code(s) in the upper corner should contain the study analysed (e.g., D1234C00001). If analysis of a single study or focused on a single study, put that study code here. If analysis is of a pool, then put “Various” here and list the codes in the full title under “Clinical Studies:”.</w:t>
             </w:r>
           </w:p>
           <w:p>
@@ -975,7 +989,15 @@
               <w:t>should not be modified unless strictly necessary</w:t>
             </w:r>
             <w:r>
-              <w:t xml:space="preserve"> since they have corresponding sections in the templated analysis report and the TFLs are pre-coded within the MERGE popPK activity templates.</w:t>
+              <w:t xml:space="preserve"> since they have corresponding sections in the templated analysis report and the TFLs are pre-coded within the MERGE </w:t>
+            </w:r>
+            <w:proofErr w:type="spellStart"/>
+            <w:r>
+              <w:t>popPK</w:t>
+            </w:r>
+            <w:proofErr w:type="spellEnd"/>
+            <w:r>
+              <w:t xml:space="preserve"> activity templates.</w:t>
             </w:r>
           </w:p>
           <w:p>
@@ -992,7 +1014,23 @@
                 <w:sz w:val="24"/>
                 <w:szCs w:val="24"/>
               </w:rPr>
-              <w:t>Where several options are provided, please choose which one to use and delete the other version. The option-specific text refers to the one paragraph including the [Option x: ]. Subsequent paragraphs below/above the option should be kept, irrespectively of which option you choose.</w:t>
+              <w:t>Where several options are provided, please choose which one to use and delete the other version. The option-specific text refers to the one paragraph including the [Option x</w:t>
+            </w:r>
+            <w:proofErr w:type="gramStart"/>
+            <w:r>
+              <w:rPr>
+                <w:sz w:val="24"/>
+                <w:szCs w:val="24"/>
+              </w:rPr>
+              <w:t>: ]</w:t>
+            </w:r>
+            <w:proofErr w:type="gramEnd"/>
+            <w:r>
+              <w:rPr>
+                <w:sz w:val="24"/>
+                <w:szCs w:val="24"/>
+              </w:rPr>
+              <w:t>. Subsequent paragraphs below/above the option should be kept, irrespectively of which option you choose.</w:t>
             </w:r>
           </w:p>
         </w:tc>
@@ -1076,7 +1114,25 @@
                 <w:szCs w:val="22"/>
                 <w:lang w:val="en-US"/>
               </w:rPr>
-              <w:t>Refresh all ToCs before finalization.</w:t>
+              <w:t xml:space="preserve">Refresh all </w:t>
+            </w:r>
+            <w:proofErr w:type="spellStart"/>
+            <w:r>
+              <w:rPr>
+                <w:sz w:val="22"/>
+                <w:szCs w:val="22"/>
+                <w:lang w:val="en-US"/>
+              </w:rPr>
+              <w:t>ToCs</w:t>
+            </w:r>
+            <w:proofErr w:type="spellEnd"/>
+            <w:r>
+              <w:rPr>
+                <w:sz w:val="22"/>
+                <w:szCs w:val="22"/>
+                <w:lang w:val="en-US"/>
+              </w:rPr>
+              <w:t xml:space="preserve"> before finalization.</w:t>
             </w:r>
           </w:p>
           <w:p>
@@ -5174,6 +5230,24 @@
         <w:rPr>
           <w:vanish/>
         </w:rPr>
+        <w:t/>
+      </w:r>
+      <w:r>
+        <w:rPr>
+          <w:vanish/>
+        </w:rPr>
+        <w:t/>
+      </w:r>
+      <w:r>
+        <w:rPr>
+          <w:vanish/>
+        </w:rPr>
+        <w:t/>
+      </w:r>
+      <w:r>
+        <w:rPr>
+          <w:vanish/>
+        </w:rPr>
         <w:t>[[INLINE_ID:inl_study]]</w:t>
       </w:r>
     </w:p>
@@ -5270,12 +5344,6 @@
             <w:noProof/>
           </w:rPr>
           <w:tab/>
-        </w:r>
-        <w:r>
-          <w:rPr>
-            <w:rStyle w:val="Hyperlink"/>
-            <w:noProof/>
-          </w:rPr>
           <w:t>Base Model Parameter Estimates</w:t>
         </w:r>
         <w:r>
@@ -5936,6 +6004,24 @@
         <w:rPr>
           <w:vanish/>
         </w:rPr>
+        <w:t/>
+      </w:r>
+      <w:r>
+        <w:rPr>
+          <w:vanish/>
+        </w:rPr>
+        <w:t/>
+      </w:r>
+      <w:r>
+        <w:rPr>
+          <w:vanish/>
+        </w:rPr>
+        <w:t/>
+      </w:r>
+      <w:r>
+        <w:rPr>
+          <w:vanish/>
+        </w:rPr>
         <w:t>[[INLINE_ID:inl_study_and_dose]]</w:t>
       </w:r>
     </w:p>
@@ -6022,6 +6108,24 @@
           <w:fldChar w:fldCharType="end"/>
         </w:r>
       </w:hyperlink>
+      <w:r>
+        <w:rPr>
+          <w:vanish/>
+        </w:rPr>
+        <w:t/>
+      </w:r>
+      <w:r>
+        <w:rPr>
+          <w:vanish/>
+        </w:rPr>
+        <w:t/>
+      </w:r>
+      <w:r>
+        <w:rPr>
+          <w:vanish/>
+        </w:rPr>
+        <w:t/>
+      </w:r>
       <w:r>
         <w:rPr>
           <w:vanish/>
@@ -6128,12 +6232,6 @@
             <w:noProof/>
           </w:rPr>
           <w:tab/>
-        </w:r>
-        <w:r>
-          <w:rPr>
-            <w:rStyle w:val="Hyperlink"/>
-            <w:noProof/>
-          </w:rPr>
           <w:t>Correlation Between Empirical Bayes Estimates and Categorical Covariates</w:t>
         </w:r>
         <w:r>
@@ -6761,6 +6859,24 @@
         <w:rPr>
           <w:vanish/>
         </w:rPr>
+        <w:t/>
+      </w:r>
+      <w:r>
+        <w:rPr>
+          <w:vanish/>
+        </w:rPr>
+        <w:t/>
+      </w:r>
+      <w:r>
+        <w:rPr>
+          <w:vanish/>
+        </w:rPr>
+        <w:t/>
+      </w:r>
+      <w:r>
+        <w:rPr>
+          <w:vanish/>
+        </w:rPr>
         <w:t>[[INLINE_ID:inl_study_and_dose]]</w:t>
       </w:r>
     </w:p>
@@ -6857,6 +6973,24 @@
         <w:rPr>
           <w:vanish/>
         </w:rPr>
+        <w:t/>
+      </w:r>
+      <w:r>
+        <w:rPr>
+          <w:vanish/>
+        </w:rPr>
+        <w:t/>
+      </w:r>
+      <w:r>
+        <w:rPr>
+          <w:vanish/>
+        </w:rPr>
+        <w:t/>
+      </w:r>
+      <w:r>
+        <w:rPr>
+          <w:vanish/>
+        </w:rPr>
         <w:t>[[INLINE_ID:inl_study_and_dose]]</w:t>
       </w:r>
     </w:p>
@@ -6942,6 +7076,24 @@
           <w:fldChar w:fldCharType="end"/>
         </w:r>
       </w:hyperlink>
+      <w:r>
+        <w:rPr>
+          <w:vanish/>
+        </w:rPr>
+        <w:t/>
+      </w:r>
+      <w:r>
+        <w:rPr>
+          <w:vanish/>
+        </w:rPr>
+        <w:t/>
+      </w:r>
+      <w:r>
+        <w:rPr>
+          <w:vanish/>
+        </w:rPr>
+        <w:t/>
+      </w:r>
       <w:r>
         <w:rPr>
           <w:vanish/>
@@ -7124,14 +7276,14 @@
             <w:noProof/>
             <w:highlight w:val="cyan"/>
           </w:rPr>
-          <w:t>{{pc}}</w:t>
+          <w:t>{{Stud</w:t>
         </w:r>
         <w:r>
           <w:rPr>
             <w:rStyle w:val="Hyperlink"/>
             <w:noProof/>
           </w:rPr>
-          <w:t xml:space="preserve">VPC of </w:t>
+          <w:t xml:space="preserve">y}}VPC </w:t>
         </w:r>
         <w:r>
           <w:rPr>
@@ -7139,14 +7291,14 @@
             <w:noProof/>
             <w:highlight w:val="cyan"/>
           </w:rPr>
-          <w:t>{{dose-normalized}}</w:t>
+          <w:t>of {{dose-normalize</w:t>
         </w:r>
         <w:r>
           <w:rPr>
             <w:rStyle w:val="Hyperlink"/>
             <w:noProof/>
           </w:rPr>
-          <w:t xml:space="preserve"> Concentration versus Time after dose by </w:t>
+          <w:t xml:space="preserve">d}} Concentration versus Time after dose </w:t>
         </w:r>
         <w:r>
           <w:rPr>
@@ -7154,14 +7306,14 @@
             <w:noProof/>
             <w:highlight w:val="cyan"/>
           </w:rPr>
-          <w:t>{{Study}}</w:t>
+          <w:t>by {{Stud</w:t>
         </w:r>
         <w:r>
           <w:rPr>
             <w:rStyle w:val="Hyperlink"/>
             <w:noProof/>
           </w:rPr>
-          <w:t xml:space="preserve"> for Base Model</w:t>
+          <w:t xml:space="preserve">y}} for Base Mo</w:t>
         </w:r>
         <w:r>
           <w:rPr>
@@ -7196,7 +7348,7 @@
           <w:rPr>
             <w:noProof/>
           </w:rPr>
-          <w:t>46</w:t>
+          <w:t>del46</w:t>
         </w:r>
         <w:r>
           <w:rPr>
@@ -7215,19 +7367,55 @@
         <w:rPr>
           <w:vanish/>
         </w:rPr>
-        <w:t>[[INLINE_ID:inl_pc]]</w:t>
+        <w:t/>
+      </w:r>
+      <w:r>
+        <w:rPr>
+          <w:vanish/>
+        </w:rPr>
+        <w:t/>
+      </w:r>
+      <w:r>
+        <w:rPr>
+          <w:vanish/>
+        </w:rPr>
+        <w:t/>
+      </w:r>
+      <w:r>
+        <w:rPr>
+          <w:vanish/>
+        </w:rPr>
+        <w:t/>
+      </w:r>
+      <w:r>
+        <w:rPr>
+          <w:vanish/>
+        </w:rPr>
+        <w:t/>
+      </w:r>
+      <w:r>
+        <w:rPr>
+          <w:vanish/>
+        </w:rPr>
+        <w:t/>
+      </w:r>
+      <w:r>
+        <w:rPr>
+          <w:vanish/>
+        </w:rPr>
+        <w:t/>
+      </w:r>
+      <w:r>
+        <w:rPr>
+          <w:vanish/>
+        </w:rPr>
+        <w:t>[[INLINE_ID:inl_study]]</w:t>
       </w:r>
       <w:r>
         <w:rPr>
           <w:vanish/>
         </w:rPr>
         <w:t>[[INLINE_ID:inl_dose_normalized]]</w:t>
-      </w:r>
-      <w:r>
-        <w:rPr>
-          <w:vanish/>
-        </w:rPr>
-        <w:t>[[INLINE_ID:inl_study]]</w:t>
       </w:r>
     </w:p>
     <w:p>
@@ -7261,14 +7449,14 @@
             <w:noProof/>
             <w:highlight w:val="cyan"/>
           </w:rPr>
-          <w:t>{{pc}}</w:t>
+          <w:t>{{rena</w:t>
         </w:r>
         <w:r>
           <w:rPr>
             <w:rStyle w:val="Hyperlink"/>
             <w:noProof/>
           </w:rPr>
-          <w:t xml:space="preserve">VPC of </w:t>
+          <w:t xml:space="preserve">l funct</w:t>
         </w:r>
         <w:r>
           <w:rPr>
@@ -7276,14 +7464,14 @@
             <w:noProof/>
             <w:highlight w:val="cyan"/>
           </w:rPr>
-          <w:t>{{dose-normalized}}</w:t>
+          <w:t>ion}}VPC of {{dose-</w:t>
         </w:r>
         <w:r>
           <w:rPr>
             <w:rStyle w:val="Hyperlink"/>
             <w:noProof/>
           </w:rPr>
-          <w:t xml:space="preserve"> Concentration versus Time after dose by </w:t>
+          <w:t xml:space="preserve">normalized}} Concentration versus Time af</w:t>
         </w:r>
         <w:r>
           <w:rPr>
@@ -7291,14 +7479,14 @@
             <w:noProof/>
             <w:highlight w:val="cyan"/>
           </w:rPr>
-          <w:t>{{renal function}}</w:t>
+          <w:t>ter dose by {{rena</w:t>
         </w:r>
         <w:r>
           <w:rPr>
             <w:rStyle w:val="Hyperlink"/>
             <w:noProof/>
           </w:rPr>
-          <w:t xml:space="preserve"> for Base Model</w:t>
+          <w:t xml:space="preserve">l function}} fo</w:t>
         </w:r>
         <w:r>
           <w:rPr>
@@ -7333,7 +7521,7 @@
           <w:rPr>
             <w:noProof/>
           </w:rPr>
-          <w:t>47</w:t>
+          <w:t>r Base Model47</w:t>
         </w:r>
         <w:r>
           <w:rPr>
@@ -7352,19 +7540,55 @@
         <w:rPr>
           <w:vanish/>
         </w:rPr>
-        <w:t>[[INLINE_ID:inl_pc]]</w:t>
+        <w:t/>
+      </w:r>
+      <w:r>
+        <w:rPr>
+          <w:vanish/>
+        </w:rPr>
+        <w:t/>
+      </w:r>
+      <w:r>
+        <w:rPr>
+          <w:vanish/>
+        </w:rPr>
+        <w:t/>
+      </w:r>
+      <w:r>
+        <w:rPr>
+          <w:vanish/>
+        </w:rPr>
+        <w:t/>
+      </w:r>
+      <w:r>
+        <w:rPr>
+          <w:vanish/>
+        </w:rPr>
+        <w:t/>
+      </w:r>
+      <w:r>
+        <w:rPr>
+          <w:vanish/>
+        </w:rPr>
+        <w:t/>
+      </w:r>
+      <w:r>
+        <w:rPr>
+          <w:vanish/>
+        </w:rPr>
+        <w:t/>
+      </w:r>
+      <w:r>
+        <w:rPr>
+          <w:vanish/>
+        </w:rPr>
+        <w:t>[[INLINE_ID:inl_renal_function]]</w:t>
       </w:r>
       <w:r>
         <w:rPr>
           <w:vanish/>
         </w:rPr>
         <w:t>[[INLINE_ID:inl_dose_normalized]]</w:t>
-      </w:r>
-      <w:r>
-        <w:rPr>
-          <w:vanish/>
-        </w:rPr>
-        <w:t>[[INLINE_ID:inl_renal_function]]</w:t>
       </w:r>
     </w:p>
     <w:p>
@@ -7529,12 +7753,6 @@
             <w:noProof/>
           </w:rPr>
           <w:tab/>
-        </w:r>
-        <w:r>
-          <w:rPr>
-            <w:rStyle w:val="Hyperlink"/>
-            <w:noProof/>
-          </w:rPr>
           <w:t>Scatter Plot of Individual Random Effects for Vc/F versus Continuous Covariates for Base Model</w:t>
         </w:r>
         <w:r>
@@ -8018,12 +8236,6 @@
             <w:noProof/>
           </w:rPr>
           <w:tab/>
-        </w:r>
-        <w:r>
-          <w:rPr>
-            <w:rStyle w:val="Hyperlink"/>
-            <w:noProof/>
-          </w:rPr>
           <w:t>Scatter Plot of Individual Random Effects for Vc/F versus Continuous Covariates for Final Model</w:t>
         </w:r>
         <w:r>
@@ -9121,6 +9333,24 @@
               <w:rPr>
                 <w:vanish/>
               </w:rPr>
+              <w:t/>
+            </w:r>
+            <w:r>
+              <w:rPr>
+                <w:vanish/>
+              </w:rPr>
+              <w:t/>
+            </w:r>
+            <w:r>
+              <w:rPr>
+                <w:vanish/>
+              </w:rPr>
+              <w:t/>
+            </w:r>
+            <w:r>
+              <w:rPr>
+                <w:vanish/>
+              </w:rPr>
               <w:t>[[INLINE_ID:inl_title_of_mar]]</w:t>
             </w:r>
           </w:p>
@@ -9166,13 +9396,7 @@
         <w:rPr>
           <w:lang w:val="en-US"/>
         </w:rPr>
-        <w:t>has</w:t>
-      </w:r>
-      <w:r>
-        <w:rPr>
-          <w:lang w:val="en-US"/>
-        </w:rPr>
-        <w:t xml:space="preserve"> been </w:t>
+        <w:t xml:space="preserve">has been </w:t>
       </w:r>
       <w:r>
         <w:rPr>
@@ -9180,11 +9404,19 @@
         </w:rPr>
         <w:t xml:space="preserve">performed in accordance </w:t>
       </w:r>
+      <w:proofErr w:type="gramStart"/>
       <w:r>
         <w:rPr>
           <w:lang w:val="en-US"/>
         </w:rPr>
-        <w:t xml:space="preserve">to the </w:t>
+        <w:t>to</w:t>
+      </w:r>
+      <w:proofErr w:type="gramEnd"/>
+      <w:r>
+        <w:rPr>
+          <w:lang w:val="en-US"/>
+        </w:rPr>
+        <w:t xml:space="preserve"> the </w:t>
       </w:r>
       <w:r>
         <w:rPr>
@@ -9196,13 +9428,7 @@
         <w:rPr>
           <w:lang w:val="en-US"/>
         </w:rPr>
-        <w:t xml:space="preserve">in the modeling analysis plan </w:t>
-      </w:r>
-      <w:r>
-        <w:rPr>
-          <w:lang w:val="en-US"/>
-        </w:rPr>
-        <w:t>[add reference]</w:t>
+        <w:t>in the modeling analysis plan [add reference]</w:t>
       </w:r>
       <w:r>
         <w:rPr>
@@ -10201,6 +10427,7 @@
             <w:pPr>
               <w:pStyle w:val="TableLeft"/>
             </w:pPr>
+            <w:proofErr w:type="spellStart"/>
             <w:r>
               <w:rPr>
                 <w:lang w:val="en-US"/>
@@ -10214,6 +10441,7 @@
               </w:rPr>
               <w:t>max</w:t>
             </w:r>
+            <w:proofErr w:type="spellEnd"/>
           </w:p>
         </w:tc>
         <w:tc>
@@ -10245,6 +10473,7 @@
             <w:pPr>
               <w:pStyle w:val="TableLeft"/>
             </w:pPr>
+            <w:proofErr w:type="spellStart"/>
             <w:r>
               <w:rPr>
                 <w:lang w:val="en-US"/>
@@ -10258,6 +10487,7 @@
               </w:rPr>
               <w:t>trough</w:t>
             </w:r>
+            <w:proofErr w:type="spellEnd"/>
           </w:p>
         </w:tc>
         <w:tc>
@@ -11042,12 +11272,14 @@
             <w:pPr>
               <w:pStyle w:val="TableLeft"/>
             </w:pPr>
+            <w:proofErr w:type="spellStart"/>
             <w:r>
               <w:rPr>
                 <w:lang w:val="en-US"/>
               </w:rPr>
               <w:t>popPK</w:t>
             </w:r>
+            <w:proofErr w:type="spellEnd"/>
           </w:p>
         </w:tc>
         <w:tc>
@@ -11504,6 +11736,7 @@
             <w:pPr>
               <w:pStyle w:val="TableLeft"/>
             </w:pPr>
+            <w:proofErr w:type="spellStart"/>
             <w:r>
               <w:rPr>
                 <w:lang w:val="en-US"/>
@@ -11517,6 +11750,7 @@
               </w:rPr>
               <w:t>max</w:t>
             </w:r>
+            <w:proofErr w:type="spellEnd"/>
           </w:p>
         </w:tc>
         <w:tc>
@@ -11585,11 +11819,19 @@
             <w:pPr>
               <w:pStyle w:val="TableLeft"/>
             </w:pPr>
+            <w:proofErr w:type="spellStart"/>
             <w:r>
               <w:rPr>
                 <w:lang w:val="en-US"/>
               </w:rPr>
-              <w:t>Vc/F</w:t>
+              <w:t>Vc</w:t>
+            </w:r>
+            <w:proofErr w:type="spellEnd"/>
+            <w:r>
+              <w:rPr>
+                <w:lang w:val="en-US"/>
+              </w:rPr>
+              <w:t>/F</w:t>
             </w:r>
           </w:p>
         </w:tc>
@@ -11622,11 +11864,19 @@
             <w:pPr>
               <w:pStyle w:val="TableLeft"/>
             </w:pPr>
+            <w:proofErr w:type="spellStart"/>
             <w:r>
               <w:rPr>
                 <w:lang w:val="en-US"/>
               </w:rPr>
-              <w:t>Vp/F</w:t>
+              <w:t>Vp</w:t>
+            </w:r>
+            <w:proofErr w:type="spellEnd"/>
+            <w:r>
+              <w:rPr>
+                <w:lang w:val="en-US"/>
+              </w:rPr>
+              <w:t>/F</w:t>
             </w:r>
           </w:p>
         </w:tc>
@@ -11830,42 +12080,23 @@
                 <w:sz w:val="22"/>
                 <w:szCs w:val="22"/>
               </w:rPr>
-              <w:t>The primary audience for this section</w:t>
-            </w:r>
+              <w:t xml:space="preserve">The primary audience for this section </w:t>
+            </w:r>
+            <w:proofErr w:type="gramStart"/>
             <w:r>
               <w:rPr>
                 <w:sz w:val="22"/>
                 <w:szCs w:val="22"/>
               </w:rPr>
-              <w:t xml:space="preserve"> are</w:t>
-            </w:r>
+              <w:t>are</w:t>
+            </w:r>
+            <w:proofErr w:type="gramEnd"/>
             <w:r>
               <w:rPr>
                 <w:sz w:val="22"/>
                 <w:szCs w:val="22"/>
               </w:rPr>
-              <w:t xml:space="preserve"> non-technical reader</w:t>
-            </w:r>
-            <w:r>
-              <w:rPr>
-                <w:sz w:val="22"/>
-                <w:szCs w:val="22"/>
-              </w:rPr>
-              <w:t>s</w:t>
-            </w:r>
-            <w:r>
-              <w:rPr>
-                <w:sz w:val="22"/>
-                <w:szCs w:val="22"/>
-              </w:rPr>
-              <w:t>, stakeholders</w:t>
-            </w:r>
-            <w:r>
-              <w:rPr>
-                <w:sz w:val="22"/>
-                <w:szCs w:val="22"/>
-              </w:rPr>
-              <w:t>, and excerpts from this section may be used in regulatory related summary documents.</w:t>
+              <w:t xml:space="preserve"> non-technical readers, stakeholders, and excerpts from this section may be used in regulatory related summary documents.</w:t>
             </w:r>
           </w:p>
           <w:p>
@@ -11881,14 +12112,7 @@
                 <w:sz w:val="22"/>
                 <w:szCs w:val="22"/>
               </w:rPr>
-              <w:t>Expected Content</w:t>
-            </w:r>
-            <w:r>
-              <w:rPr>
-                <w:sz w:val="22"/>
-                <w:szCs w:val="22"/>
-              </w:rPr>
-              <w:t>:</w:t>
+              <w:t>Expected Content:</w:t>
             </w:r>
           </w:p>
           <w:p>
@@ -11952,21 +12176,7 @@
                 <w:sz w:val="22"/>
                 <w:szCs w:val="22"/>
               </w:rPr>
-              <w:t>Results presented as their effect on clinically relevant drug exposures</w:t>
-            </w:r>
-            <w:r>
-              <w:rPr>
-                <w:sz w:val="22"/>
-                <w:szCs w:val="22"/>
-              </w:rPr>
-              <w:t xml:space="preserve"> or endpoints</w:t>
-            </w:r>
-            <w:r>
-              <w:rPr>
-                <w:sz w:val="22"/>
-                <w:szCs w:val="22"/>
-              </w:rPr>
-              <w:t xml:space="preserve">, </w:t>
+              <w:t xml:space="preserve">Results presented as their effect on clinically relevant drug exposures or endpoints, </w:t>
             </w:r>
             <w:r>
               <w:rPr>
@@ -11998,103 +12208,19 @@
                 <w:sz w:val="22"/>
                 <w:szCs w:val="22"/>
               </w:rPr>
-              <w:t>Model details such as s</w:t>
-            </w:r>
+              <w:t>Model details such as structure or covariates should be avoided, or kept to a minimum if important for communicating conclusions</w:t>
+            </w:r>
+          </w:p>
+          <w:p>
+            <w:pPr>
+              <w:pStyle w:val="ListBullet"/>
+            </w:pPr>
             <w:r>
               <w:rPr>
                 <w:sz w:val="22"/>
                 <w:szCs w:val="22"/>
               </w:rPr>
-              <w:t>tructu</w:t>
-            </w:r>
-            <w:r>
-              <w:rPr>
-                <w:sz w:val="22"/>
-                <w:szCs w:val="22"/>
-              </w:rPr>
-              <w:t>re or covariates should be avoided</w:t>
-            </w:r>
-            <w:r>
-              <w:rPr>
-                <w:sz w:val="22"/>
-                <w:szCs w:val="22"/>
-              </w:rPr>
-              <w:t>,</w:t>
-            </w:r>
-            <w:r>
-              <w:rPr>
-                <w:sz w:val="22"/>
-                <w:szCs w:val="22"/>
-              </w:rPr>
-              <w:t xml:space="preserve"> </w:t>
-            </w:r>
-            <w:r>
-              <w:rPr>
-                <w:sz w:val="22"/>
-                <w:szCs w:val="22"/>
-              </w:rPr>
-              <w:t>or kept to a minimum if</w:t>
-            </w:r>
-            <w:r>
-              <w:rPr>
-                <w:sz w:val="22"/>
-                <w:szCs w:val="22"/>
-              </w:rPr>
-              <w:t xml:space="preserve"> important f</w:t>
-            </w:r>
-            <w:r>
-              <w:rPr>
-                <w:sz w:val="22"/>
-                <w:szCs w:val="22"/>
-              </w:rPr>
-              <w:t>or communicating conclusions</w:t>
-            </w:r>
-          </w:p>
-          <w:p>
-            <w:pPr>
-              <w:pStyle w:val="ListBullet"/>
-            </w:pPr>
-            <w:r>
-              <w:rPr>
-                <w:sz w:val="22"/>
-                <w:szCs w:val="22"/>
-              </w:rPr>
-              <w:t>Visual presentations of relevant</w:t>
-            </w:r>
-            <w:r>
-              <w:rPr>
-                <w:sz w:val="22"/>
-                <w:szCs w:val="22"/>
-              </w:rPr>
-              <w:t xml:space="preserve"> results</w:t>
-            </w:r>
-            <w:r>
-              <w:rPr>
-                <w:sz w:val="22"/>
-                <w:szCs w:val="22"/>
-              </w:rPr>
-              <w:t xml:space="preserve"> are acceptable</w:t>
-            </w:r>
-            <w:r>
-              <w:rPr>
-                <w:sz w:val="22"/>
-                <w:szCs w:val="22"/>
-              </w:rPr>
-              <w:t xml:space="preserve">, if </w:t>
-            </w:r>
-            <w:r>
-              <w:rPr>
-                <w:sz w:val="22"/>
-                <w:szCs w:val="22"/>
-              </w:rPr>
-              <w:t>key to</w:t>
-            </w:r>
-            <w:r>
-              <w:rPr>
-                <w:sz w:val="22"/>
-                <w:szCs w:val="22"/>
-              </w:rPr>
-              <w:t xml:space="preserve"> decision making</w:t>
+              <w:t>Visual presentations of relevant results are acceptable, if key to decision making</w:t>
             </w:r>
           </w:p>
         </w:tc>
@@ -12223,15 +12349,16 @@
                 <w:szCs w:val="22"/>
                 <w:lang w:val="en-US"/>
               </w:rPr>
-              <w:t xml:space="preserve">Suggest to </w:t>
-            </w:r>
+              <w:t xml:space="preserve">Suggest </w:t>
+            </w:r>
+            <w:proofErr w:type="gramStart"/>
             <w:r>
               <w:rPr>
                 <w:sz w:val="22"/>
                 <w:szCs w:val="22"/>
                 <w:lang w:val="en-US"/>
               </w:rPr>
-              <w:t xml:space="preserve">use the same text as in the </w:t>
+              <w:t xml:space="preserve">to </w:t>
             </w:r>
             <w:r>
               <w:rPr>
@@ -12239,7 +12366,16 @@
                 <w:szCs w:val="22"/>
                 <w:lang w:val="en-US"/>
               </w:rPr>
-              <w:t>MAP</w:t>
+              <w:t>use</w:t>
+            </w:r>
+            <w:proofErr w:type="gramEnd"/>
+            <w:r>
+              <w:rPr>
+                <w:sz w:val="22"/>
+                <w:szCs w:val="22"/>
+                <w:lang w:val="en-US"/>
+              </w:rPr>
+              <w:t xml:space="preserve"> the same text as in the MAP</w:t>
             </w:r>
             <w:r>
               <w:rPr>
@@ -12385,7 +12521,25 @@
                 <w:iCs/>
                 <w:lang w:val="en-US"/>
               </w:rPr>
-              <w:t>If developing a joint popPK E-R MAP, please include efficacy/safety objectives here as well.</w:t>
+              <w:t xml:space="preserve">If developing a joint </w:t>
+            </w:r>
+            <w:proofErr w:type="spellStart"/>
+            <w:r>
+              <w:rPr>
+                <w:i/>
+                <w:iCs/>
+                <w:lang w:val="en-US"/>
+              </w:rPr>
+              <w:t>popPK</w:t>
+            </w:r>
+            <w:proofErr w:type="spellEnd"/>
+            <w:r>
+              <w:rPr>
+                <w:i/>
+                <w:iCs/>
+                <w:lang w:val="en-US"/>
+              </w:rPr>
+              <w:t xml:space="preserve"> E-R MAP, please include efficacy/safety objectives here as well.</w:t>
             </w:r>
           </w:p>
         </w:tc>
@@ -12416,10 +12570,7 @@
         <w:t xml:space="preserve">the Analysis </w:t>
       </w:r>
       <w:r>
-        <w:t>D</w:t>
-      </w:r>
-      <w:r>
-        <w:t>ata</w:t>
+        <w:t>Data</w:t>
       </w:r>
       <w:bookmarkEnd w:id="34"/>
       <w:bookmarkEnd w:id="35"/>
@@ -12547,7 +12698,25 @@
                 <w:szCs w:val="22"/>
                 <w:lang w:val="en-US"/>
               </w:rPr>
-              <w:t>Essential information include description of studies, population/design, samples/participant(range), and sampling design information.</w:t>
+              <w:t xml:space="preserve">Essential information </w:t>
+            </w:r>
+            <w:proofErr w:type="gramStart"/>
+            <w:r>
+              <w:rPr>
+                <w:sz w:val="22"/>
+                <w:szCs w:val="22"/>
+                <w:lang w:val="en-US"/>
+              </w:rPr>
+              <w:t>include</w:t>
+            </w:r>
+            <w:proofErr w:type="gramEnd"/>
+            <w:r>
+              <w:rPr>
+                <w:sz w:val="22"/>
+                <w:szCs w:val="22"/>
+                <w:lang w:val="en-US"/>
+              </w:rPr>
+              <w:t xml:space="preserve"> description of studies, population/design, samples/participant(range), and sampling design information.</w:t>
             </w:r>
           </w:p>
           <w:p>
@@ -12576,7 +12745,25 @@
                 <w:iCs/>
                 <w:lang w:val="en-US"/>
               </w:rPr>
-              <w:t>If developing a joint popPK E-R MAP, please add a separate table for E/S data (if different from PK).</w:t>
+              <w:t xml:space="preserve">If developing a joint </w:t>
+            </w:r>
+            <w:proofErr w:type="spellStart"/>
+            <w:r>
+              <w:rPr>
+                <w:i/>
+                <w:iCs/>
+                <w:lang w:val="en-US"/>
+              </w:rPr>
+              <w:t>popPK</w:t>
+            </w:r>
+            <w:proofErr w:type="spellEnd"/>
+            <w:r>
+              <w:rPr>
+                <w:i/>
+                <w:iCs/>
+                <w:lang w:val="en-US"/>
+              </w:rPr>
+              <w:t xml:space="preserve"> E-R MAP, please add a separate table for E/S data (if different from PK).</w:t>
             </w:r>
           </w:p>
         </w:tc>
@@ -12912,12 +13099,21 @@
                 <w:lang w:val="en-US"/>
               </w:rPr>
             </w:pPr>
+            <w:proofErr w:type="spellStart"/>
             <w:r>
               <w:rPr>
                 <w:highlight w:val="cyan"/>
                 <w:lang w:val="en-US"/>
               </w:rPr>
-              <w:t xml:space="preserve">DxxxCxxxxx </w:t>
+              <w:t>DxxxCxxxxx</w:t>
+            </w:r>
+            <w:proofErr w:type="spellEnd"/>
+            <w:r>
+              <w:rPr>
+                <w:highlight w:val="cyan"/>
+                <w:lang w:val="en-US"/>
+              </w:rPr>
+              <w:t xml:space="preserve"> </w:t>
             </w:r>
             <w:r>
               <w:rPr>
@@ -12947,8 +13143,17 @@
                 <w:highlight w:val="cyan"/>
                 <w:lang w:val="en-US"/>
               </w:rPr>
-              <w:t>DCO: dd/mm/yyyy</w:t>
-            </w:r>
+              <w:t>DCO: dd/mm/</w:t>
+            </w:r>
+            <w:proofErr w:type="spellStart"/>
+            <w:r>
+              <w:rPr>
+                <w:highlight w:val="cyan"/>
+                <w:lang w:val="en-US"/>
+              </w:rPr>
+              <w:t>yyyy</w:t>
+            </w:r>
+            <w:proofErr w:type="spellEnd"/>
           </w:p>
         </w:tc>
         <w:tc>
@@ -13073,6 +13278,7 @@
                 <w:lang w:val="en-US"/>
               </w:rPr>
             </w:pPr>
+            <w:proofErr w:type="spellStart"/>
             <w:r>
               <w:rPr>
                 <w:highlight w:val="cyan"/>
@@ -13080,6 +13286,7 @@
               </w:rPr>
               <w:t>DxxxCxxxxx</w:t>
             </w:r>
+            <w:proofErr w:type="spellEnd"/>
             <w:r>
               <w:rPr>
                 <w:highlight w:val="cyan"/>
@@ -13108,8 +13315,17 @@
                 <w:highlight w:val="cyan"/>
                 <w:lang w:val="en-US"/>
               </w:rPr>
-              <w:t>DCO: dd/mm/yyyy</w:t>
-            </w:r>
+              <w:t>DCO: dd/mm/</w:t>
+            </w:r>
+            <w:proofErr w:type="spellStart"/>
+            <w:r>
+              <w:rPr>
+                <w:highlight w:val="cyan"/>
+                <w:lang w:val="en-US"/>
+              </w:rPr>
+              <w:t>yyyy</w:t>
+            </w:r>
+            <w:proofErr w:type="spellEnd"/>
           </w:p>
         </w:tc>
         <w:tc>
@@ -13189,6 +13405,7 @@
                 <w:lang w:val="en-US"/>
               </w:rPr>
             </w:pPr>
+            <w:proofErr w:type="spellStart"/>
             <w:r>
               <w:rPr>
                 <w:highlight w:val="cyan"/>
@@ -13204,6 +13421,7 @@
               </w:rPr>
               <w:t>total</w:t>
             </w:r>
+            <w:proofErr w:type="spellEnd"/>
             <w:r>
               <w:rPr>
                 <w:highlight w:val="cyan"/>
@@ -13302,6 +13520,24 @@
                 <w:lang w:val="en-US"/>
               </w:rPr>
               <w:t>{{add any additional studies}}</w:t>
+            </w:r>
+            <w:r>
+              <w:rPr>
+                <w:vanish/>
+              </w:rPr>
+              <w:t/>
+            </w:r>
+            <w:r>
+              <w:rPr>
+                <w:vanish/>
+              </w:rPr>
+              <w:t/>
+            </w:r>
+            <w:r>
+              <w:rPr>
+                <w:vanish/>
+              </w:rPr>
+              <w:t/>
             </w:r>
             <w:r>
               <w:rPr>
@@ -13549,19 +13785,7 @@
         <w:t xml:space="preserve">and </w:t>
       </w:r>
       <w:r>
-        <w:t xml:space="preserve">Source </w:t>
-      </w:r>
-      <w:r>
-        <w:t>D</w:t>
-      </w:r>
-      <w:r>
-        <w:t xml:space="preserve">ata </w:t>
-      </w:r>
-      <w:r>
-        <w:t>F</w:t>
-      </w:r>
-      <w:r>
-        <w:t>ile</w:t>
+        <w:t>Source Data File</w:t>
       </w:r>
       <w:bookmarkEnd w:id="42"/>
       <w:bookmarkEnd w:id="43"/>
@@ -13581,13 +13805,7 @@
         <w:t>{{ name of source data file }}</w:t>
       </w:r>
       <w:r>
-        <w:t xml:space="preserve"> was prepared according to </w:t>
-      </w:r>
-      <w:r>
-        <w:t>AZ Clinical Data Standards</w:t>
-      </w:r>
-      <w:r>
-        <w:t xml:space="preserve">. </w:t>
+        <w:t xml:space="preserve"> was prepared according to AZ Clinical Data Standards. </w:t>
       </w:r>
       <w:r>
         <w:rPr>
@@ -13647,22 +13865,7 @@
         <w:t xml:space="preserve"> </w:t>
       </w:r>
       <w:r>
-        <w:t xml:space="preserve">The dataset </w:t>
-      </w:r>
-      <w:r>
-        <w:t>is</w:t>
-      </w:r>
-      <w:r>
-        <w:t xml:space="preserve"> described in </w:t>
-      </w:r>
-      <w:r>
-        <w:t>the</w:t>
-      </w:r>
-      <w:r>
-        <w:t xml:space="preserve"> </w:t>
-      </w:r>
-      <w:r>
-        <w:t>Pharmacometrics Data Specification</w:t>
+        <w:t>The dataset is described in the Pharmacometrics Data Specification</w:t>
       </w:r>
       <w:r>
         <w:t xml:space="preserve"> (</w:t>
@@ -13697,19 +13900,7 @@
       <w:bookmarkStart w:id="47" w:name="_Toc57021180"/>
       <w:bookmarkStart w:id="48" w:name="_Toc224140064"/>
       <w:r>
-        <w:t xml:space="preserve">Derived </w:t>
-      </w:r>
-      <w:r>
-        <w:t>A</w:t>
-      </w:r>
-      <w:r>
-        <w:t xml:space="preserve">nalysis </w:t>
-      </w:r>
-      <w:r>
-        <w:t>D</w:t>
-      </w:r>
-      <w:r>
-        <w:t>ataset</w:t>
+        <w:t>Derived Analysis Dataset</w:t>
       </w:r>
       <w:bookmarkEnd w:id="46"/>
       <w:bookmarkEnd w:id="47"/>
@@ -13781,56 +13972,7 @@
                 <w:sz w:val="22"/>
                 <w:szCs w:val="22"/>
               </w:rPr>
-              <w:t xml:space="preserve"> description of any </w:t>
-            </w:r>
-            <w:r>
-              <w:rPr>
-                <w:sz w:val="22"/>
-                <w:szCs w:val="22"/>
-              </w:rPr>
-              <w:t>transformations</w:t>
-            </w:r>
-            <w:r>
-              <w:rPr>
-                <w:sz w:val="22"/>
-                <w:szCs w:val="22"/>
-              </w:rPr>
-              <w:t xml:space="preserve"> performed on the source data file</w:t>
-            </w:r>
-            <w:r>
-              <w:rPr>
-                <w:sz w:val="22"/>
-                <w:szCs w:val="22"/>
-              </w:rPr>
-              <w:t>, if any,</w:t>
-            </w:r>
-            <w:r>
-              <w:rPr>
-                <w:sz w:val="22"/>
-                <w:szCs w:val="22"/>
-              </w:rPr>
-              <w:t xml:space="preserve"> to arrive at the modelling dataset (e.g., binning of a continuous covariate into categories, log</w:t>
-            </w:r>
-            <w:r>
-              <w:rPr>
-                <w:sz w:val="22"/>
-                <w:szCs w:val="22"/>
-              </w:rPr>
-              <w:t>arithmic</w:t>
-            </w:r>
-            <w:r>
-              <w:rPr>
-                <w:sz w:val="22"/>
-                <w:szCs w:val="22"/>
-              </w:rPr>
-              <w:t xml:space="preserve"> (or other) transformation, </w:t>
-            </w:r>
-            <w:r>
-              <w:rPr>
-                <w:sz w:val="22"/>
-                <w:szCs w:val="22"/>
-              </w:rPr>
-              <w:t>new variables, imputation, etc.)</w:t>
+              <w:t xml:space="preserve"> description of any transformations performed on the source data file, if any, to arrive at the modelling dataset (e.g., binning of a continuous covariate into categories, logarithmic (or other) transformation, new variables, imputation, etc.)</w:t>
             </w:r>
           </w:p>
         </w:tc>
@@ -13951,21 +14093,7 @@
                 <w:sz w:val="22"/>
                 <w:szCs w:val="22"/>
               </w:rPr>
-              <w:t xml:space="preserve">Provide listings of specific data points removed from the dataset (pre-modelling), </w:t>
-            </w:r>
-            <w:r>
-              <w:rPr>
-                <w:sz w:val="22"/>
-                <w:szCs w:val="22"/>
-              </w:rPr>
-              <w:t>and</w:t>
-            </w:r>
-            <w:r>
-              <w:rPr>
-                <w:sz w:val="22"/>
-                <w:szCs w:val="22"/>
-              </w:rPr>
-              <w:t xml:space="preserve"> the reason for omission in </w:t>
+              <w:t xml:space="preserve">Provide listings of specific data points removed from the dataset (pre-modelling), and the reason for omission in </w:t>
             </w:r>
             <w:r>
               <w:rPr>
@@ -13999,13 +14127,7 @@
         <w:t xml:space="preserve"> </w:t>
       </w:r>
       <w:r>
-        <w:t xml:space="preserve">missing or erroneous data was </w:t>
-      </w:r>
-      <w:r>
-        <w:t>performed as outlined in the MAP</w:t>
-      </w:r>
-      <w:r>
-        <w:t xml:space="preserve">. </w:t>
+        <w:t xml:space="preserve">missing or erroneous data was performed as outlined in the MAP. </w:t>
       </w:r>
     </w:p>
     <w:p>
@@ -14165,14 +14287,7 @@
                 <w:sz w:val="22"/>
                 <w:szCs w:val="22"/>
               </w:rPr>
-              <w:t>Add description and justification of used LLOQ handling.</w:t>
-            </w:r>
-            <w:r>
-              <w:rPr>
-                <w:sz w:val="22"/>
-                <w:szCs w:val="22"/>
-              </w:rPr>
-              <w:t xml:space="preserve"> </w:t>
+              <w:t xml:space="preserve">Add description and justification of used LLOQ handling. </w:t>
             </w:r>
             <w:r>
               <w:rPr>
@@ -14180,12 +14295,6 @@
                 <w:szCs w:val="22"/>
               </w:rPr>
               <w:br/>
-            </w:r>
-            <w:r>
-              <w:rPr>
-                <w:sz w:val="22"/>
-                <w:szCs w:val="22"/>
-              </w:rPr>
               <w:t xml:space="preserve">(MAP states: </w:t>
             </w:r>
             <w:r>
@@ -14234,6 +14343,24 @@
           <w:lang w:val="en-US"/>
         </w:rPr>
         <w:t>{{add selected strategy and justification}}</w:t>
+      </w:r>
+      <w:r>
+        <w:rPr>
+          <w:vanish/>
+        </w:rPr>
+        <w:t/>
+      </w:r>
+      <w:r>
+        <w:rPr>
+          <w:vanish/>
+        </w:rPr>
+        <w:t/>
+      </w:r>
+      <w:r>
+        <w:rPr>
+          <w:vanish/>
+        </w:rPr>
+        <w:t/>
       </w:r>
       <w:r>
         <w:rPr>
@@ -14363,10 +14490,7 @@
         <w:pStyle w:val="Paragraph"/>
       </w:pPr>
       <w:r>
-        <w:t xml:space="preserve">Handling of </w:t>
-      </w:r>
-      <w:r>
-        <w:t xml:space="preserve">outliers </w:t>
+        <w:t xml:space="preserve">Handling of outliers </w:t>
       </w:r>
       <w:r>
         <w:t>w</w:t>
@@ -14394,6 +14518,24 @@
           <w:lang w:val="en-US"/>
         </w:rPr>
         <w:t>{{Add specific considerations/strategies used}}</w:t>
+      </w:r>
+      <w:r>
+        <w:rPr>
+          <w:vanish/>
+        </w:rPr>
+        <w:t/>
+      </w:r>
+      <w:r>
+        <w:rPr>
+          <w:vanish/>
+        </w:rPr>
+        <w:t/>
+      </w:r>
+      <w:r>
+        <w:rPr>
+          <w:vanish/>
+        </w:rPr>
+        <w:t/>
       </w:r>
       <w:r>
         <w:rPr>
@@ -14567,13 +14709,7 @@
         <w:pStyle w:val="Paragraph"/>
       </w:pPr>
       <w:r>
-        <w:t xml:space="preserve">Handling of </w:t>
-      </w:r>
-      <w:r>
-        <w:t>covariates</w:t>
-      </w:r>
-      <w:r>
-        <w:t xml:space="preserve"> </w:t>
+        <w:t xml:space="preserve">Handling of covariates </w:t>
       </w:r>
       <w:r>
         <w:t>w</w:t>
@@ -14807,6 +14943,24 @@
           <w:highlight w:val="cyan"/>
         </w:rPr>
         <w:t>).</w:t>
+      </w:r>
+      <w:r>
+        <w:rPr>
+          <w:vanish/>
+        </w:rPr>
+        <w:t/>
+      </w:r>
+      <w:r>
+        <w:rPr>
+          <w:vanish/>
+        </w:rPr>
+        <w:t/>
+      </w:r>
+      <w:r>
+        <w:rPr>
+          <w:vanish/>
+        </w:rPr>
+        <w:t/>
       </w:r>
       <w:r>
         <w:rPr>
@@ -14901,127 +15055,7 @@
                 <w:szCs w:val="22"/>
                 <w:lang w:val="en-US"/>
               </w:rPr>
-              <w:t xml:space="preserve">For </w:t>
-            </w:r>
-            <w:r>
-              <w:rPr>
-                <w:sz w:val="22"/>
-                <w:szCs w:val="22"/>
-                <w:lang w:val="en-US"/>
-              </w:rPr>
-              <w:t xml:space="preserve">all subsections across </w:t>
-            </w:r>
-            <w:r>
-              <w:rPr>
-                <w:sz w:val="22"/>
-                <w:szCs w:val="22"/>
-                <w:lang w:val="en-US"/>
-              </w:rPr>
-              <w:t xml:space="preserve">methods, </w:t>
-            </w:r>
-            <w:r>
-              <w:rPr>
-                <w:sz w:val="22"/>
-                <w:szCs w:val="22"/>
-                <w:lang w:val="en-US"/>
-              </w:rPr>
-              <w:t xml:space="preserve">please copy paste relevant </w:t>
-            </w:r>
-            <w:r>
-              <w:rPr>
-                <w:sz w:val="22"/>
-                <w:szCs w:val="22"/>
-                <w:lang w:val="en-US"/>
-              </w:rPr>
-              <w:t>text from the MAP.</w:t>
-            </w:r>
-            <w:r>
-              <w:rPr>
-                <w:sz w:val="22"/>
-                <w:szCs w:val="22"/>
-                <w:lang w:val="en-US"/>
-              </w:rPr>
-              <w:t xml:space="preserve"> Make changes as necessary</w:t>
-            </w:r>
-            <w:r>
-              <w:rPr>
-                <w:sz w:val="22"/>
-                <w:szCs w:val="22"/>
-                <w:lang w:val="en-US"/>
-              </w:rPr>
-              <w:t xml:space="preserve"> and detail which option that was used if several are provided in </w:t>
-            </w:r>
-            <w:r>
-              <w:rPr>
-                <w:sz w:val="22"/>
-                <w:szCs w:val="22"/>
-                <w:lang w:val="en-US"/>
-              </w:rPr>
-              <w:t>the MAP</w:t>
-            </w:r>
-            <w:r>
-              <w:rPr>
-                <w:sz w:val="22"/>
-                <w:szCs w:val="22"/>
-                <w:lang w:val="en-US"/>
-              </w:rPr>
-              <w:t xml:space="preserve"> (e.g. </w:t>
-            </w:r>
-            <w:r>
-              <w:rPr>
-                <w:sz w:val="22"/>
-                <w:szCs w:val="22"/>
-                <w:lang w:val="en-US"/>
-              </w:rPr>
-              <w:t xml:space="preserve">specify </w:t>
-            </w:r>
-            <w:r>
-              <w:rPr>
-                <w:sz w:val="22"/>
-                <w:szCs w:val="22"/>
-                <w:lang w:val="en-US"/>
-              </w:rPr>
-              <w:t xml:space="preserve">transformations </w:t>
-            </w:r>
-            <w:r>
-              <w:rPr>
-                <w:sz w:val="22"/>
-                <w:szCs w:val="22"/>
-                <w:lang w:val="en-US"/>
-              </w:rPr>
-              <w:t>made and provide relevant</w:t>
-            </w:r>
-            <w:r>
-              <w:rPr>
-                <w:sz w:val="22"/>
-                <w:szCs w:val="22"/>
-                <w:lang w:val="en-US"/>
-              </w:rPr>
-              <w:t xml:space="preserve"> </w:t>
-            </w:r>
-            <w:r>
-              <w:rPr>
-                <w:sz w:val="22"/>
-                <w:szCs w:val="22"/>
-                <w:lang w:val="en-US"/>
-              </w:rPr>
-              <w:t>functional forms</w:t>
-            </w:r>
-            <w:r>
-              <w:rPr>
-                <w:sz w:val="22"/>
-                <w:szCs w:val="22"/>
-                <w:lang w:val="en-US"/>
-              </w:rPr>
-              <w:t>)</w:t>
-            </w:r>
-            <w:r>
-              <w:rPr>
-                <w:sz w:val="22"/>
-                <w:szCs w:val="22"/>
-                <w:lang w:val="en-US"/>
-              </w:rPr>
-              <w:t xml:space="preserve">. </w:t>
+              <w:t xml:space="preserve">For all subsections across methods, please copy paste relevant text from the MAP. Make changes as necessary and detail which option that was used if several are provided in the MAP (e.g. specify transformations made and provide relevant functional forms). </w:t>
             </w:r>
             <w:r>
               <w:rPr>
@@ -15039,17 +15073,7 @@
                 <w:szCs w:val="22"/>
                 <w:lang w:val="en-US"/>
               </w:rPr>
-              <w:t>Please remember</w:t>
-            </w:r>
-            <w:r>
-              <w:rPr>
-                <w:i/>
-                <w:iCs/>
-                <w:sz w:val="22"/>
-                <w:szCs w:val="22"/>
-                <w:lang w:val="en-US"/>
-              </w:rPr>
-              <w:t xml:space="preserve"> to change to past tense where relevant.</w:t>
+              <w:t>Please remember to change to past tense where relevant.</w:t>
             </w:r>
           </w:p>
         </w:tc>
@@ -15429,8 +15453,27 @@
       <w:r>
         <w:rPr>
           <w:b/>
+          <w:color w:val="FF0000" val="FF0000"/>
         </w:rPr>
-        <w:t>&lt;&lt;Name:model run summary|Title:Model run summary table|Footnote:Summary of key model run outputs.|Files:106-pk-params.docx|Type:table&gt;&gt;</w:t>
+        <w:t>&lt;&lt;Name:model run summary|Title:Sachin Patel|Footnote:MISSING_VALUE(Footnote)|Files:106-pk-params.docx|Type:table&gt;&gt;</w:t>
+      </w:r>
+      <w:r>
+        <w:rPr>
+          <w:vanish/>
+        </w:rPr>
+        <w:t/>
+      </w:r>
+      <w:r>
+        <w:rPr>
+          <w:vanish/>
+        </w:rPr>
+        <w:t/>
+      </w:r>
+      <w:r>
+        <w:rPr>
+          <w:vanish/>
+        </w:rPr>
+        <w:t/>
       </w:r>
       <w:r>
         <w:rPr>
@@ -15467,6 +15510,11 @@
         </w:rPr>
         <w:t/>
       </w:r>
+    </w:p>
+    <w:p>
+      <w:pPr>
+        <w:pStyle w:val="Paragraph"/>
+      </w:pPr>
     </w:p>
     <w:p>
       <w:pPr>
@@ -15502,15 +15550,28 @@
       </w:r>
       <w:r>
         <w:rPr>
+          <w:b/>
+          <w:color w:val="FF0000" val="FF0000"/>
+        </w:rPr>
+        <w:t>&lt;&lt;Name:model bootstrap plot|Title:Bootstrap diagnostic plot|Footnote:MISSING_VALUE(Footnote)|Files:106-bootstrap.png|Type:image&gt;&gt;</w:t>
+      </w:r>
+      <w:r>
+        <w:rPr>
           <w:vanish/>
         </w:rPr>
         <w:t/>
       </w:r>
       <w:r>
         <w:rPr>
-          <w:b/>
+          <w:vanish/>
         </w:rPr>
-        <w:t>&lt;&lt;Name:model bootstrap plot|Title:Bootstrap diagnostic plot|Footnote:Bootstrap plot for final model assessment.|Files:106-bootstrap.png|Type:image&gt;&gt;</w:t>
+        <w:t/>
+      </w:r>
+      <w:r>
+        <w:rPr>
+          <w:vanish/>
+        </w:rPr>
+        <w:t/>
       </w:r>
       <w:r>
         <w:rPr>
@@ -15563,6 +15624,16 @@
         </w:rPr>
         <w:t/>
       </w:r>
+    </w:p>
+    <w:p>
+      <w:pPr>
+        <w:jc w:val="center"/>
+      </w:pPr>
+    </w:p>
+    <w:p>
+      <w:pPr>
+        <w:pStyle w:val="Paragraph"/>
+      </w:pPr>
     </w:p>
     <w:p>
       <w:pPr>
@@ -15639,39 +15710,7 @@
                 <w:szCs w:val="22"/>
                 <w:lang w:val="en-US"/>
               </w:rPr>
-              <w:t xml:space="preserve">For this subsection, </w:t>
-            </w:r>
-            <w:r>
-              <w:rPr>
-                <w:sz w:val="22"/>
-                <w:szCs w:val="22"/>
-                <w:lang w:val="en-US"/>
-              </w:rPr>
-              <w:t>please refer to the MAP.</w:t>
-            </w:r>
-            <w:r>
-              <w:rPr>
-                <w:sz w:val="22"/>
-                <w:szCs w:val="22"/>
-                <w:lang w:val="en-US"/>
-              </w:rPr>
-              <w:t xml:space="preserve"> Add any relevant </w:t>
-            </w:r>
-            <w:r>
-              <w:rPr>
-                <w:sz w:val="22"/>
-                <w:szCs w:val="22"/>
-                <w:lang w:val="en-US"/>
-              </w:rPr>
-              <w:t>additional information, e.g. number of simulations/samples used in the VPCs and bootstraps</w:t>
-            </w:r>
-            <w:r>
-              <w:rPr>
-                <w:sz w:val="22"/>
-                <w:szCs w:val="22"/>
-                <w:lang w:val="en-US"/>
-              </w:rPr>
-              <w:t>.</w:t>
+              <w:t>For this subsection, please refer to the MAP. Add any relevant additional information, e.g. number of simulations/samples used in the VPCs and bootstraps.</w:t>
             </w:r>
             <w:r>
               <w:rPr>
@@ -15700,16 +15739,7 @@
         <w:pStyle w:val="Paragraph"/>
       </w:pPr>
       <w:r>
-        <w:t xml:space="preserve">Model evaluation was </w:t>
-      </w:r>
-      <w:r>
-        <w:t>performed</w:t>
-      </w:r>
-      <w:r>
-        <w:t xml:space="preserve"> a</w:t>
-      </w:r>
-      <w:r>
-        <w:t>s outlined in the MAP.</w:t>
+        <w:t>Model evaluation was performed as outlined in the MAP.</w:t>
       </w:r>
       <w:bookmarkStart w:id="74" w:name="_Toc422332972"/>
       <w:bookmarkStart w:id="75" w:name="_Toc57021203"/>
@@ -15758,16 +15788,7 @@
         <w:t xml:space="preserve">Hardware and </w:t>
       </w:r>
       <w:r>
-        <w:t>S</w:t>
-      </w:r>
-      <w:r>
-        <w:t xml:space="preserve">oftware </w:t>
-      </w:r>
-      <w:r>
-        <w:t>D</w:t>
-      </w:r>
-      <w:r>
-        <w:t>etails</w:t>
+        <w:t>Software Details</w:t>
       </w:r>
       <w:bookmarkEnd w:id="79"/>
       <w:bookmarkEnd w:id="80"/>
@@ -15793,8 +15814,27 @@
       <w:r>
         <w:rPr>
           <w:b/>
+          <w:color w:val="FF0000" val="FF0000"/>
         </w:rPr>
-        <w:t>&lt;&lt;Name:categorical covariate summary |Title:Categorical covariate summary|Footnote:Categorical covariate distribution by study.|Files:cat-cov-sum-study.docx|Type:table&gt;&gt;</w:t>
+        <w:t>&lt;&lt;Name:categorical covariate summary |Title:MISSING_VALUE(Title)|Footnote:MISSING_VALUE(Footnote)|Files:cat-cov-sum-study.docx|Type:table&gt;&gt;</w:t>
+      </w:r>
+      <w:r>
+        <w:rPr>
+          <w:vanish/>
+        </w:rPr>
+        <w:t/>
+      </w:r>
+      <w:r>
+        <w:rPr>
+          <w:vanish/>
+        </w:rPr>
+        <w:t/>
+      </w:r>
+      <w:r>
+        <w:rPr>
+          <w:vanish/>
+        </w:rPr>
+        <w:t/>
       </w:r>
       <w:r>
         <w:rPr>
@@ -15821,6 +15861,7 @@
       </w:r>
       <w:r>
         <w:rPr>
+          <w:color w:val="FF0000"/>
           <w:sz w:val="20"/>
         </w:rPr>
         <w:t/>
@@ -15831,28 +15872,18 @@
         </w:rPr>
         <w:t/>
       </w:r>
+    </w:p>
+    <w:p>
+      <w:pPr>
+        <w:pStyle w:val="Paragraph"/>
+      </w:pPr>
     </w:p>
     <w:p>
       <w:pPr>
         <w:pStyle w:val="Heading2"/>
       </w:pPr>
       <w:r>
-        <w:t>Deviations from</w:t>
-      </w:r>
-      <w:r>
-        <w:t xml:space="preserve"> </w:t>
-      </w:r>
-      <w:r>
-        <w:t>A</w:t>
-      </w:r>
-      <w:r>
-        <w:t xml:space="preserve">nalysis </w:t>
-      </w:r>
-      <w:r>
-        <w:t>P</w:t>
-      </w:r>
-      <w:r>
-        <w:t>lan</w:t>
+        <w:t>Deviations from Analysis Plan</w:t>
       </w:r>
       <w:bookmarkEnd w:id="82"/>
       <w:bookmarkEnd w:id="83"/>
@@ -15908,49 +15939,7 @@
                 <w:sz w:val="22"/>
                 <w:szCs w:val="22"/>
               </w:rPr>
-              <w:t>This section describes</w:t>
-            </w:r>
-            <w:r>
-              <w:rPr>
-                <w:sz w:val="22"/>
-                <w:szCs w:val="22"/>
-              </w:rPr>
-              <w:t xml:space="preserve"> and explains rationale for</w:t>
-            </w:r>
-            <w:r>
-              <w:rPr>
-                <w:sz w:val="22"/>
-                <w:szCs w:val="22"/>
-              </w:rPr>
-              <w:t xml:space="preserve"> any deviations in the conduct of the analysis from the </w:t>
-            </w:r>
-            <w:r>
-              <w:rPr>
-                <w:sz w:val="22"/>
-                <w:szCs w:val="22"/>
-              </w:rPr>
-              <w:t xml:space="preserve">Model </w:t>
-            </w:r>
-            <w:r>
-              <w:rPr>
-                <w:sz w:val="22"/>
-                <w:szCs w:val="22"/>
-              </w:rPr>
-              <w:t>Analysis Plan</w:t>
-            </w:r>
-            <w:r>
-              <w:rPr>
-                <w:sz w:val="22"/>
-                <w:szCs w:val="22"/>
-              </w:rPr>
-              <w:t>, e.g., changes in response to data review, or challenges in the specified approach</w:t>
-            </w:r>
-            <w:r>
-              <w:rPr>
-                <w:sz w:val="22"/>
-                <w:szCs w:val="22"/>
-              </w:rPr>
-              <w:t>.</w:t>
+              <w:t>This section describes and explains rationale for any deviations in the conduct of the analysis from the Model Analysis Plan, e.g., changes in response to data review, or challenges in the specified approach.</w:t>
             </w:r>
             <w:r>
               <w:t xml:space="preserve"> </w:t>
@@ -15965,6 +15954,24 @@
       </w:pPr>
       <w:r>
         <w:t>{{pa}}</w:t>
+      </w:r>
+      <w:r>
+        <w:rPr>
+          <w:vanish/>
+        </w:rPr>
+        <w:t/>
+      </w:r>
+      <w:r>
+        <w:rPr>
+          <w:vanish/>
+        </w:rPr>
+        <w:t/>
+      </w:r>
+      <w:r>
+        <w:rPr>
+          <w:vanish/>
+        </w:rPr>
+        <w:t/>
       </w:r>
       <w:r>
         <w:rPr>
@@ -16045,14 +16052,7 @@
                 <w:sz w:val="22"/>
                 <w:szCs w:val="22"/>
               </w:rPr>
-              <w:t xml:space="preserve">This section focuses on results from exploration of the data, development of models, and subsequent simulations/inferences. </w:t>
-            </w:r>
-            <w:r>
-              <w:rPr>
-                <w:sz w:val="22"/>
-                <w:szCs w:val="22"/>
-              </w:rPr>
-              <w:t xml:space="preserve">The primary audience for this section: technical reader, reviewers. </w:t>
+              <w:t xml:space="preserve">This section focuses on results from exploration of the data, development of models, and subsequent simulations/inferences. The primary audience for this section: technical reader, reviewers. </w:t>
             </w:r>
           </w:p>
           <w:p>
@@ -16104,110 +16104,19 @@
                 <w:sz w:val="22"/>
                 <w:szCs w:val="22"/>
               </w:rPr>
-              <w:t>D</w:t>
-            </w:r>
+              <w:t>Description, diagnostics and qualification of key models including, but not limited to, the base and final models. The final model, model building steps, qualification, final parameter estimates, and deviations from planned analyses should be clear.</w:t>
+            </w:r>
+          </w:p>
+          <w:p>
+            <w:pPr>
+              <w:pStyle w:val="ListBullet"/>
+            </w:pPr>
             <w:r>
               <w:rPr>
                 <w:sz w:val="22"/>
                 <w:szCs w:val="22"/>
               </w:rPr>
-              <w:t>escription, diagnostics and qualification</w:t>
-            </w:r>
-            <w:r>
-              <w:rPr>
-                <w:sz w:val="22"/>
-                <w:szCs w:val="22"/>
-              </w:rPr>
-              <w:t xml:space="preserve"> of key models including</w:t>
-            </w:r>
-            <w:r>
-              <w:rPr>
-                <w:sz w:val="22"/>
-                <w:szCs w:val="22"/>
-              </w:rPr>
-              <w:t xml:space="preserve">, </w:t>
-            </w:r>
-            <w:r>
-              <w:rPr>
-                <w:sz w:val="22"/>
-                <w:szCs w:val="22"/>
-              </w:rPr>
-              <w:t>but not limited to</w:t>
-            </w:r>
-            <w:r>
-              <w:rPr>
-                <w:sz w:val="22"/>
-                <w:szCs w:val="22"/>
-              </w:rPr>
-              <w:t xml:space="preserve">, </w:t>
-            </w:r>
-            <w:r>
-              <w:rPr>
-                <w:sz w:val="22"/>
-                <w:szCs w:val="22"/>
-              </w:rPr>
-              <w:t xml:space="preserve">the </w:t>
-            </w:r>
-            <w:r>
-              <w:rPr>
-                <w:sz w:val="22"/>
-                <w:szCs w:val="22"/>
-              </w:rPr>
-              <w:t xml:space="preserve">base and </w:t>
-            </w:r>
-            <w:r>
-              <w:rPr>
-                <w:sz w:val="22"/>
-                <w:szCs w:val="22"/>
-              </w:rPr>
-              <w:t>final model</w:t>
-            </w:r>
-            <w:r>
-              <w:rPr>
-                <w:sz w:val="22"/>
-                <w:szCs w:val="22"/>
-              </w:rPr>
-              <w:t>s</w:t>
-            </w:r>
-            <w:r>
-              <w:rPr>
-                <w:sz w:val="22"/>
-                <w:szCs w:val="22"/>
-              </w:rPr>
-              <w:t>.</w:t>
-            </w:r>
-            <w:r>
-              <w:rPr>
-                <w:sz w:val="22"/>
-                <w:szCs w:val="22"/>
-              </w:rPr>
-              <w:t xml:space="preserve"> The final model, model building steps, qualification, final parameter estimates, and deviations from planned analyses should be clear.</w:t>
-            </w:r>
-          </w:p>
-          <w:p>
-            <w:pPr>
-              <w:pStyle w:val="ListBullet"/>
-            </w:pPr>
-            <w:r>
-              <w:rPr>
-                <w:sz w:val="22"/>
-                <w:szCs w:val="22"/>
-              </w:rPr>
-              <w:t xml:space="preserve">Tables and/or figures should be included </w:t>
-            </w:r>
-            <w:r>
-              <w:rPr>
-                <w:sz w:val="22"/>
-                <w:szCs w:val="22"/>
-              </w:rPr>
-              <w:t>as appropriate to explain the course of model development</w:t>
-            </w:r>
-            <w:r>
-              <w:rPr>
-                <w:sz w:val="22"/>
-                <w:szCs w:val="22"/>
-              </w:rPr>
-              <w:t>.</w:t>
+              <w:t>Tables and/or figures should be included as appropriate to explain the course of model development.</w:t>
             </w:r>
           </w:p>
         </w:tc>
@@ -16224,10 +16133,7 @@
       <w:bookmarkStart w:id="92" w:name="_Ref415477062"/>
       <w:bookmarkStart w:id="93" w:name="_Ref415477068"/>
       <w:r>
-        <w:t xml:space="preserve">Summary of Analysis </w:t>
-      </w:r>
-      <w:r>
-        <w:t>Dataset</w:t>
+        <w:t>Summary of Analysis Dataset</w:t>
       </w:r>
       <w:bookmarkEnd w:id="88"/>
       <w:r>
@@ -16398,32 +16304,32 @@
           <w:szCs w:val="22"/>
           <w:highlight w:val="cyan"/>
         </w:rPr>
-        <w:t>{{dose}}</w:t>
+        <w:t>{{Study </w:t>
       </w:r>
       <w:r>
         <w:rPr>
           <w:sz w:val="22"/>
           <w:szCs w:val="22"/>
         </w:rPr>
-        <w:t xml:space="preserve">. </w:t>
+        <w:t xml:space="preserve">an</w:t>
       </w:r>
       <w:r>
         <w:rPr>
           <w:highlight w:val="cyan"/>
         </w:rPr>
-        <w:t xml:space="preserve">Summaries by </w:t>
+        <w:t xml:space="preserve">d Dose}}. Sum</w:t>
       </w:r>
       <w:r>
         <w:rPr>
           <w:highlight w:val="cyan"/>
         </w:rPr>
-        <w:t>{{Study and Dose}}</w:t>
+        <w:t>maries by {{Study </w:t>
       </w:r>
       <w:r>
         <w:rPr>
           <w:highlight w:val="cyan"/>
         </w:rPr>
-        <w:t xml:space="preserve"> are provided in </w:t>
+        <w:t xml:space="preserve">and Dose}} are pr</w:t>
       </w:r>
       <w:r>
         <w:rPr>
@@ -16452,7 +16358,7 @@
         <w:rPr>
           <w:highlight w:val="cyan"/>
         </w:rPr>
-        <w:t>Appendix D</w:t>
+        <w:t>ovided in </w:t>
       </w:r>
       <w:r>
         <w:rPr>
@@ -16464,7 +16370,7 @@
         <w:rPr>
           <w:highlight w:val="cyan"/>
         </w:rPr>
-        <w:t xml:space="preserve">, </w:t>
+        <w:t xml:space="preserve">Ap</w:t>
       </w:r>
       <w:r>
         <w:rPr>
@@ -16490,13 +16396,13 @@
         <w:fldChar w:fldCharType="separate"/>
       </w:r>
       <w:r>
-        <w:t>Table </w:t>
+        <w:t>pendix</w:t>
       </w:r>
       <w:r>
         <w:rPr>
           <w:noProof/>
         </w:rPr>
-        <w:t>D1</w:t>
+        <w:t> D</w:t>
       </w:r>
       <w:r>
         <w:rPr>
@@ -16508,7 +16414,7 @@
         <w:rPr>
           <w:highlight w:val="cyan"/>
         </w:rPr>
-        <w:t>.</w:t>
+        <w:t>, Table D1.</w:t>
       </w:r>
       <w:r>
         <w:rPr>
@@ -16520,7 +16426,25 @@
         <w:rPr>
           <w:vanish/>
         </w:rPr>
-        <w:t>[[INLINE_ID:inl_dose]]</w:t>
+        <w:t/>
+      </w:r>
+      <w:r>
+        <w:rPr>
+          <w:vanish/>
+        </w:rPr>
+        <w:t/>
+      </w:r>
+      <w:r>
+        <w:rPr>
+          <w:vanish/>
+        </w:rPr>
+        <w:t/>
+      </w:r>
+      <w:r>
+        <w:rPr>
+          <w:vanish/>
+        </w:rPr>
+        <w:t/>
       </w:r>
       <w:r>
         <w:rPr>
@@ -16544,27 +16468,14 @@
       <w:r>
         <w:t>Table </w:t>
       </w:r>
-      <w:r>
-        <w:fldChar w:fldCharType="begin"/>
-      </w:r>
-      <w:r>
-        <w:instrText xml:space="preserve"> SEQ Table \* ARABIC </w:instrText>
-      </w:r>
-      <w:r>
-        <w:fldChar w:fldCharType="separate"/>
-      </w:r>
-      <w:r>
-        <w:rPr>
-          <w:noProof/>
-        </w:rPr>
-        <w:t>2</w:t>
-      </w:r>
-      <w:r>
-        <w:rPr>
-          <w:noProof/>
-        </w:rPr>
-        <w:fldChar w:fldCharType="end"/>
-      </w:r>
+      <w:fldSimple w:instr=" SEQ Table \* ARABIC ">
+        <w:r>
+          <w:rPr>
+            <w:noProof/>
+          </w:rPr>
+          <w:t>2</w:t>
+        </w:r>
+      </w:fldSimple>
       <w:bookmarkEnd w:id="94"/>
       <w:r>
         <w:tab/>
@@ -18040,22 +17951,7 @@
         <w:t xml:space="preserve"> </w:t>
       </w:r>
       <w:r>
-        <w:t>LLOQ: lower limit of quantification,</w:t>
-      </w:r>
-      <w:r>
-        <w:t xml:space="preserve"> </w:t>
-      </w:r>
-      <w:r>
-        <w:t xml:space="preserve">MISS: missing observations (non-BLQ), </w:t>
-      </w:r>
-      <w:r>
-        <w:t>SUBJ: subjects</w:t>
-      </w:r>
-      <w:r>
-        <w:t xml:space="preserve">, </w:t>
-      </w:r>
-      <w:r>
-        <w:t>OBS: observations above the LLOQ</w:t>
+        <w:t>LLOQ: lower limit of quantification, MISS: missing observations (non-BLQ), SUBJ: subjects, OBS: observations above the LLOQ</w:t>
       </w:r>
     </w:p>
     <w:p>
@@ -18063,10 +17959,8 @@
         <w:pStyle w:val="TableFootnoteInfo"/>
       </w:pPr>
       <w:r>
-        <w:t>Source activity:</w:t>
-      </w:r>
-      <w:r>
-        <w:t xml:space="preserve"> </w:t>
+        <w:lastRenderedPageBreak/>
+        <w:t xml:space="preserve">Source activity: </w:t>
       </w:r>
     </w:p>
     <w:p>
@@ -18082,16 +17976,33 @@
         <w:pStyle w:val="TableFootnoteInfo"/>
       </w:pPr>
       <w:r>
-        <w:lastRenderedPageBreak/>
-        <w:t>Source code: eda-tables.R</w:t>
-      </w:r>
+        <w:t xml:space="preserve">Source code: </w:t>
+      </w:r>
+      <w:proofErr w:type="spellStart"/>
+      <w:r>
+        <w:t>eda-</w:t>
+      </w:r>
+      <w:proofErr w:type="gramStart"/>
+      <w:r>
+        <w:t>tables.R</w:t>
+      </w:r>
+      <w:proofErr w:type="spellEnd"/>
+      <w:proofErr w:type="gramEnd"/>
     </w:p>
     <w:p>
       <w:pPr>
         <w:pStyle w:val="TableFootnoteInfo"/>
       </w:pPr>
       <w:r>
-        <w:t>Source file: results/table/eda/pk-data-sum-dose.docx</w:t>
+        <w:t>Source file: results/table/</w:t>
+      </w:r>
+      <w:proofErr w:type="spellStart"/>
+      <w:r>
+        <w:t>eda</w:t>
+      </w:r>
+      <w:proofErr w:type="spellEnd"/>
+      <w:r>
+        <w:t>/pk-data-sum-dose.docx</w:t>
       </w:r>
     </w:p>
     <w:p>
@@ -18117,97 +18028,76 @@
         <w:rPr>
           <w:highlight w:val="cyan"/>
         </w:rPr>
-        <w:t>{{n}}</w:t>
+        <w:t>{{Add</w:t>
       </w:r>
       <w:r>
         <w:rPr>
           <w:highlight w:val="cyan"/>
         </w:rPr>
-        <w:t xml:space="preserve"> plasma</w:t>
+        <w:t xml:space="preserve"> any relevant</w:t>
+      </w:r>
+      <w:r>
+        <w:t xml:space="preserve"> observation acro</w:t>
       </w:r>
       <w:r>
         <w:rPr>
           <w:highlight w:val="cyan"/>
         </w:rPr>
-        <w:t>/blood</w:t>
-      </w:r>
-      <w:r>
-        <w:t xml:space="preserve"> PK samples from </w:t>
+        <w:t>ss se</w:t>
       </w:r>
       <w:r>
         <w:rPr>
           <w:highlight w:val="cyan"/>
         </w:rPr>
-        <w:t>{{n}}</w:t>
+        <w:t xml:space="preserve">l</w:t>
       </w:r>
       <w:r>
         <w:rPr>
           <w:highlight w:val="cyan"/>
         </w:rPr>
-        <w:t xml:space="preserve"> </w:t>
+        <w:t>ected st</w:t>
+      </w:r>
+      <w:r>
+        <w:t xml:space="preserve">rata for table</w:t>
       </w:r>
       <w:r>
         <w:rPr>
           <w:highlight w:val="cyan"/>
         </w:rPr>
-        <w:t>patients</w:t>
-      </w:r>
-      <w:r>
-        <w:t xml:space="preserve"> treated with </w:t>
+        <w:t xml:space="preserve">}} plasma/blood PK samples fr</w:t>
       </w:r>
       <w:r>
         <w:rPr>
           <w:highlight w:val="cyan"/>
         </w:rPr>
-        <w:t xml:space="preserve">AZDXXX </w:t>
+        <w:t xml:space="preserve">o</w:t>
       </w:r>
       <w:r>
         <w:rPr>
           <w:highlight w:val="cyan"/>
         </w:rPr>
-        <w:t xml:space="preserve">across dose levels of </w:t>
+        <w:t>m {{n}} p</w:t>
       </w:r>
       <w:r>
         <w:rPr>
           <w:highlight w:val="cyan"/>
         </w:rPr>
-        <w:t xml:space="preserve"> </w:t>
+        <w:t xml:space="preserve">atie</w:t>
       </w:r>
       <w:r>
         <w:rPr>
           <w:highlight w:val="cyan"/>
         </w:rPr>
-        <w:t>{{XX mg}}</w:t>
+        <w:t>nts treat</w:t>
+      </w:r>
+      <w:r>
+        <w:t xml:space="preserve">ed with AZDXXX across dose levels of  {{XX mg}} </w:t>
       </w:r>
       <w:r>
         <w:rPr>
           <w:highlight w:val="cyan"/>
         </w:rPr>
-        <w:t xml:space="preserve"> to </w:t>
-      </w:r>
-      <w:r>
-        <w:rPr>
-          <w:highlight w:val="cyan"/>
-        </w:rPr>
-        <w:t>{{XX mg}}</w:t>
-      </w:r>
-      <w:r>
-        <w:t xml:space="preserve"> </w:t>
-      </w:r>
-      <w:r>
-        <w:t xml:space="preserve">were available for inclusion in this analysis. </w:t>
-      </w:r>
-      <w:r>
-        <w:rPr>
-          <w:highlight w:val="cyan"/>
-        </w:rPr>
-        <w:t>{{Add any relevant observation across selected strata for table}}</w:t>
-      </w:r>
-      <w:r>
-        <w:rPr>
-          <w:highlight w:val="cyan"/>
-        </w:rPr>
-        <w:t xml:space="preserve"/>
+        <w:t>to {{XX mg}} were available for inclusion in this analysis. {{Add any relevant observation across selected strata for table}}</w:t>
       </w:r>
       <w:r>
         <w:rPr>
@@ -18219,6 +18109,60 @@
         <w:rPr>
           <w:vanish/>
         </w:rPr>
+        <w:t/>
+      </w:r>
+      <w:r>
+        <w:rPr>
+          <w:vanish/>
+        </w:rPr>
+        <w:t/>
+      </w:r>
+      <w:r>
+        <w:rPr>
+          <w:vanish/>
+        </w:rPr>
+        <w:t/>
+      </w:r>
+      <w:r>
+        <w:rPr>
+          <w:vanish/>
+        </w:rPr>
+        <w:t/>
+      </w:r>
+      <w:r>
+        <w:rPr>
+          <w:vanish/>
+        </w:rPr>
+        <w:t/>
+      </w:r>
+      <w:r>
+        <w:rPr>
+          <w:vanish/>
+        </w:rPr>
+        <w:t/>
+      </w:r>
+      <w:r>
+        <w:rPr>
+          <w:vanish/>
+        </w:rPr>
+        <w:t/>
+      </w:r>
+      <w:r>
+        <w:rPr>
+          <w:vanish/>
+        </w:rPr>
+        <w:t/>
+      </w:r>
+      <w:r>
+        <w:rPr>
+          <w:vanish/>
+        </w:rPr>
+        <w:t>[[INLINE_ID:inl_add_any_relevant_observation_across_selected_strata_for_table]]</w:t>
+      </w:r>
+      <w:r>
+        <w:rPr>
+          <w:vanish/>
+        </w:rPr>
         <w:t>[[INLINE_ID:inl_n]]</w:t>
       </w:r>
       <w:r>
@@ -18226,12 +18170,6 @@
           <w:vanish/>
         </w:rPr>
         <w:t>[[INLINE_ID:inl_xx_mg]]</w:t>
-      </w:r>
-      <w:r>
-        <w:rPr>
-          <w:vanish/>
-        </w:rPr>
-        <w:t>[[INLINE_ID:inl_add_any_relevant_observation_across_selected_strata_for_table]]</w:t>
       </w:r>
     </w:p>
     <w:p>
@@ -18325,28 +18263,7 @@
                 <w:sz w:val="22"/>
                 <w:szCs w:val="22"/>
               </w:rPr>
-              <w:t xml:space="preserve">Focus on relevant features of the data, </w:t>
-            </w:r>
-            <w:r>
-              <w:rPr>
-                <w:sz w:val="22"/>
-                <w:szCs w:val="22"/>
-              </w:rPr>
-              <w:t>PK(PD)</w:t>
-            </w:r>
-            <w:r>
-              <w:rPr>
-                <w:sz w:val="22"/>
-                <w:szCs w:val="22"/>
-              </w:rPr>
-              <w:t>, dosing and covariates</w:t>
-            </w:r>
-            <w:r>
-              <w:rPr>
-                <w:sz w:val="22"/>
-                <w:szCs w:val="22"/>
-              </w:rPr>
-              <w:t xml:space="preserve"> to enable the reader a good understanding of the general behaviour (stratified by dose, time, time after dose, and key covariates).</w:t>
+              <w:t>Focus on relevant features of the data, PK(PD), dosing and covariates to enable the reader a good understanding of the general behaviour (stratified by dose, time, time after dose, and key covariates).</w:t>
             </w:r>
           </w:p>
           <w:p>
@@ -18394,56 +18311,7 @@
                 <w:sz w:val="22"/>
                 <w:szCs w:val="22"/>
               </w:rPr>
-              <w:t>Retain</w:t>
-            </w:r>
-            <w:r>
-              <w:rPr>
-                <w:sz w:val="22"/>
-                <w:szCs w:val="22"/>
-              </w:rPr>
-              <w:t xml:space="preserve"> high impact results in the main text</w:t>
-            </w:r>
-            <w:r>
-              <w:rPr>
-                <w:sz w:val="22"/>
-                <w:szCs w:val="22"/>
-              </w:rPr>
-              <w:t>, with supporting</w:t>
-            </w:r>
-            <w:r>
-              <w:rPr>
-                <w:sz w:val="22"/>
-                <w:szCs w:val="22"/>
-              </w:rPr>
-              <w:t xml:space="preserve"> </w:t>
-            </w:r>
-            <w:r>
-              <w:rPr>
-                <w:sz w:val="22"/>
-                <w:szCs w:val="22"/>
-              </w:rPr>
-              <w:t>tables/figures</w:t>
-            </w:r>
-            <w:r>
-              <w:rPr>
-                <w:sz w:val="22"/>
-                <w:szCs w:val="22"/>
-              </w:rPr>
-              <w:t xml:space="preserve"> in </w:t>
-            </w:r>
-            <w:r>
-              <w:rPr>
-                <w:sz w:val="22"/>
-                <w:szCs w:val="22"/>
-              </w:rPr>
-              <w:t>an appendix.</w:t>
-            </w:r>
-            <w:r>
-              <w:rPr>
-                <w:sz w:val="22"/>
-                <w:szCs w:val="22"/>
-              </w:rPr>
-              <w:t xml:space="preserve"> </w:t>
+              <w:t xml:space="preserve">Retain high impact results in the main text, with supporting tables/figures in an appendix. </w:t>
             </w:r>
           </w:p>
           <w:p>
@@ -18459,14 +18327,7 @@
                 <w:sz w:val="22"/>
                 <w:szCs w:val="22"/>
               </w:rPr>
-              <w:t xml:space="preserve">Refer to </w:t>
-            </w:r>
-            <w:r>
-              <w:rPr>
-                <w:sz w:val="22"/>
-                <w:szCs w:val="22"/>
-              </w:rPr>
-              <w:t>GUID-0024307</w:t>
+              <w:t>Refer to GUID-0024307</w:t>
             </w:r>
             <w:r>
               <w:rPr>
@@ -18485,7 +18346,29 @@
                   <w:szCs w:val="22"/>
                   <w:u w:val="single"/>
                 </w:rPr>
-                <w:t>General Considerations for Tables, Figures, Listings (TFL) for popPK reports from Clinical Pharmacology &amp; Quantitative Pharmacology CPQP</w:t>
+                <w:t xml:space="preserve">General Considerations for Tables, Figures, Listings (TFL) for </w:t>
+              </w:r>
+              <w:proofErr w:type="spellStart"/>
+              <w:r>
+                <w:rPr>
+                  <w:rStyle w:val="cf01"/>
+                  <w:color w:val="0000FF"/>
+                  <w:sz w:val="22"/>
+                  <w:szCs w:val="22"/>
+                  <w:u w:val="single"/>
+                </w:rPr>
+                <w:t>popPK</w:t>
+              </w:r>
+              <w:proofErr w:type="spellEnd"/>
+              <w:r>
+                <w:rPr>
+                  <w:rStyle w:val="cf01"/>
+                  <w:color w:val="0000FF"/>
+                  <w:sz w:val="22"/>
+                  <w:szCs w:val="22"/>
+                  <w:u w:val="single"/>
+                </w:rPr>
+                <w:t xml:space="preserve"> reports from Clinical Pharmacology &amp; Quantitative Pharmacology CPQP</w:t>
               </w:r>
             </w:hyperlink>
           </w:p>
@@ -18541,10 +18424,7 @@
         <w:fldChar w:fldCharType="end"/>
       </w:r>
       <w:r>
-        <w:t>. The correlations between continuous covariates are shown in</w:t>
-      </w:r>
-      <w:r>
-        <w:t xml:space="preserve"> </w:t>
+        <w:t xml:space="preserve">. The correlations between continuous covariates are shown in </w:t>
       </w:r>
       <w:r>
         <w:fldChar w:fldCharType="begin"/>
@@ -18568,13 +18448,7 @@
         <w:fldChar w:fldCharType="end"/>
       </w:r>
       <w:r>
-        <w:t xml:space="preserve">. The correlation between continuous and most </w:t>
-      </w:r>
-      <w:r>
-        <w:t xml:space="preserve">relevant </w:t>
-      </w:r>
-      <w:r>
-        <w:t xml:space="preserve">categorical covariates are shown in </w:t>
+        <w:t xml:space="preserve">. The correlation between continuous and most relevant categorical covariates are shown in </w:t>
       </w:r>
       <w:r>
         <w:fldChar w:fldCharType="begin"/>
@@ -18598,10 +18472,7 @@
         <w:fldChar w:fldCharType="end"/>
       </w:r>
       <w:r>
-        <w:t xml:space="preserve"> </w:t>
-      </w:r>
-      <w:r>
-        <w:t xml:space="preserve">and </w:t>
+        <w:t xml:space="preserve"> and </w:t>
       </w:r>
       <w:r>
         <w:fldChar w:fldCharType="begin"/>
@@ -18665,8 +18536,27 @@
       <w:r>
         <w:rPr>
           <w:b/>
+          <w:color w:val="FF0000"/>
         </w:rPr>
-        <w:t>&lt;&lt;Name:eta pairs|Title:ETA pairwise relationship plot|Footnote:Pairwise ETA relationship overview.|Files:cont-vs-cont.png|Type:image&gt;&gt;</w:t>
+        <w:t>&lt;&lt;Name:eta pairs|Title:MISSING_VALUE(Title)|Footnote:Pairwise ETA relationship overview.|Files:cont-vs-cont.png|Type:image&gt;&gt;</w:t>
+      </w:r>
+      <w:r>
+        <w:rPr>
+          <w:vanish/>
+        </w:rPr>
+        <w:t/>
+      </w:r>
+      <w:r>
+        <w:rPr>
+          <w:vanish/>
+        </w:rPr>
+        <w:t/>
+      </w:r>
+      <w:r>
+        <w:rPr>
+          <w:vanish/>
+        </w:rPr>
+        <w:t/>
       </w:r>
       <w:r>
         <w:rPr>
@@ -18720,6 +18610,16 @@
         </w:rPr>
         <w:t/>
       </w:r>
+    </w:p>
+    <w:p>
+      <w:pPr>
+        <w:jc w:val="center"/>
+      </w:pPr>
+    </w:p>
+    <w:p>
+      <w:pPr>
+        <w:pStyle w:val="Paragraph"/>
+      </w:pPr>
     </w:p>
     <w:p>
       <w:pPr>
@@ -18747,27 +18647,14 @@
         <w:lastRenderedPageBreak/>
         <w:t>Table </w:t>
       </w:r>
-      <w:r>
-        <w:fldChar w:fldCharType="begin"/>
-      </w:r>
-      <w:r>
-        <w:instrText xml:space="preserve"> SEQ Table \* ARABIC </w:instrText>
-      </w:r>
-      <w:r>
-        <w:fldChar w:fldCharType="separate"/>
-      </w:r>
-      <w:r>
-        <w:rPr>
-          <w:noProof/>
-        </w:rPr>
-        <w:t>3</w:t>
-      </w:r>
-      <w:r>
-        <w:rPr>
-          <w:noProof/>
-        </w:rPr>
-        <w:fldChar w:fldCharType="end"/>
-      </w:r>
+      <w:fldSimple w:instr=" SEQ Table \* ARABIC ">
+        <w:r>
+          <w:rPr>
+            <w:noProof/>
+          </w:rPr>
+          <w:t>3</w:t>
+        </w:r>
+      </w:fldSimple>
       <w:bookmarkEnd w:id="102"/>
       <w:r>
         <w:tab/>
@@ -18782,10 +18669,7 @@
         <w:t xml:space="preserve">ovariates </w:t>
       </w:r>
       <w:r>
-        <w:t>O</w:t>
-      </w:r>
-      <w:r>
-        <w:t xml:space="preserve">verall and </w:t>
+        <w:t xml:space="preserve">Overall and </w:t>
       </w:r>
       <w:r>
         <w:t xml:space="preserve">by </w:t>
@@ -18797,6 +18681,24 @@
         <w:t>{{Study}}</w:t>
       </w:r>
       <w:bookmarkEnd w:id="103"/>
+      <w:r>
+        <w:rPr>
+          <w:vanish/>
+        </w:rPr>
+        <w:t/>
+      </w:r>
+      <w:r>
+        <w:rPr>
+          <w:vanish/>
+        </w:rPr>
+        <w:t/>
+      </w:r>
+      <w:r>
+        <w:rPr>
+          <w:vanish/>
+        </w:rPr>
+        <w:t/>
+      </w:r>
       <w:r>
         <w:rPr>
           <w:vanish/>
@@ -20309,15 +20211,33 @@
         <w:pStyle w:val="TableFootnoteInfo"/>
       </w:pPr>
       <w:r>
-        <w:t>Source code: eda-tables.R</w:t>
-      </w:r>
+        <w:t xml:space="preserve">Source code: </w:t>
+      </w:r>
+      <w:proofErr w:type="spellStart"/>
+      <w:r>
+        <w:t>eda-</w:t>
+      </w:r>
+      <w:proofErr w:type="gramStart"/>
+      <w:r>
+        <w:t>tables.R</w:t>
+      </w:r>
+      <w:proofErr w:type="spellEnd"/>
+      <w:proofErr w:type="gramEnd"/>
     </w:p>
     <w:p>
       <w:pPr>
         <w:pStyle w:val="TableFootnoteInfo"/>
       </w:pPr>
       <w:r>
-        <w:t>Source file: results/table/eda/cat-cov-sum-study.docx</w:t>
+        <w:t>Source file: results/table/</w:t>
+      </w:r>
+      <w:proofErr w:type="spellStart"/>
+      <w:r>
+        <w:t>eda</w:t>
+      </w:r>
+      <w:proofErr w:type="spellEnd"/>
+      <w:r>
+        <w:t>/cat-cov-sum-study.docx</w:t>
       </w:r>
     </w:p>
     <w:p>
@@ -20346,27 +20266,14 @@
         <w:lastRenderedPageBreak/>
         <w:t>Figure </w:t>
       </w:r>
-      <w:r>
-        <w:fldChar w:fldCharType="begin"/>
-      </w:r>
-      <w:r>
-        <w:instrText xml:space="preserve"> SEQ Figure \* ARABIC </w:instrText>
-      </w:r>
-      <w:r>
-        <w:fldChar w:fldCharType="separate"/>
-      </w:r>
-      <w:r>
-        <w:rPr>
-          <w:noProof/>
-        </w:rPr>
-        <w:t>1</w:t>
-      </w:r>
-      <w:r>
-        <w:rPr>
-          <w:noProof/>
-        </w:rPr>
-        <w:fldChar w:fldCharType="end"/>
-      </w:r>
+      <w:fldSimple w:instr=" SEQ Figure \* ARABIC ">
+        <w:r>
+          <w:rPr>
+            <w:noProof/>
+          </w:rPr>
+          <w:t>1</w:t>
+        </w:r>
+      </w:fldSimple>
       <w:bookmarkEnd w:id="104"/>
       <w:r>
         <w:tab/>
@@ -20457,9 +20364,6 @@
         <w:pStyle w:val="TableFootnoteInfo"/>
       </w:pPr>
       <w:r>
-        <w:t>&lt;&lt;Name:studies|Title:Clinical studies listing|Footnote:List of studies included in analysis.|Files:pk-data-sum-dose-study.docx|Type:table&gt;&gt;</w:t>
-      </w:r>
-      <w:r>
         <w:rPr>
           <w:vanish/>
         </w:rPr>
@@ -20469,6 +20373,25 @@
         <w:rPr>
           <w:b/>
           <w:sz w:val="24"/>
+          <w:color w:val="FF0000"/>
+        </w:rPr>
+        <w:t>&lt;&lt;Name:studies|Title:MISSING_VALUE(Title)|Footnote:List of studies included in analysis.|Files:MISSING_VALUE(Files)|Type:table&gt;&gt;</w:t>
+      </w:r>
+      <w:r>
+        <w:rPr>
+          <w:vanish/>
+        </w:rPr>
+        <w:t/>
+      </w:r>
+      <w:r>
+        <w:rPr>
+          <w:vanish/>
+        </w:rPr>
+        <w:t/>
+      </w:r>
+      <w:r>
+        <w:rPr>
+          <w:vanish/>
         </w:rPr>
         <w:t/>
       </w:r>
@@ -20504,6 +20427,11 @@
         </w:rPr>
         <w:t/>
       </w:r>
+    </w:p>
+    <w:p>
+      <w:pPr>
+        <w:pStyle w:val="TableFootnoteInfo"/>
+      </w:pPr>
     </w:p>
     <w:p>
       <w:pPr>
@@ -20520,27 +20448,14 @@
         <w:lastRenderedPageBreak/>
         <w:t>Figure </w:t>
       </w:r>
-      <w:r>
-        <w:fldChar w:fldCharType="begin"/>
-      </w:r>
-      <w:r>
-        <w:instrText xml:space="preserve"> SEQ Figure \* ARABIC </w:instrText>
-      </w:r>
-      <w:r>
-        <w:fldChar w:fldCharType="separate"/>
-      </w:r>
-      <w:r>
-        <w:rPr>
-          <w:noProof/>
-        </w:rPr>
-        <w:t>3</w:t>
-      </w:r>
-      <w:r>
-        <w:rPr>
-          <w:noProof/>
-        </w:rPr>
-        <w:fldChar w:fldCharType="end"/>
-      </w:r>
+      <w:fldSimple w:instr=" SEQ Figure \* ARABIC ">
+        <w:r>
+          <w:rPr>
+            <w:noProof/>
+          </w:rPr>
+          <w:t>3</w:t>
+        </w:r>
+      </w:fldSimple>
       <w:bookmarkEnd w:id="106"/>
       <w:r>
         <w:tab/>
@@ -20655,27 +20570,14 @@
         <w:lastRenderedPageBreak/>
         <w:t>Figure </w:t>
       </w:r>
-      <w:r>
-        <w:fldChar w:fldCharType="begin"/>
-      </w:r>
-      <w:r>
-        <w:instrText xml:space="preserve"> SEQ Figure \* ARABIC </w:instrText>
-      </w:r>
-      <w:r>
-        <w:fldChar w:fldCharType="separate"/>
-      </w:r>
-      <w:r>
-        <w:rPr>
-          <w:noProof/>
-        </w:rPr>
-        <w:t>4</w:t>
-      </w:r>
-      <w:r>
-        <w:rPr>
-          <w:noProof/>
-        </w:rPr>
-        <w:fldChar w:fldCharType="end"/>
-      </w:r>
+      <w:fldSimple w:instr=" SEQ Figure \* ARABIC ">
+        <w:r>
+          <w:rPr>
+            <w:noProof/>
+          </w:rPr>
+          <w:t>4</w:t>
+        </w:r>
+      </w:fldSimple>
       <w:bookmarkEnd w:id="108"/>
       <w:r>
         <w:tab/>
@@ -20897,6 +20799,24 @@
         <w:rPr>
           <w:vanish/>
         </w:rPr>
+        <w:t/>
+      </w:r>
+      <w:r>
+        <w:rPr>
+          <w:vanish/>
+        </w:rPr>
+        <w:t/>
+      </w:r>
+      <w:r>
+        <w:rPr>
+          <w:vanish/>
+        </w:rPr>
+        <w:t/>
+      </w:r>
+      <w:r>
+        <w:rPr>
+          <w:vanish/>
+        </w:rPr>
         <w:t>[[INLINE_ID:inl_fast_slow]]</w:t>
       </w:r>
     </w:p>
@@ -21074,62 +20994,67 @@
         <w:lastRenderedPageBreak/>
         <w:t>Figure </w:t>
       </w:r>
-      <w:r>
-        <w:fldChar w:fldCharType="begin"/>
-      </w:r>
-      <w:r>
-        <w:instrText xml:space="preserve"> SEQ Figure \* ARABIC </w:instrText>
-      </w:r>
-      <w:r>
-        <w:fldChar w:fldCharType="separate"/>
-      </w:r>
+      <w:fldSimple w:instr=" SEQ Figure \* ARABIC ">
+        <w:r>
+          <w:rPr>
+            <w:noProof/>
+          </w:rPr>
+          <w:t>6</w:t>
+        </w:r>
+      </w:fldSimple>
+      <w:bookmarkEnd w:id="111"/>
+      <w:r>
+        <w:tab/>
+      </w:r>
+      <w:r>
+        <w:t>C</w:t>
+      </w:r>
+      <w:r>
+        <w:t xml:space="preserve">oncentrations versus </w:t>
+      </w:r>
+      <w:r>
+        <w:t>T</w:t>
+      </w:r>
+      <w:r>
+        <w:t xml:space="preserve">ime </w:t>
+      </w:r>
+      <w:r>
+        <w:t>a</w:t>
+      </w:r>
+      <w:r>
+        <w:t xml:space="preserve">fter </w:t>
+      </w:r>
+      <w:r>
+        <w:t>D</w:t>
+      </w:r>
+      <w:r>
+        <w:t xml:space="preserve">ose by </w:t>
+      </w:r>
+      <w:r>
+        <w:t>{{Study and Dose}}</w:t>
+      </w:r>
+      <w:r>
+        <w:t xml:space="preserve"> (log scale)</w:t>
+      </w:r>
+      <w:bookmarkEnd w:id="112"/>
       <w:r>
         <w:rPr>
-          <w:noProof/>
+          <w:vanish/>
         </w:rPr>
-        <w:t>6</w:t>
+        <w:t/>
       </w:r>
       <w:r>
         <w:rPr>
-          <w:noProof/>
+          <w:vanish/>
         </w:rPr>
-        <w:fldChar w:fldCharType="end"/>
-      </w:r>
-      <w:bookmarkEnd w:id="111"/>
-      <w:r>
-        <w:tab/>
-      </w:r>
-      <w:r>
-        <w:t>C</w:t>
-      </w:r>
-      <w:r>
-        <w:t xml:space="preserve">oncentrations versus </w:t>
-      </w:r>
-      <w:r>
-        <w:t>T</w:t>
-      </w:r>
-      <w:r>
-        <w:t xml:space="preserve">ime </w:t>
-      </w:r>
-      <w:r>
-        <w:t>a</w:t>
-      </w:r>
-      <w:r>
-        <w:t xml:space="preserve">fter </w:t>
-      </w:r>
-      <w:r>
-        <w:t>D</w:t>
-      </w:r>
-      <w:r>
-        <w:t xml:space="preserve">ose by </w:t>
-      </w:r>
-      <w:r>
-        <w:t>{{Study and Dose}}</w:t>
-      </w:r>
-      <w:r>
-        <w:t xml:space="preserve"> (log scale)</w:t>
-      </w:r>
-      <w:bookmarkEnd w:id="112"/>
+        <w:t/>
+      </w:r>
+      <w:r>
+        <w:rPr>
+          <w:vanish/>
+        </w:rPr>
+        <w:t/>
+      </w:r>
       <w:r>
         <w:rPr>
           <w:vanish/>
@@ -21303,35 +21228,7 @@
                 <w:sz w:val="22"/>
                 <w:szCs w:val="22"/>
               </w:rPr>
-              <w:t xml:space="preserve">This section describes the </w:t>
-            </w:r>
-            <w:r>
-              <w:rPr>
-                <w:sz w:val="22"/>
-                <w:szCs w:val="22"/>
-              </w:rPr>
-              <w:t xml:space="preserve">results of the </w:t>
-            </w:r>
-            <w:r>
-              <w:rPr>
-                <w:sz w:val="22"/>
-                <w:szCs w:val="22"/>
-              </w:rPr>
-              <w:t>PK</w:t>
-            </w:r>
-            <w:r>
-              <w:rPr>
-                <w:sz w:val="22"/>
-                <w:szCs w:val="22"/>
-              </w:rPr>
-              <w:t xml:space="preserve"> model development from </w:t>
-            </w:r>
-            <w:r>
-              <w:rPr>
-                <w:sz w:val="22"/>
-                <w:szCs w:val="22"/>
-              </w:rPr>
-              <w:t>base model to final model.</w:t>
+              <w:t>This section describes the results of the PK model development from base model to final model.</w:t>
             </w:r>
           </w:p>
           <w:p>
@@ -21395,56 +21292,7 @@
                 <w:sz w:val="22"/>
                 <w:szCs w:val="22"/>
               </w:rPr>
-              <w:t xml:space="preserve">Description of the base </w:t>
-            </w:r>
-            <w:r>
-              <w:rPr>
-                <w:sz w:val="22"/>
-                <w:szCs w:val="22"/>
-              </w:rPr>
-              <w:t xml:space="preserve">and final </w:t>
-            </w:r>
-            <w:r>
-              <w:rPr>
-                <w:sz w:val="22"/>
-                <w:szCs w:val="22"/>
-              </w:rPr>
-              <w:t>model</w:t>
-            </w:r>
-            <w:r>
-              <w:rPr>
-                <w:sz w:val="22"/>
-                <w:szCs w:val="22"/>
-              </w:rPr>
-              <w:t>s</w:t>
-            </w:r>
-            <w:r>
-              <w:rPr>
-                <w:sz w:val="22"/>
-                <w:szCs w:val="22"/>
-              </w:rPr>
-              <w:t xml:space="preserve"> with emphasis on key attributes</w:t>
-            </w:r>
-            <w:r>
-              <w:rPr>
-                <w:sz w:val="22"/>
-                <w:szCs w:val="22"/>
-              </w:rPr>
-              <w:t>. Additional considerations provided in an appendix and referred to</w:t>
-            </w:r>
-            <w:r>
-              <w:rPr>
-                <w:sz w:val="22"/>
-                <w:szCs w:val="22"/>
-              </w:rPr>
-              <w:t xml:space="preserve"> in these sections</w:t>
-            </w:r>
-            <w:r>
-              <w:rPr>
-                <w:sz w:val="22"/>
-                <w:szCs w:val="22"/>
-              </w:rPr>
-              <w:t xml:space="preserve">. </w:t>
+              <w:t xml:space="preserve">Description of the base and final models with emphasis on key attributes. Additional considerations provided in an appendix and referred to in these sections. </w:t>
             </w:r>
           </w:p>
           <w:p>
@@ -21460,42 +21308,7 @@
                 <w:sz w:val="22"/>
                 <w:szCs w:val="22"/>
               </w:rPr>
-              <w:t>T</w:t>
-            </w:r>
-            <w:r>
-              <w:rPr>
-                <w:sz w:val="22"/>
-                <w:szCs w:val="22"/>
-              </w:rPr>
-              <w:t xml:space="preserve">able with parameter estimates of </w:t>
-            </w:r>
-            <w:r>
-              <w:rPr>
-                <w:sz w:val="22"/>
-                <w:szCs w:val="22"/>
-              </w:rPr>
-              <w:t>base and final</w:t>
-            </w:r>
-            <w:r>
-              <w:rPr>
-                <w:sz w:val="22"/>
-                <w:szCs w:val="22"/>
-              </w:rPr>
-              <w:t xml:space="preserve"> </w:t>
-            </w:r>
-            <w:r>
-              <w:rPr>
-                <w:sz w:val="22"/>
-                <w:szCs w:val="22"/>
-              </w:rPr>
-              <w:t>models</w:t>
-            </w:r>
-            <w:r>
-              <w:rPr>
-                <w:sz w:val="22"/>
-                <w:szCs w:val="22"/>
-              </w:rPr>
-              <w:t>.</w:t>
+              <w:t>Table with parameter estimates of base and final models.</w:t>
             </w:r>
           </w:p>
           <w:p>
@@ -21511,14 +21324,7 @@
                 <w:sz w:val="22"/>
                 <w:szCs w:val="22"/>
               </w:rPr>
-              <w:t>Consider placing model diagnostic plots in an appendix</w:t>
-            </w:r>
-            <w:r>
-              <w:rPr>
-                <w:sz w:val="22"/>
-                <w:szCs w:val="22"/>
-              </w:rPr>
-              <w:t xml:space="preserve">. </w:t>
+              <w:t xml:space="preserve">Consider placing model diagnostic plots in an appendix. </w:t>
             </w:r>
           </w:p>
           <w:p>
@@ -21534,35 +21340,7 @@
                 <w:sz w:val="22"/>
                 <w:szCs w:val="22"/>
               </w:rPr>
-              <w:t xml:space="preserve">Include </w:t>
-            </w:r>
-            <w:r>
-              <w:rPr>
-                <w:sz w:val="22"/>
-                <w:szCs w:val="22"/>
-              </w:rPr>
-              <w:t xml:space="preserve">individual graphs in appendix </w:t>
-            </w:r>
-            <w:r>
-              <w:rPr>
-                <w:sz w:val="22"/>
-                <w:szCs w:val="22"/>
-              </w:rPr>
-              <w:t xml:space="preserve">and </w:t>
-            </w:r>
-            <w:r>
-              <w:rPr>
-                <w:sz w:val="22"/>
-                <w:szCs w:val="22"/>
-              </w:rPr>
-              <w:t xml:space="preserve">include </w:t>
-            </w:r>
-            <w:r>
-              <w:rPr>
-                <w:sz w:val="22"/>
-                <w:szCs w:val="22"/>
-              </w:rPr>
-              <w:t xml:space="preserve">only for the final model. </w:t>
+              <w:t xml:space="preserve">Include individual graphs in appendix and include only for the final model. </w:t>
             </w:r>
             <w:r>
               <w:rPr>
@@ -21647,7 +21425,29 @@
                   <w:szCs w:val="22"/>
                   <w:u w:val="single"/>
                 </w:rPr>
-                <w:t>General Considerations for Tables, Figures, Listings (TFL) for popPK reports from Clinical Pharmacology &amp; Quantitative Pharmacology CPQP</w:t>
+                <w:t xml:space="preserve">General Considerations for Tables, Figures, Listings (TFL) for </w:t>
+              </w:r>
+              <w:proofErr w:type="spellStart"/>
+              <w:r>
+                <w:rPr>
+                  <w:rStyle w:val="cf01"/>
+                  <w:color w:val="0000FF"/>
+                  <w:sz w:val="22"/>
+                  <w:szCs w:val="22"/>
+                  <w:u w:val="single"/>
+                </w:rPr>
+                <w:t>popPK</w:t>
+              </w:r>
+              <w:proofErr w:type="spellEnd"/>
+              <w:r>
+                <w:rPr>
+                  <w:rStyle w:val="cf01"/>
+                  <w:color w:val="0000FF"/>
+                  <w:sz w:val="22"/>
+                  <w:szCs w:val="22"/>
+                  <w:u w:val="single"/>
+                </w:rPr>
+                <w:t xml:space="preserve"> reports from Clinical Pharmacology &amp; Quantitative Pharmacology CPQP</w:t>
               </w:r>
             </w:hyperlink>
           </w:p>
@@ -21695,27 +21495,14 @@
       <w:r>
         <w:t>Table </w:t>
       </w:r>
-      <w:r>
-        <w:fldChar w:fldCharType="begin"/>
-      </w:r>
-      <w:r>
-        <w:instrText xml:space="preserve"> SEQ Table \* ARABIC </w:instrText>
-      </w:r>
-      <w:r>
-        <w:fldChar w:fldCharType="separate"/>
-      </w:r>
-      <w:r>
-        <w:rPr>
-          <w:noProof/>
-        </w:rPr>
-        <w:t>4</w:t>
-      </w:r>
-      <w:r>
-        <w:rPr>
-          <w:noProof/>
-        </w:rPr>
-        <w:fldChar w:fldCharType="end"/>
-      </w:r>
+      <w:fldSimple w:instr=" SEQ Table \* ARABIC ">
+        <w:r>
+          <w:rPr>
+            <w:noProof/>
+          </w:rPr>
+          <w:t>4</w:t>
+        </w:r>
+      </w:fldSimple>
       <w:bookmarkEnd w:id="118"/>
       <w:r>
         <w:tab/>
@@ -22164,16 +21951,7 @@
         <w:pStyle w:val="TableFootnoteInfo"/>
       </w:pPr>
       <w:r>
-        <w:t>BS</w:t>
-      </w:r>
-      <w:r>
-        <w:t xml:space="preserve">V: </w:t>
-      </w:r>
-      <w:r>
-        <w:t xml:space="preserve">between subject </w:t>
-      </w:r>
-      <w:r>
-        <w:t>variability; OFV: objective function value; Cond. no.: condition number</w:t>
+        <w:t>BSV: between subject variability; OFV: objective function value; Cond. no.: condition number</w:t>
       </w:r>
     </w:p>
     <w:p>
@@ -22181,8 +21959,15 @@
         <w:pStyle w:val="TableFootnoteInfo"/>
       </w:pPr>
       <w:r>
-        <w:t>Source code: run-log.R</w:t>
-      </w:r>
+        <w:t>Source code: run-</w:t>
+      </w:r>
+      <w:proofErr w:type="spellStart"/>
+      <w:proofErr w:type="gramStart"/>
+      <w:r>
+        <w:t>log.R</w:t>
+      </w:r>
+      <w:proofErr w:type="spellEnd"/>
+      <w:proofErr w:type="gramEnd"/>
     </w:p>
     <w:p>
       <w:pPr>
@@ -22246,10 +22031,7 @@
         <w:pStyle w:val="AppendixAlphaSub2"/>
       </w:pPr>
       <w:r>
-        <w:t>Available Dat</w:t>
-      </w:r>
-      <w:r>
-        <w:t>a</w:t>
+        <w:t>Available Data</w:t>
       </w:r>
     </w:p>
     <w:p>
@@ -22261,53 +22043,25 @@
       <w:r>
         <w:t>Table </w:t>
       </w:r>
-      <w:r>
-        <w:fldChar w:fldCharType="begin"/>
-      </w:r>
-      <w:r>
-        <w:instrText xml:space="preserve"> STYLEREF  "Appendix Alpha" \n \t  </w:instrText>
-      </w:r>
-      <w:r>
-        <w:fldChar w:fldCharType="separate"/>
-      </w:r>
-      <w:r>
-        <w:rPr>
-          <w:noProof/>
-        </w:rPr>
-        <w:t>D</w:t>
-      </w:r>
-      <w:r>
-        <w:rPr>
-          <w:noProof/>
-        </w:rPr>
-        <w:fldChar w:fldCharType="end"/>
-      </w:r>
-      <w:r>
-        <w:fldChar w:fldCharType="begin"/>
-      </w:r>
-      <w:r>
-        <w:instrText xml:space="preserve"> SEQ Table \* ARABIC </w:instrText>
-      </w:r>
-      <w:r>
-        <w:fldChar w:fldCharType="separate"/>
-      </w:r>
-      <w:r>
-        <w:rPr>
-          <w:noProof/>
-        </w:rPr>
-        <w:t>1</w:t>
-      </w:r>
-      <w:r>
-        <w:rPr>
-          <w:noProof/>
-        </w:rPr>
-        <w:fldChar w:fldCharType="end"/>
-      </w:r>
+      <w:fldSimple w:instr=" STYLEREF  &quot;Appendix Alpha&quot; \n \t  ">
+        <w:r>
+          <w:rPr>
+            <w:noProof/>
+          </w:rPr>
+          <w:t>D</w:t>
+        </w:r>
+      </w:fldSimple>
+      <w:fldSimple w:instr=" SEQ Table \* ARABIC ">
+        <w:r>
+          <w:rPr>
+            <w:noProof/>
+          </w:rPr>
+          <w:t>1</w:t>
+        </w:r>
+      </w:fldSimple>
       <w:bookmarkEnd w:id="122"/>
       <w:r>
         <w:tab/>
-      </w:r>
-      <w:r>
         <w:t>Summary of available data by study and dose</w:t>
       </w:r>
       <w:bookmarkEnd w:id="123"/>
@@ -25026,7 +24780,20 @@
         <w:pStyle w:val="TableFootnoteInfo"/>
       </w:pPr>
       <w:r>
-        <w:t xml:space="preserve">Source code: eda-tables.R </w:t>
+        <w:t xml:space="preserve">Source code: </w:t>
+      </w:r>
+      <w:proofErr w:type="spellStart"/>
+      <w:r>
+        <w:t>eda-</w:t>
+      </w:r>
+      <w:proofErr w:type="gramStart"/>
+      <w:r>
+        <w:t>tables.R</w:t>
+      </w:r>
+      <w:proofErr w:type="spellEnd"/>
+      <w:proofErr w:type="gramEnd"/>
+      <w:r>
+        <w:t xml:space="preserve"> </w:t>
       </w:r>
     </w:p>
     <w:p>
@@ -25034,7 +24801,15 @@
         <w:pStyle w:val="TableFootnoteInfo"/>
       </w:pPr>
       <w:r>
-        <w:t>Source file: results/table/eda/pk-data-sum-dose-study.docx</w:t>
+        <w:t>Source file: results/table/</w:t>
+      </w:r>
+      <w:proofErr w:type="spellStart"/>
+      <w:r>
+        <w:t>eda</w:t>
+      </w:r>
+      <w:proofErr w:type="spellEnd"/>
+      <w:r>
+        <w:t>/pk-data-sum-dose-study.docx</w:t>
       </w:r>
     </w:p>
     <w:p>
@@ -25048,19 +24823,63 @@
       </w:pPr>
       <w:r>
         <w:lastRenderedPageBreak/>
-        <w:t xml:space="preserve">R environment and </w:t>
-      </w:r>
-      <w:r>
-        <w:t>P</w:t>
-      </w:r>
-      <w:r>
-        <w:t xml:space="preserve">ackage </w:t>
-      </w:r>
-      <w:r>
-        <w:t>D</w:t>
-      </w:r>
-      <w:r>
-        <w:t>etails</w:t>
+        <w:t>R environment and Package Details</w:t>
+      </w:r>
+    </w:p>
+    <w:p>
+      <w:pPr>
+        <w:spacing w:after="160" w:line="259" w:lineRule="auto"/>
+        <w:rPr>
+          <w:rFonts w:asciiTheme="majorHAnsi" w:hAnsiTheme="majorHAnsi" w:cs="Arial"/>
+          <w:b/>
+          <w:iCs/>
+          <w:snapToGrid w:val="0"/>
+          <w:sz w:val="28"/>
+          <w:szCs w:val="26"/>
+        </w:rPr>
+      </w:pPr>
+      <w:r>
+        <w:rPr>
+          <w:vanish/>
+        </w:rPr>
+        <w:t/>
+      </w:r>
+      <w:r>
+        <w:rPr>
+          <w:b/>
+          <w:color w:val="FF0000" val="FF0000"/>
+        </w:rPr>
+        <w:t>&lt;&lt;Name:gof cwres |Title:MISSING_VALUE(Title)|Footnote:Spaghetti - Spaghetti -plots of individual PK profiles. Points are observations, lines connect observations from the same participant. Point shape indicate data above or below the quantification limit (XX ng/mL, dashed line)|Files:dn-conc-time-linear.png|Type:image&gt;&gt;</w:t>
+      </w:r>
+      <w:r>
+        <w:rPr>
+          <w:vanish/>
+        </w:rPr>
+        <w:t/>
+      </w:r>
+      <w:r>
+        <w:rPr>
+          <w:vanish/>
+        </w:rPr>
+        <w:t/>
+      </w:r>
+      <w:r>
+        <w:rPr>
+          <w:vanish/>
+        </w:rPr>
+        <w:t/>
+      </w:r>
+      <w:r>
+        <w:rPr>
+          <w:vanish/>
+        </w:rPr>
+        <w:t/>
+      </w:r>
+      <w:r>
+        <w:rPr>
+          <w:vanish/>
+        </w:rPr>
+        <w:t>[[BLOCK_ID:blk_gof_cwres]]</w:t>
       </w:r>
     </w:p>
     <w:p>
@@ -25071,51 +24890,117 @@
         <w:rPr>
           <w:noProof/>
         </w:rPr>
-        <w:drawing>
-          <wp:inline distT="0" distB="0" distL="0" distR="0" wp14:anchorId="420BC538" wp14:editId="5899DAF2">
-            <wp:extent cx="4572000" cy="5334000"/>
-            <wp:effectExtent l="0" t="0" r="0" b="0"/>
-            <wp:docPr id="1958889516" name="Picture 1958889516"/>
-            <wp:cNvGraphicFramePr>
-              <a:graphicFrameLocks xmlns:a="http://schemas.openxmlformats.org/drawingml/2006/main" noChangeAspect="1"/>
-            </wp:cNvGraphicFramePr>
-            <a:graphic xmlns:a="http://schemas.openxmlformats.org/drawingml/2006/main">
-              <a:graphicData uri="http://schemas.openxmlformats.org/drawingml/2006/picture">
-                <pic:pic xmlns:pic="http://schemas.openxmlformats.org/drawingml/2006/picture">
-                  <pic:nvPicPr>
-                    <pic:cNvPr id="0" name="dn-conc-time-linear.png"/>
-                    <pic:cNvPicPr/>
-                  </pic:nvPicPr>
-                  <pic:blipFill>
-                    <a:blip r:embed="rId23"/>
-                    <a:stretch>
-                      <a:fillRect/>
-                    </a:stretch>
-                  </pic:blipFill>
-                  <pic:spPr>
-                    <a:xfrm>
-                      <a:off x="0" y="0"/>
-                      <a:ext cx="4572000" cy="5334000"/>
-                    </a:xfrm>
-                    <a:prstGeom prst="rect">
-                      <a:avLst/>
-                    </a:prstGeom>
-                  </pic:spPr>
-                </pic:pic>
-              </a:graphicData>
-            </a:graphic>
-          </wp:inline>
-        </w:drawing>
+      </w:r>
+      <w:r>
+        <w:rPr>
+          <w:vanish/>
+        </w:rPr>
+        <w:t/>
       </w:r>
     </w:p>
     <w:p>
-      <w:r>
+      <w:pPr>
+        <w:pStyle w:val="TableFootnoteInfo"/>
         <w:rPr>
-          <w:sz w:val="20"/>
+          <w:lang w:eastAsia="ja-JP"/>
         </w:rPr>
-        <w:t>Conditional weighted residuals versus time.</w:t>
+      </w:pPr>
+      <w:r>
+        <w:rPr>
+          <w:vanish/>
+        </w:rPr>
+        <w:t/>
+      </w:r>
+      <w:r>
+        <w:rPr>
+          <w:rFonts w:eastAsiaTheme="minorEastAsia"/>
+          <w:lang w:eastAsia="ja-JP"/>
+        </w:rPr>
+        <w:t xml:space="preserve"/>
+      </w:r>
+      <w:r>
+        <w:rPr>
+          <w:rFonts w:eastAsiaTheme="minorEastAsia"/>
+          <w:lang w:eastAsia="ja-JP"/>
+        </w:rPr>
+        <w:t/>
+      </w:r>
+      <w:r>
+        <w:rPr>
+          <w:rFonts w:eastAsiaTheme="minorEastAsia"/>
+          <w:lang w:eastAsia="ja-JP"/>
+        </w:rPr>
+        <w:t xml:space="preserve"/>
+      </w:r>
+      <w:r>
+        <w:rPr>
+          <w:rFonts w:eastAsiaTheme="minorEastAsia"/>
+          <w:lang w:eastAsia="ja-JP"/>
+        </w:rPr>
+        <w:t xml:space="preserve"/>
+      </w:r>
+      <w:r>
+        <w:rPr>
+          <w:rFonts w:eastAsiaTheme="minorEastAsia"/>
+          <w:highlight w:val="cyan"/>
+          <w:lang w:eastAsia="ja-JP"/>
+        </w:rPr>
+        <w:t/>
       </w:r>
     </w:p>
+    <w:p>
+      <w:pPr>
+        <w:pStyle w:val="TableFootnoteInfo"/>
+        <w:rPr>
+          <w:lang w:eastAsia="ja-JP"/>
+        </w:rPr>
+      </w:pPr>
+      <w:r>
+        <w:rPr>
+          <w:rFonts w:eastAsiaTheme="minorEastAsia"/>
+          <w:lang w:eastAsia="ja-JP"/>
+        </w:rPr>
+        <w:t xml:space="preserve">plots of individual PK profiles. Points are observations, lines connect observations from the same participant. </w:t>
+      </w:r>
+      <w:r>
+        <w:rPr>
+          <w:rFonts w:eastAsiaTheme="minorEastAsia"/>
+          <w:highlight w:val="cyan"/>
+          <w:lang w:eastAsia="ja-JP"/>
+        </w:rPr>
+        <w:t>Point shape indicate data above or below the quantification limit (XX ng/mL, dashed line)</w:t>
+      </w:r>
+    </w:p>
+    <w:p>
+      <w:pPr>
+        <w:pStyle w:val="TableFootnoteInfo"/>
+        <w:rPr>
+          <w:lang w:eastAsia="ja-JP"/>
+        </w:rPr>
+      </w:pPr>
+      <w:r>
+        <w:rPr>
+          <w:rFonts w:eastAsiaTheme="minorEastAsia"/>
+          <w:lang w:eastAsia="ja-JP"/>
+        </w:rPr>
+        <w:t xml:space="preserve"> -plots of individual PK profiles. Points are observations, lines connect observations from the same participant. </w:t>
+      </w:r>
+      <w:r>
+        <w:rPr>
+          <w:rFonts w:eastAsiaTheme="minorEastAsia"/>
+          <w:highlight w:val="cyan"/>
+          <w:lang w:eastAsia="ja-JP"/>
+        </w:rPr>
+        <w:t>Point shape indicate data above or below the quantification limit (XX ng/mL, dashed line)</w:t>
+      </w:r>
+    </w:p>
+    <w:p/>
+    <w:p>
+      <w:pPr>
+        <w:jc w:val="center"/>
+      </w:pPr>
+    </w:p>
+    <w:p/>
     <w:sectPr>
       <w:pgSz w:w="12242" w:h="15842" w:code="1"/>
       <w:pgMar w:top="1440" w:right="1440" w:bottom="1440" w:left="1701" w:header="709" w:footer="709" w:gutter="0"/>
@@ -25350,31 +25235,7 @@
         <w:vanish/>
         <w:color w:val="008080"/>
       </w:rPr>
-      <w:t>Template Version Number</w:t>
-    </w:r>
-    <w:r>
-      <w:rPr>
-        <w:i/>
-        <w:vanish/>
-        <w:color w:val="008080"/>
-      </w:rPr>
-      <w:t>:</w:t>
-    </w:r>
-    <w:r>
-      <w:rPr>
-        <w:i/>
-        <w:vanish/>
-        <w:color w:val="008080"/>
-      </w:rPr>
-      <w:t>3</w:t>
-    </w:r>
-    <w:r>
-      <w:rPr>
-        <w:i/>
-        <w:vanish/>
-        <w:color w:val="008080"/>
-      </w:rPr>
-      <w:t>.0</w:t>
+      <w:t>Template Version Number:3.0</w:t>
     </w:r>
   </w:p>
 </w:ftr>
@@ -25411,27 +25272,14 @@
     <w:pPr>
       <w:pStyle w:val="Header"/>
     </w:pPr>
-    <w:r>
-      <w:fldChar w:fldCharType="begin"/>
-    </w:r>
-    <w:r>
-      <w:instrText>STYLEREF  "Z-Document Name"  \* MERGEFORMAT</w:instrText>
-    </w:r>
-    <w:r>
-      <w:fldChar w:fldCharType="separate"/>
-    </w:r>
-    <w:r>
-      <w:rPr>
-        <w:noProof/>
-      </w:rPr>
-      <w:t>Model Analysis Report</w:t>
-    </w:r>
-    <w:r>
-      <w:rPr>
-        <w:noProof/>
-      </w:rPr>
-      <w:fldChar w:fldCharType="end"/>
-    </w:r>
+    <w:fldSimple w:instr="STYLEREF  &quot;Z-Document Name&quot;  \* MERGEFORMAT">
+      <w:r>
+        <w:rPr>
+          <w:noProof/>
+        </w:rPr>
+        <w:t>Model Analysis Report</w:t>
+      </w:r>
+    </w:fldSimple>
     <w:r>
       <w:ptab w:relativeTo="margin" w:alignment="right" w:leader="none"/>
     </w:r>
@@ -25446,51 +25294,25 @@
     <w:pPr>
       <w:pStyle w:val="Header"/>
     </w:pPr>
-    <w:r>
-      <w:fldChar w:fldCharType="begin"/>
-    </w:r>
-    <w:r>
-      <w:instrText>STYLEREF  "Z-Line R 2"  \* MERGEFORMAT</w:instrText>
-    </w:r>
-    <w:r>
-      <w:fldChar w:fldCharType="separate"/>
-    </w:r>
-    <w:r>
-      <w:rPr>
-        <w:noProof/>
-      </w:rPr>
-      <w:t>jjj</w:t>
-    </w:r>
-    <w:r>
-      <w:rPr>
-        <w:noProof/>
-      </w:rPr>
-      <w:fldChar w:fldCharType="end"/>
-    </w:r>
+    <w:fldSimple w:instr="STYLEREF  &quot;Z-Line R 2&quot;  \* MERGEFORMAT">
+      <w:r>
+        <w:rPr>
+          <w:noProof/>
+        </w:rPr>
+        <w:t>jjj</w:t>
+      </w:r>
+    </w:fldSimple>
     <w:r>
       <w:ptab w:relativeTo="margin" w:alignment="right" w:leader="none"/>
     </w:r>
-    <w:r>
-      <w:fldChar w:fldCharType="begin"/>
-    </w:r>
-    <w:r>
-      <w:instrText>STYLEREF  "Z-Line R 4"  \* MERGEFORMAT</w:instrText>
-    </w:r>
-    <w:r>
-      <w:fldChar w:fldCharType="separate"/>
-    </w:r>
-    <w:r>
-      <w:rPr>
-        <w:noProof/>
-      </w:rPr>
-      <w:t>jkjkhjk</w:t>
-    </w:r>
-    <w:r>
-      <w:rPr>
-        <w:noProof/>
-      </w:rPr>
-      <w:fldChar w:fldCharType="end"/>
-    </w:r>
+    <w:fldSimple w:instr="STYLEREF  &quot;Z-Line R 4&quot;  \* MERGEFORMAT">
+      <w:r>
+        <w:rPr>
+          <w:noProof/>
+        </w:rPr>
+        <w:t>jkjkhjk</w:t>
+      </w:r>
+    </w:fldSimple>
   </w:p>
 </w:hdr>
 </file>
@@ -54711,10 +54533,18 @@
 
 <file path=customXml/item1.xml><?xml version="1.0" encoding="utf-8"?>
 <?mso-contentType ?>
-<SharedContentType xmlns="Microsoft.SharePoint.Taxonomy.ContentTypeSync" SourceId="1ee89e71-04cd-405e-9ca3-99e020c1694d" ContentTypeId="0x0101" PreviousValue="false"/>
+<FormTemplates xmlns="http://schemas.microsoft.com/sharepoint/v3/contenttype/forms">
+  <Display>DocumentLibraryForm</Display>
+  <Edit>DocumentLibraryForm</Edit>
+  <New>DocumentLibraryForm</New>
+</FormTemplates>
 </file>
 
 <file path=customXml/item2.xml><?xml version="1.0" encoding="utf-8"?>
+<b:Sources xmlns:b="http://schemas.openxmlformats.org/officeDocument/2006/bibliography" xmlns="http://schemas.openxmlformats.org/officeDocument/2006/bibliography" SelectedStyle="\APASixthEditionOfficeOnline.xsl" StyleName="APA" Version="6"/>
+</file>
+
+<file path=customXml/item3.xml><?xml version="1.0" encoding="utf-8"?>
 <p:properties xmlns:p="http://schemas.microsoft.com/office/2006/metadata/properties" xmlns:xsi="http://www.w3.org/2001/XMLSchema-instance" xmlns:pc="http://schemas.microsoft.com/office/infopath/2007/PartnerControls">
   <documentManagement>
     <Keyword xmlns="44a56295-c29e-4898-8136-a54736c65b82" xsi:nil="true"/>
@@ -54727,17 +54557,9 @@
 </p:properties>
 </file>
 
-<file path=customXml/item3.xml><?xml version="1.0" encoding="utf-8"?>
-<b:Sources xmlns:b="http://schemas.openxmlformats.org/officeDocument/2006/bibliography" xmlns="http://schemas.openxmlformats.org/officeDocument/2006/bibliography" SelectedStyle="\APASixthEditionOfficeOnline.xsl" StyleName="APA" Version="6"/>
-</file>
-
 <file path=customXml/item4.xml><?xml version="1.0" encoding="utf-8"?>
 <?mso-contentType ?>
-<FormTemplates xmlns="http://schemas.microsoft.com/sharepoint/v3/contenttype/forms">
-  <Display>DocumentLibraryForm</Display>
-  <Edit>DocumentLibraryForm</Edit>
-  <New>DocumentLibraryForm</New>
-</FormTemplates>
+<SharedContentType xmlns="Microsoft.SharePoint.Taxonomy.ContentTypeSync" SourceId="1ee89e71-04cd-405e-9ca3-99e020c1694d" ContentTypeId="0x0101" PreviousValue="false"/>
 </file>
 
 <file path=customXml/item5.xml><?xml version="1.0" encoding="utf-8"?>
@@ -54957,14 +54779,22 @@
 </file>
 
 <file path=customXml/itemProps1.xml><?xml version="1.0" encoding="utf-8"?>
-<ds:datastoreItem xmlns:ds="http://schemas.openxmlformats.org/officeDocument/2006/customXml" ds:itemID="{8EF5C56D-9B05-4CE4-B93C-919EF597165D}">
+<ds:datastoreItem xmlns:ds="http://schemas.openxmlformats.org/officeDocument/2006/customXml" ds:itemID="{6ADEFE45-D4E9-47EC-8556-818C9058A4BE}">
   <ds:schemaRefs>
-    <ds:schemaRef ds:uri="Microsoft.SharePoint.Taxonomy.ContentTypeSync"/>
+    <ds:schemaRef ds:uri="http://schemas.microsoft.com/sharepoint/v3/contenttype/forms"/>
   </ds:schemaRefs>
 </ds:datastoreItem>
 </file>
 
 <file path=customXml/itemProps2.xml><?xml version="1.0" encoding="utf-8"?>
+<ds:datastoreItem xmlns:ds="http://schemas.openxmlformats.org/officeDocument/2006/customXml" ds:itemID="{0CB43EF1-53E0-4B1B-AB67-503CDEF86374}">
+  <ds:schemaRefs>
+    <ds:schemaRef ds:uri="http://schemas.openxmlformats.org/officeDocument/2006/bibliography"/>
+  </ds:schemaRefs>
+</ds:datastoreItem>
+</file>
+
+<file path=customXml/itemProps3.xml><?xml version="1.0" encoding="utf-8"?>
 <ds:datastoreItem xmlns:ds="http://schemas.openxmlformats.org/officeDocument/2006/customXml" ds:itemID="{A468AB16-E26C-4EEC-963F-FFAE87E41854}">
   <ds:schemaRefs>
     <ds:schemaRef ds:uri="http://schemas.microsoft.com/office/2006/metadata/properties"/>
@@ -54976,18 +54806,10 @@
 </ds:datastoreItem>
 </file>
 
-<file path=customXml/itemProps3.xml><?xml version="1.0" encoding="utf-8"?>
-<ds:datastoreItem xmlns:ds="http://schemas.openxmlformats.org/officeDocument/2006/customXml" ds:itemID="{0CB43EF1-53E0-4B1B-AB67-503CDEF86374}">
+<file path=customXml/itemProps4.xml><?xml version="1.0" encoding="utf-8"?>
+<ds:datastoreItem xmlns:ds="http://schemas.openxmlformats.org/officeDocument/2006/customXml" ds:itemID="{8EF5C56D-9B05-4CE4-B93C-919EF597165D}">
   <ds:schemaRefs>
-    <ds:schemaRef ds:uri="http://schemas.openxmlformats.org/officeDocument/2006/bibliography"/>
-  </ds:schemaRefs>
-</ds:datastoreItem>
-</file>
-
-<file path=customXml/itemProps4.xml><?xml version="1.0" encoding="utf-8"?>
-<ds:datastoreItem xmlns:ds="http://schemas.openxmlformats.org/officeDocument/2006/customXml" ds:itemID="{6ADEFE45-D4E9-47EC-8556-818C9058A4BE}">
-  <ds:schemaRefs>
-    <ds:schemaRef ds:uri="http://schemas.microsoft.com/sharepoint/v3/contenttype/forms"/>
+    <ds:schemaRef ds:uri="Microsoft.SharePoint.Taxonomy.ContentTypeSync"/>
   </ds:schemaRefs>
 </ds:datastoreItem>
 </file>

</xml_diff>

<commit_message>
feat: all the changes till the log is done
</commit_message>
<xml_diff>
--- a/output/intermediate/PopPK_Report_merge_TFL_filled_draft-magic.docx
+++ b/output/intermediate/PopPK_Report_merge_TFL_filled_draft-magic.docx
@@ -86,11 +86,9 @@
             <w:pPr>
               <w:pStyle w:val="Z-LineR1"/>
             </w:pPr>
-            <w:proofErr w:type="spellStart"/>
             <w:r>
               <w:t>hhh</w:t>
             </w:r>
-            <w:proofErr w:type="spellEnd"/>
           </w:p>
         </w:tc>
       </w:tr>
@@ -131,11 +129,9 @@
             <w:pPr>
               <w:pStyle w:val="Z-LineR2"/>
             </w:pPr>
-            <w:proofErr w:type="spellStart"/>
             <w:r>
               <w:t>jjj</w:t>
             </w:r>
-            <w:proofErr w:type="spellEnd"/>
           </w:p>
         </w:tc>
       </w:tr>
@@ -176,11 +172,9 @@
             <w:pPr>
               <w:pStyle w:val="Z-LineR3"/>
             </w:pPr>
-            <w:proofErr w:type="spellStart"/>
             <w:r>
               <w:t>jjj</w:t>
             </w:r>
-            <w:proofErr w:type="spellEnd"/>
           </w:p>
         </w:tc>
       </w:tr>
@@ -221,11 +215,9 @@
             <w:pPr>
               <w:pStyle w:val="Z-LineR4"/>
             </w:pPr>
-            <w:proofErr w:type="spellStart"/>
             <w:r>
               <w:t>jkjkhjk</w:t>
             </w:r>
-            <w:proofErr w:type="spellEnd"/>
           </w:p>
         </w:tc>
       </w:tr>
@@ -452,24 +444,6 @@
               <w:rPr>
                 <w:vanish/>
               </w:rPr>
-              <w:t/>
-            </w:r>
-            <w:r>
-              <w:rPr>
-                <w:vanish/>
-              </w:rPr>
-              <w:t/>
-            </w:r>
-            <w:r>
-              <w:rPr>
-                <w:vanish/>
-              </w:rPr>
-              <w:t/>
-            </w:r>
-            <w:r>
-              <w:rPr>
-                <w:vanish/>
-              </w:rPr>
               <w:t>[[INLINE_ID:inl_specify_relevant_scope_including_patient_population_age_etc]]</w:t>
             </w:r>
           </w:p>
@@ -482,24 +456,6 @@
             </w:r>
             <w:r>
               <w:t>{{list all clinical studies used}}</w:t>
-            </w:r>
-            <w:r>
-              <w:rPr>
-                <w:vanish/>
-              </w:rPr>
-              <w:t/>
-            </w:r>
-            <w:r>
-              <w:rPr>
-                <w:vanish/>
-              </w:rPr>
-              <w:t/>
-            </w:r>
-            <w:r>
-              <w:rPr>
-                <w:vanish/>
-              </w:rPr>
-              <w:t/>
             </w:r>
             <w:r>
               <w:rPr>
@@ -712,16 +668,7 @@
                 <w:sz w:val="22"/>
                 <w:szCs w:val="22"/>
               </w:rPr>
-              <w:t xml:space="preserve"> a previously developed model with new data (such as a Phase 3 update), use the template </w:t>
-            </w:r>
-            <w:proofErr w:type="spellStart"/>
-            <w:r>
-              <w:rPr>
-                <w:rFonts w:ascii="Times New Roman" w:hAnsi="Times New Roman"/>
-                <w:sz w:val="22"/>
-                <w:szCs w:val="22"/>
-              </w:rPr>
-              <w:t>PopPK_</w:t>
+              <w:t xml:space="preserve"> a previously developed model with new data (such as a Phase 3 update), use the template PopPK_</w:t>
             </w:r>
             <w:r>
               <w:rPr>
@@ -739,7 +686,6 @@
               </w:rPr>
               <w:t>_ModelUpdate</w:t>
             </w:r>
-            <w:proofErr w:type="spellEnd"/>
           </w:p>
           <w:p>
             <w:pPr>
@@ -989,15 +935,7 @@
               <w:t>should not be modified unless strictly necessary</w:t>
             </w:r>
             <w:r>
-              <w:t xml:space="preserve"> since they have corresponding sections in the templated analysis report and the TFLs are pre-coded within the MERGE </w:t>
-            </w:r>
-            <w:proofErr w:type="spellStart"/>
-            <w:r>
-              <w:t>popPK</w:t>
-            </w:r>
-            <w:proofErr w:type="spellEnd"/>
-            <w:r>
-              <w:t xml:space="preserve"> activity templates.</w:t>
+              <w:t xml:space="preserve"> since they have corresponding sections in the templated analysis report and the TFLs are pre-coded within the MERGE popPK activity templates.</w:t>
             </w:r>
           </w:p>
           <w:p>
@@ -1114,25 +1052,7 @@
                 <w:szCs w:val="22"/>
                 <w:lang w:val="en-US"/>
               </w:rPr>
-              <w:t xml:space="preserve">Refresh all </w:t>
-            </w:r>
-            <w:proofErr w:type="spellStart"/>
-            <w:r>
-              <w:rPr>
-                <w:sz w:val="22"/>
-                <w:szCs w:val="22"/>
-                <w:lang w:val="en-US"/>
-              </w:rPr>
-              <w:t>ToCs</w:t>
-            </w:r>
-            <w:proofErr w:type="spellEnd"/>
-            <w:r>
-              <w:rPr>
-                <w:sz w:val="22"/>
-                <w:szCs w:val="22"/>
-                <w:lang w:val="en-US"/>
-              </w:rPr>
-              <w:t xml:space="preserve"> before finalization.</w:t>
+              <w:t>Refresh all ToCs before finalization.</w:t>
             </w:r>
           </w:p>
           <w:p>
@@ -5230,24 +5150,6 @@
         <w:rPr>
           <w:vanish/>
         </w:rPr>
-        <w:t/>
-      </w:r>
-      <w:r>
-        <w:rPr>
-          <w:vanish/>
-        </w:rPr>
-        <w:t/>
-      </w:r>
-      <w:r>
-        <w:rPr>
-          <w:vanish/>
-        </w:rPr>
-        <w:t/>
-      </w:r>
-      <w:r>
-        <w:rPr>
-          <w:vanish/>
-        </w:rPr>
         <w:t>[[INLINE_ID:inl_study]]</w:t>
       </w:r>
     </w:p>
@@ -6004,24 +5906,6 @@
         <w:rPr>
           <w:vanish/>
         </w:rPr>
-        <w:t/>
-      </w:r>
-      <w:r>
-        <w:rPr>
-          <w:vanish/>
-        </w:rPr>
-        <w:t/>
-      </w:r>
-      <w:r>
-        <w:rPr>
-          <w:vanish/>
-        </w:rPr>
-        <w:t/>
-      </w:r>
-      <w:r>
-        <w:rPr>
-          <w:vanish/>
-        </w:rPr>
         <w:t>[[INLINE_ID:inl_study_and_dose]]</w:t>
       </w:r>
     </w:p>
@@ -6108,24 +5992,6 @@
           <w:fldChar w:fldCharType="end"/>
         </w:r>
       </w:hyperlink>
-      <w:r>
-        <w:rPr>
-          <w:vanish/>
-        </w:rPr>
-        <w:t/>
-      </w:r>
-      <w:r>
-        <w:rPr>
-          <w:vanish/>
-        </w:rPr>
-        <w:t/>
-      </w:r>
-      <w:r>
-        <w:rPr>
-          <w:vanish/>
-        </w:rPr>
-        <w:t/>
-      </w:r>
       <w:r>
         <w:rPr>
           <w:vanish/>
@@ -6859,24 +6725,6 @@
         <w:rPr>
           <w:vanish/>
         </w:rPr>
-        <w:t/>
-      </w:r>
-      <w:r>
-        <w:rPr>
-          <w:vanish/>
-        </w:rPr>
-        <w:t/>
-      </w:r>
-      <w:r>
-        <w:rPr>
-          <w:vanish/>
-        </w:rPr>
-        <w:t/>
-      </w:r>
-      <w:r>
-        <w:rPr>
-          <w:vanish/>
-        </w:rPr>
         <w:t>[[INLINE_ID:inl_study_and_dose]]</w:t>
       </w:r>
     </w:p>
@@ -6973,24 +6821,6 @@
         <w:rPr>
           <w:vanish/>
         </w:rPr>
-        <w:t/>
-      </w:r>
-      <w:r>
-        <w:rPr>
-          <w:vanish/>
-        </w:rPr>
-        <w:t/>
-      </w:r>
-      <w:r>
-        <w:rPr>
-          <w:vanish/>
-        </w:rPr>
-        <w:t/>
-      </w:r>
-      <w:r>
-        <w:rPr>
-          <w:vanish/>
-        </w:rPr>
         <w:t>[[INLINE_ID:inl_study_and_dose]]</w:t>
       </w:r>
     </w:p>
@@ -7076,24 +6906,6 @@
           <w:fldChar w:fldCharType="end"/>
         </w:r>
       </w:hyperlink>
-      <w:r>
-        <w:rPr>
-          <w:vanish/>
-        </w:rPr>
-        <w:t/>
-      </w:r>
-      <w:r>
-        <w:rPr>
-          <w:vanish/>
-        </w:rPr>
-        <w:t/>
-      </w:r>
-      <w:r>
-        <w:rPr>
-          <w:vanish/>
-        </w:rPr>
-        <w:t/>
-      </w:r>
       <w:r>
         <w:rPr>
           <w:vanish/>
@@ -7313,7 +7125,7 @@
             <w:rStyle w:val="Hyperlink"/>
             <w:noProof/>
           </w:rPr>
-          <w:t xml:space="preserve">y}} for Base Mo</w:t>
+          <w:t>y}} for Base Mo</w:t>
         </w:r>
         <w:r>
           <w:rPr>
@@ -7357,48 +7169,6 @@
           <w:fldChar w:fldCharType="end"/>
         </w:r>
       </w:hyperlink>
-      <w:r>
-        <w:rPr>
-          <w:vanish/>
-        </w:rPr>
-        <w:t/>
-      </w:r>
-      <w:r>
-        <w:rPr>
-          <w:vanish/>
-        </w:rPr>
-        <w:t/>
-      </w:r>
-      <w:r>
-        <w:rPr>
-          <w:vanish/>
-        </w:rPr>
-        <w:t/>
-      </w:r>
-      <w:r>
-        <w:rPr>
-          <w:vanish/>
-        </w:rPr>
-        <w:t/>
-      </w:r>
-      <w:r>
-        <w:rPr>
-          <w:vanish/>
-        </w:rPr>
-        <w:t/>
-      </w:r>
-      <w:r>
-        <w:rPr>
-          <w:vanish/>
-        </w:rPr>
-        <w:t/>
-      </w:r>
-      <w:r>
-        <w:rPr>
-          <w:vanish/>
-        </w:rPr>
-        <w:t/>
-      </w:r>
       <w:r>
         <w:rPr>
           <w:vanish/>
@@ -7456,7 +7226,7 @@
             <w:rStyle w:val="Hyperlink"/>
             <w:noProof/>
           </w:rPr>
-          <w:t xml:space="preserve">l funct</w:t>
+          <w:t>l funct</w:t>
         </w:r>
         <w:r>
           <w:rPr>
@@ -7471,7 +7241,7 @@
             <w:rStyle w:val="Hyperlink"/>
             <w:noProof/>
           </w:rPr>
-          <w:t xml:space="preserve">normalized}} Concentration versus Time af</w:t>
+          <w:t>normalized}} Concentration versus Time af</w:t>
         </w:r>
         <w:r>
           <w:rPr>
@@ -7486,7 +7256,7 @@
             <w:rStyle w:val="Hyperlink"/>
             <w:noProof/>
           </w:rPr>
-          <w:t xml:space="preserve">l function}} fo</w:t>
+          <w:t>l function}} fo</w:t>
         </w:r>
         <w:r>
           <w:rPr>
@@ -7530,48 +7300,6 @@
           <w:fldChar w:fldCharType="end"/>
         </w:r>
       </w:hyperlink>
-      <w:r>
-        <w:rPr>
-          <w:vanish/>
-        </w:rPr>
-        <w:t/>
-      </w:r>
-      <w:r>
-        <w:rPr>
-          <w:vanish/>
-        </w:rPr>
-        <w:t/>
-      </w:r>
-      <w:r>
-        <w:rPr>
-          <w:vanish/>
-        </w:rPr>
-        <w:t/>
-      </w:r>
-      <w:r>
-        <w:rPr>
-          <w:vanish/>
-        </w:rPr>
-        <w:t/>
-      </w:r>
-      <w:r>
-        <w:rPr>
-          <w:vanish/>
-        </w:rPr>
-        <w:t/>
-      </w:r>
-      <w:r>
-        <w:rPr>
-          <w:vanish/>
-        </w:rPr>
-        <w:t/>
-      </w:r>
-      <w:r>
-        <w:rPr>
-          <w:vanish/>
-        </w:rPr>
-        <w:t/>
-      </w:r>
       <w:r>
         <w:rPr>
           <w:vanish/>
@@ -9333,24 +9061,6 @@
               <w:rPr>
                 <w:vanish/>
               </w:rPr>
-              <w:t/>
-            </w:r>
-            <w:r>
-              <w:rPr>
-                <w:vanish/>
-              </w:rPr>
-              <w:t/>
-            </w:r>
-            <w:r>
-              <w:rPr>
-                <w:vanish/>
-              </w:rPr>
-              <w:t/>
-            </w:r>
-            <w:r>
-              <w:rPr>
-                <w:vanish/>
-              </w:rPr>
               <w:t>[[INLINE_ID:inl_title_of_mar]]</w:t>
             </w:r>
           </w:p>
@@ -10427,7 +10137,6 @@
             <w:pPr>
               <w:pStyle w:val="TableLeft"/>
             </w:pPr>
-            <w:proofErr w:type="spellStart"/>
             <w:r>
               <w:rPr>
                 <w:lang w:val="en-US"/>
@@ -10441,7 +10150,6 @@
               </w:rPr>
               <w:t>max</w:t>
             </w:r>
-            <w:proofErr w:type="spellEnd"/>
           </w:p>
         </w:tc>
         <w:tc>
@@ -10473,7 +10181,6 @@
             <w:pPr>
               <w:pStyle w:val="TableLeft"/>
             </w:pPr>
-            <w:proofErr w:type="spellStart"/>
             <w:r>
               <w:rPr>
                 <w:lang w:val="en-US"/>
@@ -10487,7 +10194,6 @@
               </w:rPr>
               <w:t>trough</w:t>
             </w:r>
-            <w:proofErr w:type="spellEnd"/>
           </w:p>
         </w:tc>
         <w:tc>
@@ -11272,14 +10978,12 @@
             <w:pPr>
               <w:pStyle w:val="TableLeft"/>
             </w:pPr>
-            <w:proofErr w:type="spellStart"/>
             <w:r>
               <w:rPr>
                 <w:lang w:val="en-US"/>
               </w:rPr>
               <w:t>popPK</w:t>
             </w:r>
-            <w:proofErr w:type="spellEnd"/>
           </w:p>
         </w:tc>
         <w:tc>
@@ -11736,7 +11440,6 @@
             <w:pPr>
               <w:pStyle w:val="TableLeft"/>
             </w:pPr>
-            <w:proofErr w:type="spellStart"/>
             <w:r>
               <w:rPr>
                 <w:lang w:val="en-US"/>
@@ -11750,7 +11453,6 @@
               </w:rPr>
               <w:t>max</w:t>
             </w:r>
-            <w:proofErr w:type="spellEnd"/>
           </w:p>
         </w:tc>
         <w:tc>
@@ -11819,19 +11521,11 @@
             <w:pPr>
               <w:pStyle w:val="TableLeft"/>
             </w:pPr>
-            <w:proofErr w:type="spellStart"/>
             <w:r>
               <w:rPr>
                 <w:lang w:val="en-US"/>
               </w:rPr>
-              <w:t>Vc</w:t>
-            </w:r>
-            <w:proofErr w:type="spellEnd"/>
-            <w:r>
-              <w:rPr>
-                <w:lang w:val="en-US"/>
-              </w:rPr>
-              <w:t>/F</w:t>
+              <w:t>Vc/F</w:t>
             </w:r>
           </w:p>
         </w:tc>
@@ -11864,19 +11558,11 @@
             <w:pPr>
               <w:pStyle w:val="TableLeft"/>
             </w:pPr>
-            <w:proofErr w:type="spellStart"/>
             <w:r>
               <w:rPr>
                 <w:lang w:val="en-US"/>
               </w:rPr>
-              <w:t>Vp</w:t>
-            </w:r>
-            <w:proofErr w:type="spellEnd"/>
-            <w:r>
-              <w:rPr>
-                <w:lang w:val="en-US"/>
-              </w:rPr>
-              <w:t>/F</w:t>
+              <w:t>Vp/F</w:t>
             </w:r>
           </w:p>
         </w:tc>
@@ -12521,25 +12207,7 @@
                 <w:iCs/>
                 <w:lang w:val="en-US"/>
               </w:rPr>
-              <w:t xml:space="preserve">If developing a joint </w:t>
-            </w:r>
-            <w:proofErr w:type="spellStart"/>
-            <w:r>
-              <w:rPr>
-                <w:i/>
-                <w:iCs/>
-                <w:lang w:val="en-US"/>
-              </w:rPr>
-              <w:t>popPK</w:t>
-            </w:r>
-            <w:proofErr w:type="spellEnd"/>
-            <w:r>
-              <w:rPr>
-                <w:i/>
-                <w:iCs/>
-                <w:lang w:val="en-US"/>
-              </w:rPr>
-              <w:t xml:space="preserve"> E-R MAP, please include efficacy/safety objectives here as well.</w:t>
+              <w:t>If developing a joint popPK E-R MAP, please include efficacy/safety objectives here as well.</w:t>
             </w:r>
           </w:p>
         </w:tc>
@@ -12745,25 +12413,7 @@
                 <w:iCs/>
                 <w:lang w:val="en-US"/>
               </w:rPr>
-              <w:t xml:space="preserve">If developing a joint </w:t>
-            </w:r>
-            <w:proofErr w:type="spellStart"/>
-            <w:r>
-              <w:rPr>
-                <w:i/>
-                <w:iCs/>
-                <w:lang w:val="en-US"/>
-              </w:rPr>
-              <w:t>popPK</w:t>
-            </w:r>
-            <w:proofErr w:type="spellEnd"/>
-            <w:r>
-              <w:rPr>
-                <w:i/>
-                <w:iCs/>
-                <w:lang w:val="en-US"/>
-              </w:rPr>
-              <w:t xml:space="preserve"> E-R MAP, please add a separate table for E/S data (if different from PK).</w:t>
+              <w:t>If developing a joint popPK E-R MAP, please add a separate table for E/S data (if different from PK).</w:t>
             </w:r>
           </w:p>
         </w:tc>
@@ -13099,21 +12749,12 @@
                 <w:lang w:val="en-US"/>
               </w:rPr>
             </w:pPr>
-            <w:proofErr w:type="spellStart"/>
             <w:r>
               <w:rPr>
                 <w:highlight w:val="cyan"/>
                 <w:lang w:val="en-US"/>
               </w:rPr>
-              <w:t>DxxxCxxxxx</w:t>
-            </w:r>
-            <w:proofErr w:type="spellEnd"/>
-            <w:r>
-              <w:rPr>
-                <w:highlight w:val="cyan"/>
-                <w:lang w:val="en-US"/>
-              </w:rPr>
-              <w:t xml:space="preserve"> </w:t>
+              <w:t xml:space="preserve">DxxxCxxxxx </w:t>
             </w:r>
             <w:r>
               <w:rPr>
@@ -13143,17 +12784,8 @@
                 <w:highlight w:val="cyan"/>
                 <w:lang w:val="en-US"/>
               </w:rPr>
-              <w:t>DCO: dd/mm/</w:t>
-            </w:r>
-            <w:proofErr w:type="spellStart"/>
-            <w:r>
-              <w:rPr>
-                <w:highlight w:val="cyan"/>
-                <w:lang w:val="en-US"/>
-              </w:rPr>
-              <w:t>yyyy</w:t>
-            </w:r>
-            <w:proofErr w:type="spellEnd"/>
+              <w:t>DCO: dd/mm/yyyy</w:t>
+            </w:r>
           </w:p>
         </w:tc>
         <w:tc>
@@ -13278,7 +12910,6 @@
                 <w:lang w:val="en-US"/>
               </w:rPr>
             </w:pPr>
-            <w:proofErr w:type="spellStart"/>
             <w:r>
               <w:rPr>
                 <w:highlight w:val="cyan"/>
@@ -13286,7 +12917,6 @@
               </w:rPr>
               <w:t>DxxxCxxxxx</w:t>
             </w:r>
-            <w:proofErr w:type="spellEnd"/>
             <w:r>
               <w:rPr>
                 <w:highlight w:val="cyan"/>
@@ -13315,17 +12945,8 @@
                 <w:highlight w:val="cyan"/>
                 <w:lang w:val="en-US"/>
               </w:rPr>
-              <w:t>DCO: dd/mm/</w:t>
-            </w:r>
-            <w:proofErr w:type="spellStart"/>
-            <w:r>
-              <w:rPr>
-                <w:highlight w:val="cyan"/>
-                <w:lang w:val="en-US"/>
-              </w:rPr>
-              <w:t>yyyy</w:t>
-            </w:r>
-            <w:proofErr w:type="spellEnd"/>
+              <w:t>DCO: dd/mm/yyyy</w:t>
+            </w:r>
           </w:p>
         </w:tc>
         <w:tc>
@@ -13405,7 +13026,6 @@
                 <w:lang w:val="en-US"/>
               </w:rPr>
             </w:pPr>
-            <w:proofErr w:type="spellStart"/>
             <w:r>
               <w:rPr>
                 <w:highlight w:val="cyan"/>
@@ -13421,7 +13041,6 @@
               </w:rPr>
               <w:t>total</w:t>
             </w:r>
-            <w:proofErr w:type="spellEnd"/>
             <w:r>
               <w:rPr>
                 <w:highlight w:val="cyan"/>
@@ -13520,24 +13139,6 @@
                 <w:lang w:val="en-US"/>
               </w:rPr>
               <w:t>{{add any additional studies}}</w:t>
-            </w:r>
-            <w:r>
-              <w:rPr>
-                <w:vanish/>
-              </w:rPr>
-              <w:t/>
-            </w:r>
-            <w:r>
-              <w:rPr>
-                <w:vanish/>
-              </w:rPr>
-              <w:t/>
-            </w:r>
-            <w:r>
-              <w:rPr>
-                <w:vanish/>
-              </w:rPr>
-              <w:t/>
             </w:r>
             <w:r>
               <w:rPr>
@@ -14348,24 +13949,6 @@
         <w:rPr>
           <w:vanish/>
         </w:rPr>
-        <w:t/>
-      </w:r>
-      <w:r>
-        <w:rPr>
-          <w:vanish/>
-        </w:rPr>
-        <w:t/>
-      </w:r>
-      <w:r>
-        <w:rPr>
-          <w:vanish/>
-        </w:rPr>
-        <w:t/>
-      </w:r>
-      <w:r>
-        <w:rPr>
-          <w:vanish/>
-        </w:rPr>
         <w:t>[[INLINE_ID:inl_add_selected_strategy_and_justification]]</w:t>
       </w:r>
     </w:p>
@@ -14518,24 +14101,6 @@
           <w:lang w:val="en-US"/>
         </w:rPr>
         <w:t>{{Add specific considerations/strategies used}}</w:t>
-      </w:r>
-      <w:r>
-        <w:rPr>
-          <w:vanish/>
-        </w:rPr>
-        <w:t/>
-      </w:r>
-      <w:r>
-        <w:rPr>
-          <w:vanish/>
-        </w:rPr>
-        <w:t/>
-      </w:r>
-      <w:r>
-        <w:rPr>
-          <w:vanish/>
-        </w:rPr>
-        <w:t/>
       </w:r>
       <w:r>
         <w:rPr>
@@ -14954,24 +14519,6 @@
         <w:rPr>
           <w:vanish/>
         </w:rPr>
-        <w:t/>
-      </w:r>
-      <w:r>
-        <w:rPr>
-          <w:vanish/>
-        </w:rPr>
-        <w:t/>
-      </w:r>
-      <w:r>
-        <w:rPr>
-          <w:vanish/>
-        </w:rPr>
-        <w:t/>
-      </w:r>
-      <w:r>
-        <w:rPr>
-          <w:vanish/>
-        </w:rPr>
         <w:t>[[INLINE_ID:inl_4]]</w:t>
       </w:r>
     </w:p>
@@ -15453,27 +15000,8 @@
       <w:r>
         <w:rPr>
           <w:b/>
-          <w:color w:val="FF0000" val="FF0000"/>
         </w:rPr>
-        <w:t>&lt;&lt;Name:model run summary|Title:Sachin Patel|Footnote:MISSING_VALUE(Footnote)|Files:106-pk-params.docx|Type:table&gt;&gt;</w:t>
-      </w:r>
-      <w:r>
-        <w:rPr>
-          <w:vanish/>
-        </w:rPr>
-        <w:t/>
-      </w:r>
-      <w:r>
-        <w:rPr>
-          <w:vanish/>
-        </w:rPr>
-        <w:t/>
-      </w:r>
-      <w:r>
-        <w:rPr>
-          <w:vanish/>
-        </w:rPr>
-        <w:t/>
+        <w:t>&lt;&lt;Name:model run summary|Title:Model run summary table|Footnote:Summary of key model run outputs.|Files:106-pk-params.docx|Type:table&gt;&gt;</w:t>
       </w:r>
       <w:r>
         <w:rPr>
@@ -15510,11 +15038,6 @@
         </w:rPr>
         <w:t/>
       </w:r>
-    </w:p>
-    <w:p>
-      <w:pPr>
-        <w:pStyle w:val="Paragraph"/>
-      </w:pPr>
     </w:p>
     <w:p>
       <w:pPr>
@@ -15551,27 +15074,8 @@
       <w:r>
         <w:rPr>
           <w:b/>
-          <w:color w:val="FF0000" val="FF0000"/>
         </w:rPr>
-        <w:t>&lt;&lt;Name:model bootstrap plot|Title:Bootstrap diagnostic plot|Footnote:MISSING_VALUE(Footnote)|Files:106-bootstrap.png|Type:image&gt;&gt;</w:t>
-      </w:r>
-      <w:r>
-        <w:rPr>
-          <w:vanish/>
-        </w:rPr>
-        <w:t/>
-      </w:r>
-      <w:r>
-        <w:rPr>
-          <w:vanish/>
-        </w:rPr>
-        <w:t/>
-      </w:r>
-      <w:r>
-        <w:rPr>
-          <w:vanish/>
-        </w:rPr>
-        <w:t/>
+        <w:t>&lt;&lt;Name:model bootstrap plot|Title:Bootstrap diagnostic plot|Footnote:Bootstrap plot for final model assessment.|Files:106-bootstrap.png|Type:image&gt;&gt;</w:t>
       </w:r>
       <w:r>
         <w:rPr>
@@ -15624,16 +15128,6 @@
         </w:rPr>
         <w:t/>
       </w:r>
-    </w:p>
-    <w:p>
-      <w:pPr>
-        <w:jc w:val="center"/>
-      </w:pPr>
-    </w:p>
-    <w:p>
-      <w:pPr>
-        <w:pStyle w:val="Paragraph"/>
-      </w:pPr>
     </w:p>
     <w:p>
       <w:pPr>
@@ -15814,27 +15308,8 @@
       <w:r>
         <w:rPr>
           <w:b/>
-          <w:color w:val="FF0000" val="FF0000"/>
         </w:rPr>
-        <w:t>&lt;&lt;Name:categorical covariate summary |Title:MISSING_VALUE(Title)|Footnote:MISSING_VALUE(Footnote)|Files:cat-cov-sum-study.docx|Type:table&gt;&gt;</w:t>
-      </w:r>
-      <w:r>
-        <w:rPr>
-          <w:vanish/>
-        </w:rPr>
-        <w:t/>
-      </w:r>
-      <w:r>
-        <w:rPr>
-          <w:vanish/>
-        </w:rPr>
-        <w:t/>
-      </w:r>
-      <w:r>
-        <w:rPr>
-          <w:vanish/>
-        </w:rPr>
-        <w:t/>
+        <w:t>&lt;&lt;Name:categorical covariate summary |Title:Categorical covariate summary|Footnote:Categorical covariate distribution by study.|Files:cat-cov-sum-study.docx|Type:table&gt;&gt;</w:t>
       </w:r>
       <w:r>
         <w:rPr>
@@ -15861,7 +15336,6 @@
       </w:r>
       <w:r>
         <w:rPr>
-          <w:color w:val="FF0000"/>
           <w:sz w:val="20"/>
         </w:rPr>
         <w:t/>
@@ -15872,11 +15346,6 @@
         </w:rPr>
         <w:t/>
       </w:r>
-    </w:p>
-    <w:p>
-      <w:pPr>
-        <w:pStyle w:val="Paragraph"/>
-      </w:pPr>
     </w:p>
     <w:p>
       <w:pPr>
@@ -15959,24 +15428,6 @@
         <w:rPr>
           <w:vanish/>
         </w:rPr>
-        <w:t/>
-      </w:r>
-      <w:r>
-        <w:rPr>
-          <w:vanish/>
-        </w:rPr>
-        <w:t/>
-      </w:r>
-      <w:r>
-        <w:rPr>
-          <w:vanish/>
-        </w:rPr>
-        <w:t/>
-      </w:r>
-      <w:r>
-        <w:rPr>
-          <w:vanish/>
-        </w:rPr>
         <w:t>[[INLINE_ID:inl_pa]]</w:t>
       </w:r>
     </w:p>
@@ -16304,32 +15755,38 @@
           <w:szCs w:val="22"/>
           <w:highlight w:val="cyan"/>
         </w:rPr>
-        <w:t>{{Study </w:t>
+        <w:t>{{dose}}</w:t>
       </w:r>
       <w:r>
         <w:rPr>
           <w:sz w:val="22"/>
           <w:szCs w:val="22"/>
         </w:rPr>
-        <w:t xml:space="preserve">an</w:t>
+        <w:t xml:space="preserve">. </w:t>
       </w:r>
       <w:r>
         <w:rPr>
           <w:highlight w:val="cyan"/>
         </w:rPr>
-        <w:t xml:space="preserve">d Dose}}. Sum</w:t>
+        <w:t xml:space="preserve">Summaries by </w:t>
       </w:r>
       <w:r>
         <w:rPr>
           <w:highlight w:val="cyan"/>
         </w:rPr>
-        <w:t>maries by {{Study </w:t>
+        <w:t>{{dose}}</w:t>
       </w:r>
       <w:r>
         <w:rPr>
           <w:highlight w:val="cyan"/>
         </w:rPr>
-        <w:t xml:space="preserve">and Dose}} are pr</w:t>
+        <w:t xml:space="preserve"> are provi</w:t>
+      </w:r>
+      <w:r>
+        <w:rPr>
+          <w:highlight w:val="cyan"/>
+        </w:rPr>
+        <w:t>ded in Appendix D</w:t>
       </w:r>
       <w:r>
         <w:rPr>
@@ -16358,7 +15815,7 @@
         <w:rPr>
           <w:highlight w:val="cyan"/>
         </w:rPr>
-        <w:t>ovided in </w:t>
+        <w:t>, Table D1</w:t>
       </w:r>
       <w:r>
         <w:rPr>
@@ -16370,7 +15827,7 @@
         <w:rPr>
           <w:highlight w:val="cyan"/>
         </w:rPr>
-        <w:t xml:space="preserve">Ap</w:t>
+        <w:t>.</w:t>
       </w:r>
       <w:r>
         <w:rPr>
@@ -16396,15 +15853,6 @@
         <w:fldChar w:fldCharType="separate"/>
       </w:r>
       <w:r>
-        <w:t>pendix</w:t>
-      </w:r>
-      <w:r>
-        <w:rPr>
-          <w:noProof/>
-        </w:rPr>
-        <w:t> D</w:t>
-      </w:r>
-      <w:r>
         <w:rPr>
           <w:highlight w:val="cyan"/>
         </w:rPr>
@@ -16412,45 +15860,15 @@
       </w:r>
       <w:r>
         <w:rPr>
-          <w:highlight w:val="cyan"/>
+          <w:vanish/>
         </w:rPr>
-        <w:t>, Table D1.</w:t>
+        <w:t/>
       </w:r>
       <w:r>
         <w:rPr>
           <w:vanish/>
         </w:rPr>
-        <w:t/>
-      </w:r>
-      <w:r>
-        <w:rPr>
-          <w:vanish/>
-        </w:rPr>
-        <w:t/>
-      </w:r>
-      <w:r>
-        <w:rPr>
-          <w:vanish/>
-        </w:rPr>
-        <w:t/>
-      </w:r>
-      <w:r>
-        <w:rPr>
-          <w:vanish/>
-        </w:rPr>
-        <w:t/>
-      </w:r>
-      <w:r>
-        <w:rPr>
-          <w:vanish/>
-        </w:rPr>
-        <w:t/>
-      </w:r>
-      <w:r>
-        <w:rPr>
-          <w:vanish/>
-        </w:rPr>
-        <w:t>[[INLINE_ID:inl_study_and_dose]]</w:t>
+        <w:t>[[INLINE_ID:inl_dose]]</w:t>
       </w:r>
     </w:p>
     <w:p>
@@ -17959,7 +17377,6 @@
         <w:pStyle w:val="TableFootnoteInfo"/>
       </w:pPr>
       <w:r>
-        <w:lastRenderedPageBreak/>
         <w:t xml:space="preserve">Source activity: </w:t>
       </w:r>
     </w:p>
@@ -17976,17 +17393,13 @@
         <w:pStyle w:val="TableFootnoteInfo"/>
       </w:pPr>
       <w:r>
-        <w:t xml:space="preserve">Source code: </w:t>
-      </w:r>
-      <w:proofErr w:type="spellStart"/>
-      <w:r>
-        <w:t>eda-</w:t>
+        <w:lastRenderedPageBreak/>
+        <w:t>Source code: eda-</w:t>
       </w:r>
       <w:proofErr w:type="gramStart"/>
       <w:r>
         <w:t>tables.R</w:t>
       </w:r>
-      <w:proofErr w:type="spellEnd"/>
       <w:proofErr w:type="gramEnd"/>
     </w:p>
     <w:p>
@@ -17994,15 +17407,7 @@
         <w:pStyle w:val="TableFootnoteInfo"/>
       </w:pPr>
       <w:r>
-        <w:t>Source file: results/table/</w:t>
-      </w:r>
-      <w:proofErr w:type="spellStart"/>
-      <w:r>
-        <w:t>eda</w:t>
-      </w:r>
-      <w:proofErr w:type="spellEnd"/>
-      <w:r>
-        <w:t>/pk-data-sum-dose.docx</w:t>
+        <w:t>Source file: results/table/eda/pk-data-sum-dose.docx</w:t>
       </w:r>
     </w:p>
     <w:p>
@@ -18028,124 +17433,106 @@
         <w:rPr>
           <w:highlight w:val="cyan"/>
         </w:rPr>
-        <w:t>{{Add</w:t>
+        <w:t>{{Add any relevant observation across selected strata for table}}</w:t>
       </w:r>
       <w:r>
         <w:rPr>
           <w:highlight w:val="cyan"/>
         </w:rPr>
-        <w:t xml:space="preserve"> any relevant</w:t>
-      </w:r>
-      <w:r>
-        <w:t xml:space="preserve"> observation acro</w:t>
+        <w:t xml:space="preserve"> plasma/blood PK samples fr</w:t>
       </w:r>
       <w:r>
         <w:rPr>
           <w:highlight w:val="cyan"/>
         </w:rPr>
-        <w:t>ss se</w:t>
+        <w:t xml:space="preserve">om </w:t>
       </w:r>
       <w:r>
         <w:rPr>
           <w:highlight w:val="cyan"/>
         </w:rPr>
-        <w:t xml:space="preserve">l</w:t>
+        <w:t>{{n}}</w:t>
       </w:r>
       <w:r>
         <w:rPr>
           <w:highlight w:val="cyan"/>
         </w:rPr>
-        <w:t>ected st</w:t>
-      </w:r>
-      <w:r>
-        <w:t xml:space="preserve">rata for table</w:t>
+        <w:t>p</w:t>
       </w:r>
       <w:r>
         <w:rPr>
           <w:highlight w:val="cyan"/>
         </w:rPr>
-        <w:t xml:space="preserve">}} plasma/blood PK samples fr</w:t>
+        <w:t>atie</w:t>
       </w:r>
       <w:r>
         <w:rPr>
           <w:highlight w:val="cyan"/>
         </w:rPr>
-        <w:t xml:space="preserve">o</w:t>
+        <w:t>nt</w:t>
       </w:r>
       <w:r>
         <w:rPr>
           <w:highlight w:val="cyan"/>
         </w:rPr>
-        <w:t>m {{n}} p</w:t>
+        <w:t>stre</w:t>
       </w:r>
       <w:r>
         <w:rPr>
           <w:highlight w:val="cyan"/>
         </w:rPr>
-        <w:t xml:space="preserve">atie</w:t>
+        <w:t>at</w:t>
+      </w:r>
+      <w:r>
+        <w:t xml:space="preserve">ed with AZDXXX across dose levels of  </w:t>
+      </w:r>
+      <w:r>
+        <w:t>{{XX mg}}</w:t>
+      </w:r>
+      <w:r>
+        <w:t xml:space="preserve"> </w:t>
       </w:r>
       <w:r>
         <w:rPr>
           <w:highlight w:val="cyan"/>
         </w:rPr>
-        <w:t>nts treat</w:t>
-      </w:r>
-      <w:r>
-        <w:t xml:space="preserve">ed with AZDXXX across dose levels of  {{XX mg}} </w:t>
+        <w:t>to</w:t>
       </w:r>
       <w:r>
         <w:rPr>
           <w:highlight w:val="cyan"/>
         </w:rPr>
-        <w:t>to {{XX mg}} were available for inclusion in this analysis. {{Add any relevant observation across selected strata for table}}</w:t>
+        <w:t xml:space="preserve"> </w:t>
       </w:r>
       <w:r>
         <w:rPr>
-          <w:vanish/>
+          <w:highlight w:val="cyan"/>
         </w:rPr>
-        <w:t/>
+        <w:t>{{XX mg}}</w:t>
       </w:r>
       <w:r>
         <w:rPr>
-          <w:vanish/>
+          <w:highlight w:val="cyan"/>
         </w:rPr>
-        <w:t/>
+        <w:t xml:space="preserve"> were available for inclusion in this ana</w:t>
       </w:r>
       <w:r>
         <w:rPr>
-          <w:vanish/>
+          <w:highlight w:val="cyan"/>
         </w:rPr>
-        <w:t/>
+        <w:t xml:space="preserve">lysis. </w:t>
       </w:r>
       <w:r>
         <w:rPr>
-          <w:vanish/>
+          <w:highlight w:val="cyan"/>
         </w:rPr>
-        <w:t/>
+        <w:t>{{Add any relevant observation across selected strata for table}}</w:t>
       </w:r>
       <w:r>
         <w:rPr>
-          <w:vanish/>
+          <w:highlight w:val="cyan"/>
         </w:rPr>
-        <w:t/>
-      </w:r>
-      <w:r>
-        <w:rPr>
-          <w:vanish/>
-        </w:rPr>
-        <w:t/>
-      </w:r>
-      <w:r>
-        <w:rPr>
-          <w:vanish/>
-        </w:rPr>
-        <w:t/>
-      </w:r>
-      <w:r>
-        <w:rPr>
-          <w:vanish/>
-        </w:rPr>
-        <w:t/>
+        <w:t xml:space="preserve">. </w:t>
       </w:r>
       <w:r>
         <w:rPr>
@@ -18346,29 +17733,7 @@
                   <w:szCs w:val="22"/>
                   <w:u w:val="single"/>
                 </w:rPr>
-                <w:t xml:space="preserve">General Considerations for Tables, Figures, Listings (TFL) for </w:t>
-              </w:r>
-              <w:proofErr w:type="spellStart"/>
-              <w:r>
-                <w:rPr>
-                  <w:rStyle w:val="cf01"/>
-                  <w:color w:val="0000FF"/>
-                  <w:sz w:val="22"/>
-                  <w:szCs w:val="22"/>
-                  <w:u w:val="single"/>
-                </w:rPr>
-                <w:t>popPK</w:t>
-              </w:r>
-              <w:proofErr w:type="spellEnd"/>
-              <w:r>
-                <w:rPr>
-                  <w:rStyle w:val="cf01"/>
-                  <w:color w:val="0000FF"/>
-                  <w:sz w:val="22"/>
-                  <w:szCs w:val="22"/>
-                  <w:u w:val="single"/>
-                </w:rPr>
-                <w:t xml:space="preserve"> reports from Clinical Pharmacology &amp; Quantitative Pharmacology CPQP</w:t>
+                <w:t>General Considerations for Tables, Figures, Listings (TFL) for popPK reports from Clinical Pharmacology &amp; Quantitative Pharmacology CPQP</w:t>
               </w:r>
             </w:hyperlink>
           </w:p>
@@ -18536,27 +17901,22 @@
       <w:r>
         <w:rPr>
           <w:b/>
-          <w:color w:val="FF0000"/>
         </w:rPr>
-        <w:t>&lt;&lt;Name:eta pairs|Title:MISSING_VALUE(Title)|Footnote:Pairwise ETA relationship overview.|Files:cont-vs-cont.png|Type:image&gt;&gt;</w:t>
-      </w:r>
+        <w:t xml:space="preserve">&lt;&lt;Name:eta pa</w:t>
+      </w:r>
+      <w:proofErr w:type="gramStart"/>
       <w:r>
         <w:rPr>
-          <w:vanish/>
+          <w:b/>
         </w:rPr>
-        <w:t/>
-      </w:r>
+        <w:t>irs|Title:ETA pairwise jkhjkhjkhjkhj</w:t>
+      </w:r>
+      <w:proofErr w:type="gramEnd"/>
       <w:r>
         <w:rPr>
-          <w:vanish/>
+          <w:b/>
         </w:rPr>
-        <w:t/>
-      </w:r>
-      <w:r>
-        <w:rPr>
-          <w:vanish/>
-        </w:rPr>
-        <w:t/>
+        <w:t xml:space="preserve">khjkhj  hjkhhkhkjhjkhkj hjhjkhjkh plot|Footnote:Pairwise ETA relationship overview.|Files:cont-vs-cont.png|Type:image&gt;&gt;</w:t>
       </w:r>
       <w:r>
         <w:rPr>
@@ -18610,16 +17970,6 @@
         </w:rPr>
         <w:t/>
       </w:r>
-    </w:p>
-    <w:p>
-      <w:pPr>
-        <w:jc w:val="center"/>
-      </w:pPr>
-    </w:p>
-    <w:p>
-      <w:pPr>
-        <w:pStyle w:val="Paragraph"/>
-      </w:pPr>
     </w:p>
     <w:p>
       <w:pPr>
@@ -18681,24 +18031,6 @@
         <w:t>{{Study}}</w:t>
       </w:r>
       <w:bookmarkEnd w:id="103"/>
-      <w:r>
-        <w:rPr>
-          <w:vanish/>
-        </w:rPr>
-        <w:t/>
-      </w:r>
-      <w:r>
-        <w:rPr>
-          <w:vanish/>
-        </w:rPr>
-        <w:t/>
-      </w:r>
-      <w:r>
-        <w:rPr>
-          <w:vanish/>
-        </w:rPr>
-        <w:t/>
-      </w:r>
       <w:r>
         <w:rPr>
           <w:vanish/>
@@ -20211,17 +19543,12 @@
         <w:pStyle w:val="TableFootnoteInfo"/>
       </w:pPr>
       <w:r>
-        <w:t xml:space="preserve">Source code: </w:t>
-      </w:r>
-      <w:proofErr w:type="spellStart"/>
-      <w:r>
-        <w:t>eda-</w:t>
+        <w:t>Source code: eda-</w:t>
       </w:r>
       <w:proofErr w:type="gramStart"/>
       <w:r>
         <w:t>tables.R</w:t>
       </w:r>
-      <w:proofErr w:type="spellEnd"/>
       <w:proofErr w:type="gramEnd"/>
     </w:p>
     <w:p>
@@ -20229,15 +19556,7 @@
         <w:pStyle w:val="TableFootnoteInfo"/>
       </w:pPr>
       <w:r>
-        <w:t>Source file: results/table/</w:t>
-      </w:r>
-      <w:proofErr w:type="spellStart"/>
-      <w:r>
-        <w:t>eda</w:t>
-      </w:r>
-      <w:proofErr w:type="spellEnd"/>
-      <w:r>
-        <w:t>/cat-cov-sum-study.docx</w:t>
+        <w:t>Source file: results/table/eda/cat-cov-sum-study.docx</w:t>
       </w:r>
     </w:p>
     <w:p>
@@ -20373,27 +19692,8 @@
         <w:rPr>
           <w:b/>
           <w:sz w:val="24"/>
-          <w:color w:val="FF0000"/>
         </w:rPr>
-        <w:t>&lt;&lt;Name:studies|Title:MISSING_VALUE(Title)|Footnote:List of studies included in analysis.|Files:MISSING_VALUE(Files)|Type:table&gt;&gt;</w:t>
-      </w:r>
-      <w:r>
-        <w:rPr>
-          <w:vanish/>
-        </w:rPr>
-        <w:t/>
-      </w:r>
-      <w:r>
-        <w:rPr>
-          <w:vanish/>
-        </w:rPr>
-        <w:t/>
-      </w:r>
-      <w:r>
-        <w:rPr>
-          <w:vanish/>
-        </w:rPr>
-        <w:t/>
+        <w:t>&lt;&lt;Name:studies|Title:Clinical studies listing|Footnote:List of studies included in analysis.|Files:pk-data-sum-dose-study.docx|Type:table&gt;&gt;</w:t>
       </w:r>
       <w:r>
         <w:rPr>
@@ -20427,11 +19727,6 @@
         </w:rPr>
         <w:t/>
       </w:r>
-    </w:p>
-    <w:p>
-      <w:pPr>
-        <w:pStyle w:val="TableFootnoteInfo"/>
-      </w:pPr>
     </w:p>
     <w:p>
       <w:pPr>
@@ -20799,24 +20094,6 @@
         <w:rPr>
           <w:vanish/>
         </w:rPr>
-        <w:t/>
-      </w:r>
-      <w:r>
-        <w:rPr>
-          <w:vanish/>
-        </w:rPr>
-        <w:t/>
-      </w:r>
-      <w:r>
-        <w:rPr>
-          <w:vanish/>
-        </w:rPr>
-        <w:t/>
-      </w:r>
-      <w:r>
-        <w:rPr>
-          <w:vanish/>
-        </w:rPr>
         <w:t>[[INLINE_ID:inl_fast_slow]]</w:t>
       </w:r>
     </w:p>
@@ -21037,24 +20314,6 @@
         <w:t xml:space="preserve"> (log scale)</w:t>
       </w:r>
       <w:bookmarkEnd w:id="112"/>
-      <w:r>
-        <w:rPr>
-          <w:vanish/>
-        </w:rPr>
-        <w:t/>
-      </w:r>
-      <w:r>
-        <w:rPr>
-          <w:vanish/>
-        </w:rPr>
-        <w:t/>
-      </w:r>
-      <w:r>
-        <w:rPr>
-          <w:vanish/>
-        </w:rPr>
-        <w:t/>
-      </w:r>
       <w:r>
         <w:rPr>
           <w:vanish/>
@@ -21425,29 +20684,7 @@
                   <w:szCs w:val="22"/>
                   <w:u w:val="single"/>
                 </w:rPr>
-                <w:t xml:space="preserve">General Considerations for Tables, Figures, Listings (TFL) for </w:t>
-              </w:r>
-              <w:proofErr w:type="spellStart"/>
-              <w:r>
-                <w:rPr>
-                  <w:rStyle w:val="cf01"/>
-                  <w:color w:val="0000FF"/>
-                  <w:sz w:val="22"/>
-                  <w:szCs w:val="22"/>
-                  <w:u w:val="single"/>
-                </w:rPr>
-                <w:t>popPK</w:t>
-              </w:r>
-              <w:proofErr w:type="spellEnd"/>
-              <w:r>
-                <w:rPr>
-                  <w:rStyle w:val="cf01"/>
-                  <w:color w:val="0000FF"/>
-                  <w:sz w:val="22"/>
-                  <w:szCs w:val="22"/>
-                  <w:u w:val="single"/>
-                </w:rPr>
-                <w:t xml:space="preserve"> reports from Clinical Pharmacology &amp; Quantitative Pharmacology CPQP</w:t>
+                <w:t>General Considerations for Tables, Figures, Listings (TFL) for popPK reports from Clinical Pharmacology &amp; Quantitative Pharmacology CPQP</w:t>
               </w:r>
             </w:hyperlink>
           </w:p>
@@ -21961,12 +21198,10 @@
       <w:r>
         <w:t>Source code: run-</w:t>
       </w:r>
-      <w:proofErr w:type="spellStart"/>
       <w:proofErr w:type="gramStart"/>
       <w:r>
         <w:t>log.R</w:t>
       </w:r>
-      <w:proofErr w:type="spellEnd"/>
       <w:proofErr w:type="gramEnd"/>
     </w:p>
     <w:p>
@@ -21981,6 +21216,22 @@
       <w:pPr>
         <w:pStyle w:val="Paragraph"/>
       </w:pPr>
+    </w:p>
+    <w:p>
+      <w:pPr>
+        <w:pStyle w:val="Paragraph"/>
+      </w:pPr>
+      <w:r>
+        <w:t xml:space="preserve">Djkfhjsdfajlk </w:t>
+      </w:r>
+      <w:proofErr w:type="gramStart"/>
+      <w:r>
+        <w:t>mghj ,</w:t>
+      </w:r>
+      <w:proofErr w:type="gramEnd"/>
+      <w:r>
+        <w:t xml:space="preserve"> sgeiuhjodsf nksjdfei wefkhwiefj ajoiefn iowjefoij wenfh iuehfjfoj iwef yhiewfjo uwef yiefwu jo</w:t>
+      </w:r>
     </w:p>
     <w:p>
       <w:pPr>
@@ -24780,17 +24031,12 @@
         <w:pStyle w:val="TableFootnoteInfo"/>
       </w:pPr>
       <w:r>
-        <w:t xml:space="preserve">Source code: </w:t>
-      </w:r>
-      <w:proofErr w:type="spellStart"/>
-      <w:r>
-        <w:t>eda-</w:t>
+        <w:t>Source code: eda-</w:t>
       </w:r>
       <w:proofErr w:type="gramStart"/>
       <w:r>
         <w:t>tables.R</w:t>
       </w:r>
-      <w:proofErr w:type="spellEnd"/>
       <w:proofErr w:type="gramEnd"/>
       <w:r>
         <w:t xml:space="preserve"> </w:t>
@@ -24801,15 +24047,7 @@
         <w:pStyle w:val="TableFootnoteInfo"/>
       </w:pPr>
       <w:r>
-        <w:t>Source file: results/table/</w:t>
-      </w:r>
-      <w:proofErr w:type="spellStart"/>
-      <w:r>
-        <w:t>eda</w:t>
-      </w:r>
-      <w:proofErr w:type="spellEnd"/>
-      <w:r>
-        <w:t>/pk-data-sum-dose-study.docx</w:t>
+        <w:t>Source file: results/table/eda/pk-data-sum-dose-study.docx</w:t>
       </w:r>
     </w:p>
     <w:p>
@@ -24847,27 +24085,9 @@
       <w:r>
         <w:rPr>
           <w:b/>
-          <w:color w:val="FF0000" val="FF0000"/>
+          <w:color w:val="FF0000"/>
         </w:rPr>
-        <w:t>&lt;&lt;Name:gof cwres |Title:MISSING_VALUE(Title)|Footnote:Spaghetti - Spaghetti -plots of individual PK profiles. Points are observations, lines connect observations from the same participant. Point shape indicate data above or below the quantification limit (XX ng/mL, dashed line)|Files:dn-conc-time-linear.png|Type:image&gt;&gt;</w:t>
-      </w:r>
-      <w:r>
-        <w:rPr>
-          <w:vanish/>
-        </w:rPr>
-        <w:t/>
-      </w:r>
-      <w:r>
-        <w:rPr>
-          <w:vanish/>
-        </w:rPr>
-        <w:t/>
-      </w:r>
-      <w:r>
-        <w:rPr>
-          <w:vanish/>
-        </w:rPr>
-        <w:t/>
+        <w:t>&lt;&lt;Name:gof cwres |Title:GOF Title The same aswlerj sjfd seoijfuowe fjoerfjio ergjioej foiueoru erjiouroi joiruiohergio|Footnote:this smw as above we can do that his amslq3r jlk wefjio jowe ewffioj|Files:MISSING_VALUE(Files)|Type:image&gt;&gt;</w:t>
       </w:r>
       <w:r>
         <w:rPr>
@@ -24888,119 +24108,31 @@
       </w:pPr>
       <w:r>
         <w:rPr>
-          <w:noProof/>
+          <w:vanish/>
         </w:rPr>
-      </w:r>
+        <w:t/>
+      </w:r>
+    </w:p>
+    <w:p>
       <w:r>
         <w:rPr>
           <w:vanish/>
         </w:rPr>
         <w:t/>
       </w:r>
-    </w:p>
-    <w:p>
-      <w:pPr>
-        <w:pStyle w:val="TableFootnoteInfo"/>
+      <w:r>
         <w:rPr>
-          <w:lang w:eastAsia="ja-JP"/>
+          <w:sz w:val="20"/>
         </w:rPr>
-      </w:pPr>
+        <w:t/>
+      </w:r>
       <w:r>
         <w:rPr>
           <w:vanish/>
         </w:rPr>
         <w:t/>
       </w:r>
-      <w:r>
-        <w:rPr>
-          <w:rFonts w:eastAsiaTheme="minorEastAsia"/>
-          <w:lang w:eastAsia="ja-JP"/>
-        </w:rPr>
-        <w:t xml:space="preserve"/>
-      </w:r>
-      <w:r>
-        <w:rPr>
-          <w:rFonts w:eastAsiaTheme="minorEastAsia"/>
-          <w:lang w:eastAsia="ja-JP"/>
-        </w:rPr>
-        <w:t/>
-      </w:r>
-      <w:r>
-        <w:rPr>
-          <w:rFonts w:eastAsiaTheme="minorEastAsia"/>
-          <w:lang w:eastAsia="ja-JP"/>
-        </w:rPr>
-        <w:t xml:space="preserve"/>
-      </w:r>
-      <w:r>
-        <w:rPr>
-          <w:rFonts w:eastAsiaTheme="minorEastAsia"/>
-          <w:lang w:eastAsia="ja-JP"/>
-        </w:rPr>
-        <w:t xml:space="preserve"/>
-      </w:r>
-      <w:r>
-        <w:rPr>
-          <w:rFonts w:eastAsiaTheme="minorEastAsia"/>
-          <w:highlight w:val="cyan"/>
-          <w:lang w:eastAsia="ja-JP"/>
-        </w:rPr>
-        <w:t/>
-      </w:r>
     </w:p>
-    <w:p>
-      <w:pPr>
-        <w:pStyle w:val="TableFootnoteInfo"/>
-        <w:rPr>
-          <w:lang w:eastAsia="ja-JP"/>
-        </w:rPr>
-      </w:pPr>
-      <w:r>
-        <w:rPr>
-          <w:rFonts w:eastAsiaTheme="minorEastAsia"/>
-          <w:lang w:eastAsia="ja-JP"/>
-        </w:rPr>
-        <w:t xml:space="preserve">plots of individual PK profiles. Points are observations, lines connect observations from the same participant. </w:t>
-      </w:r>
-      <w:r>
-        <w:rPr>
-          <w:rFonts w:eastAsiaTheme="minorEastAsia"/>
-          <w:highlight w:val="cyan"/>
-          <w:lang w:eastAsia="ja-JP"/>
-        </w:rPr>
-        <w:t>Point shape indicate data above or below the quantification limit (XX ng/mL, dashed line)</w:t>
-      </w:r>
-    </w:p>
-    <w:p>
-      <w:pPr>
-        <w:pStyle w:val="TableFootnoteInfo"/>
-        <w:rPr>
-          <w:lang w:eastAsia="ja-JP"/>
-        </w:rPr>
-      </w:pPr>
-      <w:r>
-        <w:rPr>
-          <w:rFonts w:eastAsiaTheme="minorEastAsia"/>
-          <w:lang w:eastAsia="ja-JP"/>
-        </w:rPr>
-        <w:t xml:space="preserve"> -plots of individual PK profiles. Points are observations, lines connect observations from the same participant. </w:t>
-      </w:r>
-      <w:r>
-        <w:rPr>
-          <w:rFonts w:eastAsiaTheme="minorEastAsia"/>
-          <w:highlight w:val="cyan"/>
-          <w:lang w:eastAsia="ja-JP"/>
-        </w:rPr>
-        <w:t>Point shape indicate data above or below the quantification limit (XX ng/mL, dashed line)</w:t>
-      </w:r>
-    </w:p>
-    <w:p/>
-    <w:p>
-      <w:pPr>
-        <w:jc w:val="center"/>
-      </w:pPr>
-    </w:p>
-    <w:p/>
     <w:sectPr>
       <w:pgSz w:w="12242" w:h="15842" w:code="1"/>
       <w:pgMar w:top="1440" w:right="1440" w:bottom="1440" w:left="1701" w:header="709" w:footer="709" w:gutter="0"/>

</xml_diff>

<commit_message>
fix: extraction of pagination tag
</commit_message>
<xml_diff>
--- a/output/intermediate/PopPK_Report_merge_TFL_filled_draft-magic.docx
+++ b/output/intermediate/PopPK_Report_merge_TFL_filled_draft-magic.docx
@@ -474,12 +474,6 @@
               <w:rPr>
                 <w:vanish/>
               </w:rPr>
-              <w:t/>
-            </w:r>
-            <w:r>
-              <w:rPr>
-                <w:vanish/>
-              </w:rPr>
               <w:t>[[INLINE_ID:inl_specify_relevant_scope_including_patient_population_age_etc]]</w:t>
             </w:r>
           </w:p>
@@ -498,12 +492,6 @@
             </w:r>
             <w:r>
               <w:t>}}</w:t>
-            </w:r>
-            <w:r>
-              <w:rPr>
-                <w:vanish/>
-              </w:rPr>
-              <w:t/>
             </w:r>
             <w:r>
               <w:rPr>
@@ -5192,12 +5180,6 @@
         <w:rPr>
           <w:vanish/>
         </w:rPr>
-        <w:t/>
-      </w:r>
-      <w:r>
-        <w:rPr>
-          <w:vanish/>
-        </w:rPr>
         <w:t>[[INLINE_ID:inl_study]]</w:t>
       </w:r>
     </w:p>
@@ -5954,12 +5936,6 @@
         <w:rPr>
           <w:vanish/>
         </w:rPr>
-        <w:t/>
-      </w:r>
-      <w:r>
-        <w:rPr>
-          <w:vanish/>
-        </w:rPr>
         <w:t>[[INLINE_ID:inl_study_and_dose]]</w:t>
       </w:r>
     </w:p>
@@ -6046,12 +6022,6 @@
           <w:fldChar w:fldCharType="end"/>
         </w:r>
       </w:hyperlink>
-      <w:r>
-        <w:rPr>
-          <w:vanish/>
-        </w:rPr>
-        <w:t/>
-      </w:r>
       <w:r>
         <w:rPr>
           <w:vanish/>
@@ -6779,12 +6749,6 @@
         <w:rPr>
           <w:vanish/>
         </w:rPr>
-        <w:t/>
-      </w:r>
-      <w:r>
-        <w:rPr>
-          <w:vanish/>
-        </w:rPr>
         <w:t>[[INLINE_ID:inl_study_and_dose]]</w:t>
       </w:r>
     </w:p>
@@ -6875,12 +6839,6 @@
         <w:rPr>
           <w:vanish/>
         </w:rPr>
-        <w:t/>
-      </w:r>
-      <w:r>
-        <w:rPr>
-          <w:vanish/>
-        </w:rPr>
         <w:t>[[INLINE_ID:inl_study_and_dose]]</w:t>
       </w:r>
     </w:p>
@@ -6966,12 +6924,6 @@
           <w:fldChar w:fldCharType="end"/>
         </w:r>
       </w:hyperlink>
-      <w:r>
-        <w:rPr>
-          <w:vanish/>
-        </w:rPr>
-        <w:t/>
-      </w:r>
       <w:r>
         <w:rPr>
           <w:vanish/>
@@ -7148,14 +7100,14 @@
             <w:noProof/>
             <w:highlight w:val="cyan"/>
           </w:rPr>
-          <w:t>{{Stud</w:t>
+          <w:t>{{pc}}</w:t>
         </w:r>
         <w:r>
           <w:rPr>
             <w:rStyle w:val="Hyperlink"/>
             <w:noProof/>
           </w:rPr>
-          <w:t xml:space="preserve">y}}VPC </w:t>
+          <w:t xml:space="preserve">VPC of </w:t>
         </w:r>
         <w:r>
           <w:rPr>
@@ -7163,14 +7115,14 @@
             <w:noProof/>
             <w:highlight w:val="cyan"/>
           </w:rPr>
-          <w:t>of {{dose-normalize</w:t>
+          <w:t>{{dose-normalized}}</w:t>
         </w:r>
         <w:r>
           <w:rPr>
             <w:rStyle w:val="Hyperlink"/>
             <w:noProof/>
           </w:rPr>
-          <w:t xml:space="preserve">d}} Concentration versus Time after dose </w:t>
+          <w:t xml:space="preserve"> Concentration versus Time after dose by </w:t>
         </w:r>
         <w:r>
           <w:rPr>
@@ -7178,14 +7130,14 @@
             <w:noProof/>
             <w:highlight w:val="cyan"/>
           </w:rPr>
-          <w:t>by {{Stud</w:t>
+          <w:t>{{Study}}</w:t>
         </w:r>
         <w:r>
           <w:rPr>
             <w:rStyle w:val="Hyperlink"/>
             <w:noProof/>
           </w:rPr>
-          <w:t xml:space="preserve">y}} for Base Mo</w:t>
+          <w:t xml:space="preserve"> for Base Model</w:t>
         </w:r>
         <w:r>
           <w:rPr>
@@ -7220,7 +7172,7 @@
           <w:rPr>
             <w:noProof/>
           </w:rPr>
-          <w:t>del46</w:t>
+          <w:t>46</w:t>
         </w:r>
         <w:r>
           <w:rPr>
@@ -7233,19 +7185,7 @@
         <w:rPr>
           <w:vanish/>
         </w:rPr>
-        <w:t/>
-      </w:r>
-      <w:r>
-        <w:rPr>
-          <w:vanish/>
-        </w:rPr>
-        <w:t>[[INLINE_ID:inl_study]]</w:t>
-      </w:r>
-      <w:r>
-        <w:rPr>
-          <w:vanish/>
-        </w:rPr>
-        <w:t>[[INLINE_ID:inl_dose_normalized]]</w:t>
+        <w:t>[[INLINE_ID:inl_pc]][[INLINE_ID:inl_dose_normalized]][[INLINE_ID:inl_study]]</w:t>
       </w:r>
     </w:p>
     <w:p>
@@ -7279,14 +7219,14 @@
             <w:noProof/>
             <w:highlight w:val="cyan"/>
           </w:rPr>
-          <w:t>{{rena</w:t>
+          <w:t>{{pc}}</w:t>
         </w:r>
         <w:r>
           <w:rPr>
             <w:rStyle w:val="Hyperlink"/>
             <w:noProof/>
           </w:rPr>
-          <w:t xml:space="preserve">l funct</w:t>
+          <w:t xml:space="preserve">VPC of </w:t>
         </w:r>
         <w:r>
           <w:rPr>
@@ -7294,14 +7234,14 @@
             <w:noProof/>
             <w:highlight w:val="cyan"/>
           </w:rPr>
-          <w:t>ion}}VPC of {{dose-</w:t>
+          <w:t>{{dose-normalized}}</w:t>
         </w:r>
         <w:r>
           <w:rPr>
             <w:rStyle w:val="Hyperlink"/>
             <w:noProof/>
           </w:rPr>
-          <w:t xml:space="preserve">normalized}} Concentration versus Time af</w:t>
+          <w:t xml:space="preserve"> Concentration versus Time after dose by </w:t>
         </w:r>
         <w:r>
           <w:rPr>
@@ -7309,14 +7249,14 @@
             <w:noProof/>
             <w:highlight w:val="cyan"/>
           </w:rPr>
-          <w:t>ter dose by {{rena</w:t>
+          <w:t>{{renal function}}</w:t>
         </w:r>
         <w:r>
           <w:rPr>
             <w:rStyle w:val="Hyperlink"/>
             <w:noProof/>
           </w:rPr>
-          <w:t xml:space="preserve">l function}} fo</w:t>
+          <w:t xml:space="preserve"> for Base Model</w:t>
         </w:r>
         <w:r>
           <w:rPr>
@@ -7351,7 +7291,7 @@
           <w:rPr>
             <w:noProof/>
           </w:rPr>
-          <w:t>r Base Model47</w:t>
+          <w:t>47</w:t>
         </w:r>
         <w:r>
           <w:rPr>
@@ -7364,19 +7304,7 @@
         <w:rPr>
           <w:vanish/>
         </w:rPr>
-        <w:t/>
-      </w:r>
-      <w:r>
-        <w:rPr>
-          <w:vanish/>
-        </w:rPr>
-        <w:t>[[INLINE_ID:inl_renal_function]]</w:t>
-      </w:r>
-      <w:r>
-        <w:rPr>
-          <w:vanish/>
-        </w:rPr>
-        <w:t>[[INLINE_ID:inl_dose_normalized]]</w:t>
+        <w:t>[[INLINE_ID:inl_pc]][[INLINE_ID:inl_dose_normalized]][[INLINE_ID:inl_renal_function]]</w:t>
       </w:r>
     </w:p>
     <w:p>
@@ -9128,12 +9056,6 @@
                 <w:lang w:val="en-US"/>
               </w:rPr>
               <w:t>{{Title of MAR}}</w:t>
-            </w:r>
-            <w:r>
-              <w:rPr>
-                <w:vanish/>
-              </w:rPr>
-              <w:t/>
             </w:r>
             <w:r>
               <w:rPr>
@@ -13352,12 +13274,6 @@
               <w:rPr>
                 <w:vanish/>
               </w:rPr>
-              <w:t/>
-            </w:r>
-            <w:r>
-              <w:rPr>
-                <w:vanish/>
-              </w:rPr>
               <w:t>[[INLINE_ID:inl_add_any_additional_studies]]</w:t>
             </w:r>
           </w:p>
@@ -14347,12 +14263,6 @@
         <w:rPr>
           <w:vanish/>
         </w:rPr>
-        <w:t/>
-      </w:r>
-      <w:r>
-        <w:rPr>
-          <w:vanish/>
-        </w:rPr>
         <w:t>[[INLINE_ID:inl_add_selected_strategy_and_justification]]</w:t>
       </w:r>
     </w:p>
@@ -14538,12 +14448,6 @@
           <w:highlight w:val="cyan"/>
         </w:rPr>
         <w:t>&gt;&gt;</w:t>
-      </w:r>
-      <w:r>
-        <w:rPr>
-          <w:vanish/>
-        </w:rPr>
-        <w:t/>
       </w:r>
       <w:r>
         <w:rPr>
@@ -14974,12 +14878,6 @@
         <w:rPr>
           <w:vanish/>
         </w:rPr>
-        <w:t/>
-      </w:r>
-      <w:r>
-        <w:rPr>
-          <w:vanish/>
-        </w:rPr>
         <w:t>[[INLINE_ID:inl_4]]</w:t>
       </w:r>
     </w:p>
@@ -15592,12 +15490,6 @@
         <w:rPr>
           <w:vanish/>
         </w:rPr>
-        <w:t/>
-      </w:r>
-      <w:r>
-        <w:rPr>
-          <w:vanish/>
-        </w:rPr>
         <w:t>[[BLOCK_ID:blk_model_run_summary]]</w:t>
       </w:r>
     </w:p>
@@ -15628,12 +15520,6 @@
           <w:lang w:val="en-US"/>
         </w:rPr>
         <w:br w:type="page"/>
-      </w:r>
-      <w:r>
-        <w:rPr>
-          <w:vanish/>
-        </w:rPr>
-        <w:t/>
       </w:r>
       <w:r>
         <w:rPr>
@@ -15868,12 +15754,6 @@
         <w:rPr>
           <w:vanish/>
         </w:rPr>
-        <w:t/>
-      </w:r>
-      <w:r>
-        <w:rPr>
-          <w:vanish/>
-        </w:rPr>
         <w:t>[[BLOCK_ID:blk_categorical_covariate_summary]]</w:t>
       </w:r>
     </w:p>
@@ -16018,12 +15898,6 @@
         <w:rPr>
           <w:vanish/>
         </w:rPr>
-        <w:t/>
-      </w:r>
-      <w:r>
-        <w:rPr>
-          <w:vanish/>
-        </w:rPr>
         <w:t>[[INLINE_ID:inl_pa]]</w:t>
       </w:r>
     </w:p>
@@ -16503,13 +16377,13 @@
         <w:rPr>
           <w:highlight w:val="cyan"/>
         </w:rPr>
-        <w:t>{{dose}} are provi</w:t>
+        <w:t>{{Study and Dose}}</w:t>
       </w:r>
       <w:r>
         <w:rPr>
           <w:highlight w:val="cyan"/>
         </w:rPr>
-        <w:t xml:space="preserve">ded in Appendix D</w:t>
+        <w:t xml:space="preserve"> are provided in </w:t>
       </w:r>
       <w:r>
         <w:rPr>
@@ -16538,7 +16412,7 @@
         <w:rPr>
           <w:highlight w:val="cyan"/>
         </w:rPr>
-        <w:t>, Table D1</w:t>
+        <w:t>Appendix D</w:t>
       </w:r>
       <w:r>
         <w:rPr>
@@ -16550,7 +16424,7 @@
         <w:rPr>
           <w:highlight w:val="cyan"/>
         </w:rPr>
-        <w:t xml:space="preserve">.</w:t>
+        <w:t xml:space="preserve">, </w:t>
       </w:r>
       <w:r>
         <w:rPr>
@@ -16576,13 +16450,13 @@
         <w:fldChar w:fldCharType="separate"/>
       </w:r>
       <w:r>
-        <w:t/>
+        <w:t>Table </w:t>
       </w:r>
       <w:r>
         <w:rPr>
           <w:noProof/>
         </w:rPr>
-        <w:t/>
+        <w:t>D1</w:t>
       </w:r>
       <w:r>
         <w:rPr>
@@ -16594,19 +16468,13 @@
         <w:rPr>
           <w:highlight w:val="cyan"/>
         </w:rPr>
-        <w:t/>
+        <w:t>.</w:t>
       </w:r>
       <w:r>
         <w:rPr>
           <w:vanish/>
         </w:rPr>
-        <w:t/>
-      </w:r>
-      <w:r>
-        <w:rPr>
-          <w:vanish/>
-        </w:rPr>
-        <w:t>[[INLINE_ID:inl_dose]]</w:t>
+        <w:t>[[INLINE_ID:inl_study_and_dose]][[INLINE_ID:inl_dose]]</w:t>
       </w:r>
     </w:p>
     <w:p>
@@ -18202,73 +18070,28 @@
         <w:rPr>
           <w:highlight w:val="cyan"/>
         </w:rPr>
-        <w:t>A</w:t>
+        <w:t>n</w:t>
       </w:r>
       <w:r>
         <w:rPr>
           <w:highlight w:val="cyan"/>
         </w:rPr>
-        <w:t>dd</w:t>
+        <w:t>}}</w:t>
       </w:r>
       <w:r>
         <w:rPr>
           <w:highlight w:val="cyan"/>
         </w:rPr>
-        <w:t xml:space="preserve"> any re</w:t>
+        <w:t xml:space="preserve"> plasma</w:t>
       </w:r>
       <w:r>
         <w:rPr>
           <w:highlight w:val="cyan"/>
         </w:rPr>
-        <w:t>levant</w:t>
-      </w:r>
-      <w:r>
-        <w:t xml:space="preserve"> observation acro</w:t>
-      </w:r>
-      <w:r>
-        <w:rPr>
-          <w:highlight w:val="cyan"/>
-        </w:rPr>
-        <w:t>ss</w:t>
-      </w:r>
-      <w:r>
-        <w:rPr>
-          <w:highlight w:val="cyan"/>
-        </w:rPr>
-        <w:t> </w:t>
-      </w:r>
-      <w:r>
-        <w:rPr>
-          <w:highlight w:val="cyan"/>
-        </w:rPr>
-        <w:t xml:space="preserve">sel</w:t>
-      </w:r>
-      <w:r>
-        <w:rPr>
-          <w:highlight w:val="cyan"/>
-        </w:rPr>
-        <w:t>ected st</w:t>
-      </w:r>
-      <w:r>
-        <w:t xml:space="preserve">rata for table</w:t>
-      </w:r>
-      <w:r>
-        <w:rPr>
-          <w:highlight w:val="cyan"/>
-        </w:rPr>
-        <w:t xml:space="preserve">}} plas</w:t>
-      </w:r>
-      <w:r>
-        <w:rPr>
-          <w:highlight w:val="cyan"/>
-        </w:rPr>
-        <w:t xml:space="preserve">ma/blood PK samples fr</w:t>
-      </w:r>
-      <w:r>
-        <w:rPr>
-          <w:highlight w:val="cyan"/>
-        </w:rPr>
-        <w:t xml:space="preserve">om </w:t>
+        <w:t>/blood</w:t>
+      </w:r>
+      <w:r>
+        <w:t xml:space="preserve"> PK samples from </w:t>
       </w:r>
       <w:r>
         <w:rPr>
@@ -18280,103 +18103,130 @@
         <w:rPr>
           <w:highlight w:val="cyan"/>
         </w:rPr>
-        <w:t xml:space="preserve">n}}</w:t>
+        <w:t>n</w:t>
       </w:r>
       <w:r>
         <w:rPr>
           <w:highlight w:val="cyan"/>
         </w:rPr>
-        <w:t> p</w:t>
+        <w:t xml:space="preserve">}} </w:t>
       </w:r>
       <w:r>
         <w:rPr>
           <w:highlight w:val="cyan"/>
         </w:rPr>
-        <w:t xml:space="preserve">atie</w:t>
+        <w:t>patients</w:t>
+      </w:r>
+      <w:r>
+        <w:t xml:space="preserve"> treated with </w:t>
       </w:r>
       <w:r>
         <w:rPr>
           <w:highlight w:val="cyan"/>
         </w:rPr>
-        <w:t>nt</w:t>
+        <w:t xml:space="preserve">AZDXXX </w:t>
       </w:r>
       <w:r>
         <w:rPr>
           <w:highlight w:val="cyan"/>
         </w:rPr>
-        <w:t>s </w:t>
+        <w:t xml:space="preserve">across dose levels of </w:t>
       </w:r>
       <w:r>
         <w:rPr>
           <w:highlight w:val="cyan"/>
         </w:rPr>
-        <w:t xml:space="preserve">tre</w:t>
+        <w:t xml:space="preserve"> {{</w:t>
       </w:r>
       <w:r>
         <w:rPr>
           <w:highlight w:val="cyan"/>
         </w:rPr>
-        <w:t>at</w:t>
-      </w:r>
-      <w:r>
-        <w:t xml:space="preserve">e</w:t>
-      </w:r>
-      <w:r>
-        <w:t xml:space="preserve">d with AZDXXX across dose levels of  {{XX mg}} </w:t>
+        <w:t>XX</w:t>
       </w:r>
       <w:r>
         <w:rPr>
           <w:highlight w:val="cyan"/>
         </w:rPr>
-        <w:t>to</w:t>
+        <w:t xml:space="preserve"> mg</w:t>
       </w:r>
       <w:r>
         <w:rPr>
           <w:highlight w:val="cyan"/>
         </w:rPr>
-        <w:t> {{XX mg}} were available for inclusion in this ana</w:t>
+        <w:t>}}</w:t>
       </w:r>
       <w:r>
         <w:rPr>
           <w:highlight w:val="cyan"/>
         </w:rPr>
-        <w:t xml:space="preserve">lysis. {{A</w:t>
+        <w:t xml:space="preserve"> to </w:t>
       </w:r>
       <w:r>
         <w:rPr>
           <w:highlight w:val="cyan"/>
         </w:rPr>
-        <w:t>dd</w:t>
+        <w:t>{{</w:t>
       </w:r>
       <w:r>
         <w:rPr>
           <w:highlight w:val="cyan"/>
         </w:rPr>
-        <w:t xml:space="preserve"> any relevant observation across selected strata for table}}. </w:t>
+        <w:t>XX</w:t>
+      </w:r>
+      <w:r>
+        <w:rPr>
+          <w:highlight w:val="cyan"/>
+        </w:rPr>
+        <w:t xml:space="preserve"> mg</w:t>
+      </w:r>
+      <w:r>
+        <w:rPr>
+          <w:highlight w:val="cyan"/>
+        </w:rPr>
+        <w:t>}}</w:t>
+      </w:r>
+      <w:r>
+        <w:t xml:space="preserve"> </w:t>
+      </w:r>
+      <w:r>
+        <w:t xml:space="preserve">were available for inclusion in this analysis. </w:t>
+      </w:r>
+      <w:r>
+        <w:rPr>
+          <w:highlight w:val="cyan"/>
+        </w:rPr>
+        <w:t>{{</w:t>
+      </w:r>
+      <w:r>
+        <w:rPr>
+          <w:highlight w:val="cyan"/>
+        </w:rPr>
+        <w:t>Add any relevant observation across selected strata</w:t>
+      </w:r>
+      <w:r>
+        <w:rPr>
+          <w:highlight w:val="cyan"/>
+        </w:rPr>
+        <w:t xml:space="preserve"> for table</w:t>
+      </w:r>
+      <w:r>
+        <w:rPr>
+          <w:highlight w:val="cyan"/>
+        </w:rPr>
+        <w:t>}}</w:t>
+      </w:r>
+      <w:r>
+        <w:rPr>
+          <w:highlight w:val="cyan"/>
+        </w:rPr>
+        <w:t xml:space="preserve">. </w:t>
       </w:r>
       <w:r>
         <w:rPr>
           <w:vanish/>
         </w:rPr>
-        <w:t/>
-      </w:r>
-      <w:r>
-        <w:rPr>
-          <w:vanish/>
-        </w:rPr>
-        <w:t>[[INLINE_ID:inl_add_any_relevant_observation_across_selected_strata_for_table]]</w:t>
-      </w:r>
-      <w:r>
-        <w:rPr>
-          <w:vanish/>
-        </w:rPr>
-        <w:t>[[INLINE_ID:inl_n]]</w:t>
-      </w:r>
-      <w:r>
-        <w:rPr>
-          <w:vanish/>
-        </w:rPr>
-        <w:t>[[INLINE_ID:inl_xx_mg]]</w:t>
+        <w:t>[[INLINE_ID:inl_n]][[INLINE_ID:inl_xx_mg]][[INLINE_ID:inl_add_any_relevant_observation_across_selected_strata_for_table]]</w:t>
       </w:r>
     </w:p>
     <w:p>
@@ -18809,12 +18659,6 @@
         <w:rPr>
           <w:vanish/>
         </w:rPr>
-        <w:t/>
-      </w:r>
-      <w:r>
-        <w:rPr>
-          <w:vanish/>
-        </w:rPr>
         <w:t>[[BLOCK_ID:blk_eta_pairs]]</w:t>
       </w:r>
     </w:p>
@@ -18894,12 +18738,6 @@
         <w:t>{{Study}}</w:t>
       </w:r>
       <w:bookmarkEnd w:id="103"/>
-      <w:r>
-        <w:rPr>
-          <w:vanish/>
-        </w:rPr>
-        <w:t/>
-      </w:r>
       <w:r>
         <w:rPr>
           <w:vanish/>
@@ -20554,13 +20392,7 @@
         <w:pStyle w:val="TableFootnoteInfo"/>
       </w:pPr>
       <w:r>
-        <w:t>&lt;&lt;Name:studies|Title:Clinical studies listing|Footnote:List of studies included in analysis.|Files:pk-data-sum-dose-study.docx|Type:table&gt;&gt;</w:t>
-      </w:r>
-      <w:r>
-        <w:rPr>
-          <w:vanish/>
-        </w:rPr>
-        <w:t/>
+        <w:t>The diagonal plots show histograms of each covariate across &lt;&lt;Name:studies|Title:Clinical studies listing|Footnote:List of studies included in analysis.|Files:pk-data-sum-dose-study.docx|Type:table&gt;&gt;. The lower plots are scatter plots with points coloured by study and a study-independent LOESS smoother. The upper plots show the Pearson’s correlation coefficient and number of underlying observations.</w:t>
       </w:r>
       <w:r>
         <w:rPr>
@@ -20979,12 +20811,6 @@
         <w:rPr>
           <w:vanish/>
         </w:rPr>
-        <w:t/>
-      </w:r>
-      <w:r>
-        <w:rPr>
-          <w:vanish/>
-        </w:rPr>
         <w:t>[[INLINE_ID:inl_fast_slow]]</w:t>
       </w:r>
     </w:p>
@@ -21218,12 +21044,6 @@
         <w:t xml:space="preserve"> (log scale)</w:t>
       </w:r>
       <w:bookmarkEnd w:id="112"/>
-      <w:r>
-        <w:rPr>
-          <w:vanish/>
-        </w:rPr>
-        <w:t/>
-      </w:r>
       <w:r>
         <w:rPr>
           <w:vanish/>
@@ -25164,22 +24984,13 @@
         </w:rPr>
       </w:pPr>
       <w:r>
-        <w:rPr/>
-        <w:t xml:space="preserve">&lt;&lt;Name:gof cwres |Title:GOF CWRES </w:t>
-      </w:r>
-      <w:r>
-        <w:rPr/>
-        <w:t xml:space="preserve"> O sfdjkhjdfs </w:t>
-      </w:r>
-      <w:r>
-        <w:rPr/>
-        <w:t>plot|Footnote:H sfj sf nlasd ,sdf sfkl lsdfkldfslk l|Files:dn-conc-time-linear.png|Type:image&gt;&gt;</w:t>
-      </w:r>
-      <w:r>
-        <w:rPr>
-          <w:vanish/>
-        </w:rPr>
-        <w:t/>
+        <w:t>&lt;&lt;Name:gof cwres |Title:GOF CWRES plot|Footnote:</w:t>
+      </w:r>
+      <w:r>
+        <w:t xml:space="preserve">Not having </w:t>
+      </w:r>
+      <w:r>
+        <w:t>l weighted residuals versus time.|Files:dn-conc-time-linear.png|Type:image&gt;&gt;</w:t>
       </w:r>
       <w:r>
         <w:rPr>
@@ -25196,11 +25007,6 @@
     </w:sectPr>
   </w:body>
 </w:document>
-</file>
-
-<file path=word/comments.xml><?xml version="1.0" encoding="utf-8"?>
-<w:comments xmlns:wpc="http://schemas.microsoft.com/office/word/2010/wordprocessingCanvas" xmlns:mo="http://schemas.microsoft.com/office/mac/office/2008/main" xmlns:mc="http://schemas.openxmlformats.org/markup-compatibility/2006" xmlns:mv="urn:schemas-microsoft-com:mac:vml" xmlns:o="urn:schemas-microsoft-com:office:office" xmlns:r="http://schemas.openxmlformats.org/officeDocument/2006/relationships" xmlns:m="http://schemas.openxmlformats.org/officeDocument/2006/math" xmlns:v="urn:schemas-microsoft-com:vml" xmlns:wp14="http://schemas.microsoft.com/office/word/2010/wordprocessingDrawing" xmlns:wp="http://schemas.openxmlformats.org/drawingml/2006/wordprocessingDrawing" xmlns:w10="urn:schemas-microsoft-com:office:word" xmlns:w="http://schemas.openxmlformats.org/wordprocessingml/2006/main" xmlns:w14="http://schemas.microsoft.com/office/word/2010/wordml" xmlns:wpg="http://schemas.microsoft.com/office/word/2010/wordprocessingGroup" xmlns:wpi="http://schemas.microsoft.com/office/word/2010/wordprocessingInk" xmlns:wne="http://schemas.microsoft.com/office/word/2006/wordml" xmlns:wps="http://schemas.microsoft.com/office/word/2010/wordprocessingShape" mc:Ignorable="w14 wp14">
-</w:comments>
 </file>
 
 <file path=word/customizations.xml><?xml version="1.0" encoding="utf-8"?>
@@ -54782,6 +54588,19 @@
 </file>
 
 <file path=customXml/item1.xml><?xml version="1.0" encoding="utf-8"?>
+<b:Sources xmlns:b="http://schemas.openxmlformats.org/officeDocument/2006/bibliography" xmlns="http://schemas.openxmlformats.org/officeDocument/2006/bibliography" SelectedStyle="\APASixthEditionOfficeOnline.xsl" StyleName="APA" Version="6"/>
+</file>
+
+<file path=customXml/item2.xml><?xml version="1.0" encoding="utf-8"?>
+<?mso-contentType ?>
+<FormTemplates xmlns="http://schemas.microsoft.com/sharepoint/v3/contenttype/forms">
+  <Display>DocumentLibraryForm</Display>
+  <Edit>DocumentLibraryForm</Edit>
+  <New>DocumentLibraryForm</New>
+</FormTemplates>
+</file>
+
+<file path=customXml/item3.xml><?xml version="1.0" encoding="utf-8"?>
 <ct:contentTypeSchema xmlns:ct="http://schemas.microsoft.com/office/2006/metadata/contentType" xmlns:ma="http://schemas.microsoft.com/office/2006/metadata/properties/metaAttributes" ct:_="" ma:_="" ma:contentTypeName="Document" ma:contentTypeID="0x010100A7762C85E483334AB8222100ECB11BCE" ma:contentTypeVersion="13" ma:contentTypeDescription="Create a new document." ma:contentTypeScope="" ma:versionID="75b332414a0816cfcde876ee00c40d9c">
   <xsd:schema xmlns:xsd="http://www.w3.org/2001/XMLSchema" xmlns:xs="http://www.w3.org/2001/XMLSchema" xmlns:p="http://schemas.microsoft.com/office/2006/metadata/properties" xmlns:ns2="44a56295-c29e-4898-8136-a54736c65b82" xmlns:ns3="8aa277c1-d1ea-4c39-998d-13590e101e7f" xmlns:ns4="a3bda4ac-f0aa-484b-b750-bde5783238e8" targetNamespace="http://schemas.microsoft.com/office/2006/metadata/properties" ma:root="true" ma:fieldsID="94fde33dd5881b75a2eab763bf6462c7" ns2:_="" ns3:_="" ns4:_="">
     <xsd:import namespace="44a56295-c29e-4898-8136-a54736c65b82"/>
@@ -54997,12 +54816,12 @@
 </ct:contentTypeSchema>
 </file>
 
-<file path=customXml/item2.xml><?xml version="1.0" encoding="utf-8"?>
+<file path=customXml/item4.xml><?xml version="1.0" encoding="utf-8"?>
 <?mso-contentType ?>
 <SharedContentType xmlns="Microsoft.SharePoint.Taxonomy.ContentTypeSync" SourceId="1ee89e71-04cd-405e-9ca3-99e020c1694d" ContentTypeId="0x0101" PreviousValue="false"/>
 </file>
 
-<file path=customXml/item3.xml><?xml version="1.0" encoding="utf-8"?>
+<file path=customXml/item5.xml><?xml version="1.0" encoding="utf-8"?>
 <p:properties xmlns:p="http://schemas.microsoft.com/office/2006/metadata/properties" xmlns:xsi="http://www.w3.org/2001/XMLSchema-instance" xmlns:pc="http://schemas.microsoft.com/office/infopath/2007/PartnerControls">
   <documentManagement>
     <Keyword xmlns="44a56295-c29e-4898-8136-a54736c65b82" xsi:nil="true"/>
@@ -55015,20 +54834,23 @@
 </p:properties>
 </file>
 
-<file path=customXml/item4.xml><?xml version="1.0" encoding="utf-8"?>
-<b:Sources xmlns:b="http://schemas.openxmlformats.org/officeDocument/2006/bibliography" xmlns="http://schemas.openxmlformats.org/officeDocument/2006/bibliography" SelectedStyle="\APASixthEditionOfficeOnline.xsl" StyleName="APA" Version="6"/>
+<file path=customXml/itemProps1.xml><?xml version="1.0" encoding="utf-8"?>
+<ds:datastoreItem xmlns:ds="http://schemas.openxmlformats.org/officeDocument/2006/customXml" ds:itemID="{0CB43EF1-53E0-4B1B-AB67-503CDEF86374}">
+  <ds:schemaRefs>
+    <ds:schemaRef ds:uri="http://schemas.openxmlformats.org/officeDocument/2006/bibliography"/>
+  </ds:schemaRefs>
+</ds:datastoreItem>
 </file>
 
-<file path=customXml/item5.xml><?xml version="1.0" encoding="utf-8"?>
-<?mso-contentType ?>
-<FormTemplates xmlns="http://schemas.microsoft.com/sharepoint/v3/contenttype/forms">
-  <Display>DocumentLibraryForm</Display>
-  <Edit>DocumentLibraryForm</Edit>
-  <New>DocumentLibraryForm</New>
-</FormTemplates>
+<file path=customXml/itemProps2.xml><?xml version="1.0" encoding="utf-8"?>
+<ds:datastoreItem xmlns:ds="http://schemas.openxmlformats.org/officeDocument/2006/customXml" ds:itemID="{6ADEFE45-D4E9-47EC-8556-818C9058A4BE}">
+  <ds:schemaRefs>
+    <ds:schemaRef ds:uri="http://schemas.microsoft.com/sharepoint/v3/contenttype/forms"/>
+  </ds:schemaRefs>
+</ds:datastoreItem>
 </file>
 
-<file path=customXml/itemProps1.xml><?xml version="1.0" encoding="utf-8"?>
+<file path=customXml/itemProps3.xml><?xml version="1.0" encoding="utf-8"?>
 <ds:datastoreItem xmlns:ds="http://schemas.openxmlformats.org/officeDocument/2006/customXml" ds:itemID="{6859E1BC-91BD-4D67-B1E7-6630A4CB2439}">
   <ds:schemaRefs>
     <ds:schemaRef ds:uri="http://schemas.microsoft.com/office/2006/metadata/contentType"/>
@@ -55048,7 +54870,7 @@
 </ds:datastoreItem>
 </file>
 
-<file path=customXml/itemProps2.xml><?xml version="1.0" encoding="utf-8"?>
+<file path=customXml/itemProps4.xml><?xml version="1.0" encoding="utf-8"?>
 <ds:datastoreItem xmlns:ds="http://schemas.openxmlformats.org/officeDocument/2006/customXml" ds:itemID="{8EF5C56D-9B05-4CE4-B93C-919EF597165D}">
   <ds:schemaRefs>
     <ds:schemaRef ds:uri="Microsoft.SharePoint.Taxonomy.ContentTypeSync"/>
@@ -55056,7 +54878,7 @@
 </ds:datastoreItem>
 </file>
 
-<file path=customXml/itemProps3.xml><?xml version="1.0" encoding="utf-8"?>
+<file path=customXml/itemProps5.xml><?xml version="1.0" encoding="utf-8"?>
 <ds:datastoreItem xmlns:ds="http://schemas.openxmlformats.org/officeDocument/2006/customXml" ds:itemID="{A468AB16-E26C-4EEC-963F-FFAE87E41854}">
   <ds:schemaRefs>
     <ds:schemaRef ds:uri="http://schemas.microsoft.com/office/2006/metadata/properties"/>
@@ -55066,20 +54888,4 @@
     <ds:schemaRef ds:uri="a3bda4ac-f0aa-484b-b750-bde5783238e8"/>
   </ds:schemaRefs>
 </ds:datastoreItem>
-</file>
-
-<file path=customXml/itemProps4.xml><?xml version="1.0" encoding="utf-8"?>
-<ds:datastoreItem xmlns:ds="http://schemas.openxmlformats.org/officeDocument/2006/customXml" ds:itemID="{0CB43EF1-53E0-4B1B-AB67-503CDEF86374}">
-  <ds:schemaRefs>
-    <ds:schemaRef ds:uri="http://schemas.openxmlformats.org/officeDocument/2006/bibliography"/>
-  </ds:schemaRefs>
-</ds:datastoreItem>
-</file>
-
-<file path=customXml/itemProps5.xml><?xml version="1.0" encoding="utf-8"?>
-<ds:datastoreItem xmlns:ds="http://schemas.openxmlformats.org/officeDocument/2006/customXml" ds:itemID="{6ADEFE45-D4E9-47EC-8556-818C9058A4BE}">
-  <ds:schemaRefs>
-    <ds:schemaRef ds:uri="http://schemas.microsoft.com/sharepoint/v3/contenttype/forms"/>
-  </ds:schemaRefs>
-</ds:datastoreItem>
 </file>
</xml_diff>